<commit_message>
feat: rebuild C1382 as finance automation masterclass
</commit_message>
<xml_diff>
--- a/courseware/LG-Claude Cowork Masterclass.docx
+++ b/courseware/LG-Claude Cowork Masterclass.docx
@@ -12,7 +12,7 @@
     </w:p>
     <w:p>
       <w:r>
-        <w:t>v2.0 · 15 September 2026 · One day · 7.5 instructional hours</w:t>
+        <w:t>v2.1 · 16 September 2026 · One day · 7.5 instructional hours</w:t>
       </w:r>
     </w:p>
     <w:p>
@@ -30,14 +30,15 @@
         <w:tblLook w:firstColumn="1" w:firstRow="1" w:lastColumn="0" w:lastRow="0" w:noHBand="0" w:noVBand="1" w:val="04A0"/>
       </w:tblPr>
       <w:tblGrid>
-        <w:gridCol w:w="2880"/>
-        <w:gridCol w:w="2880"/>
-        <w:gridCol w:w="2880"/>
+        <w:gridCol w:w="2160"/>
+        <w:gridCol w:w="2160"/>
+        <w:gridCol w:w="2160"/>
+        <w:gridCol w:w="2160"/>
       </w:tblGrid>
       <w:tr>
         <w:tc>
           <w:tcPr>
-            <w:tcW w:type="dxa" w:w="2880"/>
+            <w:tcW w:type="dxa" w:w="2160"/>
           </w:tcPr>
           <w:p>
             <w:r>
@@ -47,7 +48,7 @@
         </w:tc>
         <w:tc>
           <w:tcPr>
-            <w:tcW w:type="dxa" w:w="2880"/>
+            <w:tcW w:type="dxa" w:w="2160"/>
           </w:tcPr>
           <w:p>
             <w:r>
@@ -57,7 +58,7 @@
         </w:tc>
         <w:tc>
           <w:tcPr>
-            <w:tcW w:type="dxa" w:w="2880"/>
+            <w:tcW w:type="dxa" w:w="2160"/>
           </w:tcPr>
           <w:p>
             <w:r>
@@ -65,35 +66,55 @@
             </w:r>
           </w:p>
         </w:tc>
+        <w:tc>
+          <w:tcPr>
+            <w:tcW w:type="dxa" w:w="2160"/>
+          </w:tcPr>
+          <w:p>
+            <w:r>
+              <w:t>Author</w:t>
+            </w:r>
+          </w:p>
+        </w:tc>
       </w:tr>
       <w:tr>
         <w:tc>
           <w:tcPr>
-            <w:tcW w:type="dxa" w:w="2880"/>
+            <w:tcW w:type="dxa" w:w="2160"/>
           </w:tcPr>
           <w:p>
             <w:r>
-              <w:t>v2.0</w:t>
+              <w:t>2.1</w:t>
             </w:r>
           </w:p>
         </w:tc>
         <w:tc>
           <w:tcPr>
-            <w:tcW w:type="dxa" w:w="2880"/>
+            <w:tcW w:type="dxa" w:w="2160"/>
           </w:tcPr>
           <w:p>
             <w:r>
-              <w:t>15 September 2026</w:t>
+              <w:t>16 September 2026</w:t>
             </w:r>
           </w:p>
         </w:tc>
         <w:tc>
           <w:tcPr>
-            <w:tcW w:type="dxa" w:w="2880"/>
+            <w:tcW w:type="dxa" w:w="2160"/>
           </w:tcPr>
           <w:p>
             <w:r>
-              <w:t>Finance project, Excel and Outlook release</w:t>
+              <w:t>Eight practical task-automation scenarios, simplified explanations and visual courseware</w:t>
+            </w:r>
+          </w:p>
+        </w:tc>
+        <w:tc>
+          <w:tcPr>
+            <w:tcW w:type="dxa" w:w="2160"/>
+          </w:tcPr>
+          <w:p>
+            <w:r>
+              <w:t>Tertiary Infotech Academy</w:t>
             </w:r>
           </w:p>
         </w:tc>
@@ -104,17 +125,12 @@
         <w:pStyle w:val="Heading1"/>
       </w:pPr>
       <w:r>
-        <w:t>Purpose and setup</w:t>
-      </w:r>
-    </w:p>
-    <w:p>
-      <w:r>
-        <w:t>You will work with fictional Singapore-dollar transactions to build a finance Cowork project, a reconciled Excel workbook and a scheduled Outlook attachment path. Use only the provided mock data. Claude Cowork, Excel or an Excel-compatible viewer, and an active paid Claude account are needed. Lab 3 additionally requires an authorised work Microsoft 365 account, connector write permission and Power Automate.</w:t>
-      </w:r>
-    </w:p>
-    <w:p>
-      <w:r>
-        <w:t>Current product constraint: the native Microsoft 365 connector can send Outlook mail but cannot attach a file. The attachment path in Lab 3 uses OneDrive for Business and Power Automate. Cloud schedules use connected files; a scheduled task that requires local files or apps runs locally.</w:t>
+        <w:t>How to use this guide</w:t>
+      </w:r>
+    </w:p>
+    <w:p>
+      <w:r>
+        <w:t>Work through the labs in order or choose a scenario that matches your job. Each lab folder is independent: it has mock data, a Cowork skill, a tools guide, ready-to-paste prompts, detailed instructions, expected evidence and a checklist. Keep mock-data unchanged and save finished work in outputs/.</w:t>
       </w:r>
     </w:p>
     <w:p>
@@ -122,7 +138,81 @@
         <w:pStyle w:val="Heading1"/>
       </w:pPr>
       <w:r>
-        <w:t>Detailed setup and working sequence</w:t>
+        <w:t>Set up Claude Cowork</w:t>
+      </w:r>
+    </w:p>
+    <w:p>
+      <w:pPr>
+        <w:pStyle w:val="ListNumber"/>
+      </w:pPr>
+      <w:r>
+        <w:t>Open Claude and choose Cowork. A paid plan is required.</w:t>
+      </w:r>
+    </w:p>
+    <w:p>
+      <w:pPr>
+        <w:pStyle w:val="ListNumber"/>
+      </w:pPr>
+      <w:r>
+        <w:t>For local files, use Claude Desktop and keep it open while the task uses your computer.</w:t>
+      </w:r>
+    </w:p>
+    <w:p>
+      <w:pPr>
+        <w:pStyle w:val="ListNumber"/>
+      </w:pPr>
+      <w:r>
+        <w:t>Create a project or session from only the lab folder you are using.</w:t>
+      </w:r>
+    </w:p>
+    <w:p>
+      <w:pPr>
+        <w:pStyle w:val="ListNumber"/>
+      </w:pPr>
+      <w:r>
+        <w:t>Open TOOLS.md and enable only the tools needed for the task.</w:t>
+      </w:r>
+    </w:p>
+    <w:p>
+      <w:pPr>
+        <w:pStyle w:val="ListNumber"/>
+      </w:pPr>
+      <w:r>
+        <w:t>Add the lab SKILL.md as project instructions or an enabled custom skill.</w:t>
+      </w:r>
+    </w:p>
+    <w:p>
+      <w:pPr>
+        <w:pStyle w:val="ListNumber"/>
+      </w:pPr>
+      <w:r>
+        <w:t>Review the proposed plan before allowing file changes or connected-app actions.</w:t>
+      </w:r>
+    </w:p>
+    <w:p>
+      <w:pPr>
+        <w:pStyle w:val="Heading1"/>
+      </w:pPr>
+      <w:r>
+        <w:t>The simple task pattern</w:t>
+      </w:r>
+    </w:p>
+    <w:p>
+      <w:r>
+        <w:t>Every automation follows five questions: What outcome is needed? Which inputs may Cowork use? What file should it create? How will you verify it? Which actions require human approval?</w:t>
+      </w:r>
+    </w:p>
+    <w:p>
+      <w:pPr>
+        <w:pStyle w:val="Heading1"/>
+      </w:pPr>
+      <w:r>
+        <w:t>Use Case 01 — Create a Cowork Project</w:t>
+      </w:r>
+    </w:p>
+    <w:p>
+      <w:r>
+        <w:t>Scenario: Files and instructions live in different places. Ask Cowork to give cowork one project, one folder and clear rules. The result is a reusable workspace for every finance task.</w:t>
       </w:r>
     </w:p>
     <w:p>
@@ -130,7 +220,39 @@
         <w:pStyle w:val="Heading2"/>
       </w:pPr>
       <w:r>
-        <w:t>Create the finance project</w:t>
+        <w:t>What goes in</w:t>
+      </w:r>
+    </w:p>
+    <w:p>
+      <w:pPr>
+        <w:pStyle w:val="ListBullet"/>
+      </w:pPr>
+      <w:r>
+        <w:t>Project brief</w:t>
+      </w:r>
+    </w:p>
+    <w:p>
+      <w:pPr>
+        <w:pStyle w:val="ListBullet"/>
+      </w:pPr>
+      <w:r>
+        <w:t>Close checklist</w:t>
+      </w:r>
+    </w:p>
+    <w:p>
+      <w:pPr>
+        <w:pStyle w:val="ListBullet"/>
+      </w:pPr>
+      <w:r>
+        <w:t>Dedicated lab folder</w:t>
+      </w:r>
+    </w:p>
+    <w:p>
+      <w:pPr>
+        <w:pStyle w:val="Heading2"/>
+      </w:pPr>
+      <w:r>
+        <w:t>What Cowork does</w:t>
       </w:r>
     </w:p>
     <w:p>
@@ -138,7 +260,7 @@
         <w:pStyle w:val="ListNumber"/>
       </w:pPr>
       <w:r>
-        <w:t>Open Claude Desktop, select Cowork, and create Finance Month-End Lab under Projects. Choose only the lab folder as context; do not select a parent finance drive.</w:t>
+        <w:t>Create project</w:t>
       </w:r>
     </w:p>
     <w:p>
@@ -146,7 +268,7 @@
         <w:pStyle w:val="ListNumber"/>
       </w:pPr>
       <w:r>
-        <w:t>Open the project instructions and paste the finance-control skill rules. Record the folder name, source filename, output path and review owner in the first task.</w:t>
+        <w:t>Connect one folder</w:t>
       </w:r>
     </w:p>
     <w:p>
@@ -154,7 +276,7 @@
         <w:pStyle w:val="ListNumber"/>
       </w:pPr>
       <w:r>
-        <w:t>Ask for a read-only inventory. Confirm 14 rows, seven columns, duplicate BILL-012 and Pending INV-013 before any workbook transformation.</w:t>
+        <w:t>Add finance skill</w:t>
       </w:r>
     </w:p>
     <w:p>
@@ -162,7 +284,104 @@
         <w:pStyle w:val="Heading2"/>
       </w:pPr>
       <w:r>
-        <w:t>Build and inspect the Excel workbook</w:t>
+        <w:t>Skills and tools</w:t>
+      </w:r>
+    </w:p>
+    <w:p>
+      <w:pPr>
+        <w:pStyle w:val="ListBullet"/>
+      </w:pPr>
+      <w:r>
+        <w:t>Cowork Projects</w:t>
+      </w:r>
+    </w:p>
+    <w:p>
+      <w:pPr>
+        <w:pStyle w:val="ListBullet"/>
+      </w:pPr>
+      <w:r>
+        <w:t>Local folder access</w:t>
+      </w:r>
+    </w:p>
+    <w:p>
+      <w:pPr>
+        <w:pStyle w:val="ListBullet"/>
+      </w:pPr>
+      <w:r>
+        <w:t>Project instructions</w:t>
+      </w:r>
+    </w:p>
+    <w:p>
+      <w:pPr>
+        <w:pStyle w:val="Heading2"/>
+      </w:pPr>
+      <w:r>
+        <w:t>Human check</w:t>
+      </w:r>
+    </w:p>
+    <w:p>
+      <w:r>
+        <w:t>File map lists every source; originals stay unchanged</w:t>
+      </w:r>
+    </w:p>
+    <w:p>
+      <w:pPr>
+        <w:pStyle w:val="Heading2"/>
+      </w:pPr>
+      <w:r>
+        <w:t>Lab 01 — step-by-step</w:t>
+      </w:r>
+    </w:p>
+    <w:p>
+      <w:r>
+        <w:t>C1382 · Topic 1 · 35 minutes</w:t>
+      </w:r>
+    </w:p>
+    <w:p>
+      <w:pPr>
+        <w:pStyle w:val="Heading3"/>
+      </w:pPr>
+      <w:r>
+        <w:t>Goal</w:t>
+      </w:r>
+    </w:p>
+    <w:p>
+      <w:r>
+        <w:t>Create a simple Cowork project with a dedicated finance folder, clear instructions and safe output locations.</w:t>
+      </w:r>
+    </w:p>
+    <w:p>
+      <w:pPr>
+        <w:pStyle w:val="Heading3"/>
+      </w:pPr>
+      <w:r>
+        <w:t>What you will build</w:t>
+      </w:r>
+    </w:p>
+    <w:p>
+      <w:r>
+        <w:t>A reusable Finance Task Automation project with folder instructions and a first file inventory.</w:t>
+      </w:r>
+    </w:p>
+    <w:p>
+      <w:pPr>
+        <w:pStyle w:val="Heading3"/>
+      </w:pPr>
+      <w:r>
+        <w:t>Prerequisites</w:t>
+      </w:r>
+    </w:p>
+    <w:p>
+      <w:r>
+        <w:t>Open this lab folder as the Cowork project context. Read TOOLS.md, enable the named skill in skill/finance-project-organiser/SKILL.md, and use only the fictional files in mock-data/.</w:t>
+      </w:r>
+    </w:p>
+    <w:p>
+      <w:pPr>
+        <w:pStyle w:val="Heading3"/>
+      </w:pPr>
+      <w:r>
+        <w:t>Steps</w:t>
       </w:r>
     </w:p>
     <w:p>
@@ -170,7 +389,7 @@
         <w:pStyle w:val="ListNumber"/>
       </w:pPr>
       <w:r>
-        <w:t>Make a working copy of finance-aug-2026.xlsx. Require four sheets named Raw, Eligible, Summary and Exceptions. Raw keeps the original 14 records unchanged.</w:t>
+        <w:t>Open `TOOLS.md` and confirm the available tools and access boundary.</w:t>
       </w:r>
     </w:p>
     <w:p>
@@ -178,7 +397,7 @@
         <w:pStyle w:val="ListNumber"/>
       </w:pPr>
       <w:r>
-        <w:t>Eligible includes only Approved records and the first occurrence of each Document ID within the period. Exceptions contains the later BILL-012 and Pending INV-013 with source row numbers and reasons.</w:t>
+        <w:t>Review the files in `mock-data/`; copy any file you will change into `working/`.</w:t>
       </w:r>
     </w:p>
     <w:p>
@@ -186,7 +405,7 @@
         <w:pStyle w:val="ListNumber"/>
       </w:pPr>
       <w:r>
-        <w:t>In Summary, use Excel formulas that point to Eligible. Revenue is the sum of positive eligible amounts, expenses are the absolute value of negative eligible amounts, and net equals revenue minus expenses.</w:t>
+        <w:t>Add or enable `skill/finance-project-organiser/SKILL.md` in the Cowork project.</w:t>
       </w:r>
     </w:p>
     <w:p>
@@ -194,7 +413,115 @@
         <w:pStyle w:val="ListNumber"/>
       </w:pPr>
       <w:r>
-        <w:t>Open the finished file in Excel, force recalculation, and inspect both formulas and displayed values. Compare S$46,700 revenue, S$16,500 expenses and S$30,200 net with the independent control file. Stop on any mismatch.</w:t>
+        <w:t>Open `prompts/prompt-01.txt`, paste the prompt into Cowork and review its proposed plan.</w:t>
+      </w:r>
+    </w:p>
+    <w:p>
+      <w:pPr>
+        <w:pStyle w:val="ListNumber"/>
+      </w:pPr>
+      <w:r>
+        <w:t>Allow only the reads and writes needed for this lab. Keep consequential actions paused.</w:t>
+      </w:r>
+    </w:p>
+    <w:p>
+      <w:pPr>
+        <w:pStyle w:val="ListNumber"/>
+      </w:pPr>
+      <w:r>
+        <w:t>Open the generated files and compare them with `CHECKLIST.md`. Correct any mismatch in the output, then repeat the check.</w:t>
+      </w:r>
+    </w:p>
+    <w:p>
+      <w:pPr>
+        <w:pStyle w:val="ListNumber"/>
+      </w:pPr>
+      <w:r>
+        <w:t>Save the finished artifacts in `outputs/` and record the evidence used.</w:t>
+      </w:r>
+    </w:p>
+    <w:p>
+      <w:pPr>
+        <w:pStyle w:val="Heading3"/>
+      </w:pPr>
+      <w:r>
+        <w:t>Test it</w:t>
+      </w:r>
+    </w:p>
+    <w:p>
+      <w:r>
+        <w:t>The project shows the correct folder, the file map lists every mock-data file, and no source file changed.</w:t>
+      </w:r>
+    </w:p>
+    <w:p>
+      <w:pPr>
+        <w:pStyle w:val="Heading3"/>
+      </w:pPr>
+      <w:r>
+        <w:t>Troubleshooting</w:t>
+      </w:r>
+    </w:p>
+    <w:p>
+      <w:pPr>
+        <w:pStyle w:val="ListBullet"/>
+      </w:pPr>
+      <w:r>
+        <w:t>**Cowork selects the wrong file:** name the expected date format and require it to list candidates before choosing.</w:t>
+      </w:r>
+    </w:p>
+    <w:p>
+      <w:pPr>
+        <w:pStyle w:val="ListBullet"/>
+      </w:pPr>
+      <w:r>
+        <w:t>**A workbook does not refresh:** open it in Excel, recalculate, and ask Cowork to inspect formulas and chart source ranges.</w:t>
+      </w:r>
+    </w:p>
+    <w:p>
+      <w:pPr>
+        <w:pStyle w:val="ListBullet"/>
+      </w:pPr>
+      <w:r>
+        <w:t>**A claim has no source:** remove it or add a direct file, cell or URL reference.</w:t>
+      </w:r>
+    </w:p>
+    <w:p>
+      <w:pPr>
+        <w:pStyle w:val="Heading3"/>
+      </w:pPr>
+      <w:r>
+        <w:t>Challenge</w:t>
+      </w:r>
+    </w:p>
+    <w:p>
+      <w:r>
+        <w:t>Change the reporting period or audience and rerun the task without changing the skill's stable rules.</w:t>
+      </w:r>
+    </w:p>
+    <w:p>
+      <w:pPr>
+        <w:pStyle w:val="Heading3"/>
+      </w:pPr>
+      <w:r>
+        <w:t>Reflection</w:t>
+      </w:r>
+    </w:p>
+    <w:p>
+      <w:r>
+        <w:t>Which part of this task should always remain a human review point?</w:t>
+      </w:r>
+    </w:p>
+    <w:p>
+      <w:pPr>
+        <w:pStyle w:val="Heading1"/>
+      </w:pPr>
+      <w:r>
+        <w:t>Use Case 02 — Refresh an Excel Dashboard</w:t>
+      </w:r>
+    </w:p>
+    <w:p>
+      <w:r>
+        <w:t>Scenario: The dashboard shows last month’s figures. Ask Cowork to find the newest dated file and refresh the workbook. The result is current kpis and charts in one excel file.</w:t>
       </w:r>
     </w:p>
     <w:p>
@@ -202,7 +529,39 @@
         <w:pStyle w:val="Heading2"/>
       </w:pPr>
       <w:r>
-        <w:t>Schedule and deliver through Outlook</w:t>
+        <w:t>What goes in</w:t>
+      </w:r>
+    </w:p>
+    <w:p>
+      <w:pPr>
+        <w:pStyle w:val="ListBullet"/>
+      </w:pPr>
+      <w:r>
+        <w:t>Three dated CSV files</w:t>
+      </w:r>
+    </w:p>
+    <w:p>
+      <w:pPr>
+        <w:pStyle w:val="ListBullet"/>
+      </w:pPr>
+      <w:r>
+        <w:t>Dashboard template</w:t>
+      </w:r>
+    </w:p>
+    <w:p>
+      <w:pPr>
+        <w:pStyle w:val="ListBullet"/>
+      </w:pPr>
+      <w:r>
+        <w:t>Expected KPI check</w:t>
+      </w:r>
+    </w:p>
+    <w:p>
+      <w:pPr>
+        <w:pStyle w:val="Heading2"/>
+      </w:pPr>
+      <w:r>
+        <w:t>What Cowork does</w:t>
       </w:r>
     </w:p>
     <w:p>
@@ -210,7 +569,7 @@
         <w:pStyle w:val="ListNumber"/>
       </w:pPr>
       <w:r>
-        <w:t>Run the September prompt on demand before creating a cadence. Verify S$48,100 revenue, S$16,960 expenses, S$31,140 net, 12 eligible rows and two exceptions.</w:t>
+        <w:t>Find latest file</w:t>
       </w:r>
     </w:p>
     <w:p>
@@ -218,7 +577,7 @@
         <w:pStyle w:val="ListNumber"/>
       </w:pPr>
       <w:r>
-        <w:t>For a cloud Cowork schedule, move the source into authorised OneDrive for Business or SharePoint context. Use Scheduled &gt; New task; set the weekly Monday 09:00 Asia/Singapore cadence, gated on a new approved month input only after the on-demand rehearsal. A local-folder task runs locally and needs the desktop available.</w:t>
+        <w:t>Update Data sheet</w:t>
       </w:r>
     </w:p>
     <w:p>
@@ -226,7 +585,112 @@
         <w:pStyle w:val="ListNumber"/>
       </w:pPr>
       <w:r>
-        <w:t>Connect Microsoft 365 through Customize &gt; Connectors using a work account. The tenant administrator must have granted consent and enabled email write tools. The native connector may send a reviewed link, but cannot attach the Excel file.</w:t>
+        <w:t>Refresh charts</w:t>
+      </w:r>
+    </w:p>
+    <w:p>
+      <w:pPr>
+        <w:pStyle w:val="Heading2"/>
+      </w:pPr>
+      <w:r>
+        <w:t>Skills and tools</w:t>
+      </w:r>
+    </w:p>
+    <w:p>
+      <w:pPr>
+        <w:pStyle w:val="ListBullet"/>
+      </w:pPr>
+      <w:r>
+        <w:t>Cowork files</w:t>
+      </w:r>
+    </w:p>
+    <w:p>
+      <w:pPr>
+        <w:pStyle w:val="ListBullet"/>
+      </w:pPr>
+      <w:r>
+        <w:t>Spreadsheet skill</w:t>
+      </w:r>
+    </w:p>
+    <w:p>
+      <w:pPr>
+        <w:pStyle w:val="ListBullet"/>
+      </w:pPr>
+      <w:r>
+        <w:t>Microsoft Excel</w:t>
+      </w:r>
+    </w:p>
+    <w:p>
+      <w:pPr>
+        <w:pStyle w:val="Heading2"/>
+      </w:pPr>
+      <w:r>
+        <w:t>Human check</w:t>
+      </w:r>
+    </w:p>
+    <w:p>
+      <w:r>
+        <w:t>September: revenue S$128k, expenses S$89.5k, net S$38.5k</w:t>
+      </w:r>
+    </w:p>
+    <w:p>
+      <w:pPr>
+        <w:pStyle w:val="Heading2"/>
+      </w:pPr>
+      <w:r>
+        <w:t>Lab 02 — step-by-step</w:t>
+      </w:r>
+    </w:p>
+    <w:p>
+      <w:r>
+        <w:t>C1382 · Topic 1 · 55 minutes</w:t>
+      </w:r>
+    </w:p>
+    <w:p>
+      <w:pPr>
+        <w:pStyle w:val="Heading3"/>
+      </w:pPr>
+      <w:r>
+        <w:t>Goal</w:t>
+      </w:r>
+    </w:p>
+    <w:p>
+      <w:r>
+        <w:t>Find the newest dated finance file, update an Excel dashboard and refresh its charts.</w:t>
+      </w:r>
+    </w:p>
+    <w:p>
+      <w:pPr>
+        <w:pStyle w:val="Heading3"/>
+      </w:pPr>
+      <w:r>
+        <w:t>What you will build</w:t>
+      </w:r>
+    </w:p>
+    <w:p>
+      <w:r>
+        <w:t>An updated monthly-finance-dashboard.xlsx with current KPIs and two charts.</w:t>
+      </w:r>
+    </w:p>
+    <w:p>
+      <w:pPr>
+        <w:pStyle w:val="Heading3"/>
+      </w:pPr>
+      <w:r>
+        <w:t>Prerequisites</w:t>
+      </w:r>
+    </w:p>
+    <w:p>
+      <w:r>
+        <w:t>Open this lab folder as the Cowork project context. Read TOOLS.md, enable the named skill in skill/latest-finance-dashboard/SKILL.md, and use only the fictional files in mock-data/.</w:t>
+      </w:r>
+    </w:p>
+    <w:p>
+      <w:pPr>
+        <w:pStyle w:val="Heading3"/>
+      </w:pPr>
+      <w:r>
+        <w:t>Steps</w:t>
       </w:r>
     </w:p>
     <w:p>
@@ -234,7 +698,7 @@
         <w:pStyle w:val="ListNumber"/>
       </w:pPr>
       <w:r>
-        <w:t>For an attachment, configure Power Automate: OneDrive for Business When a file is created on Approved Reports, restrict the trigger to finance-report-*.xlsx, Get file content, then Office 365 Outlook Send an email (V2) with the file name and content in its attachment fields.</w:t>
+        <w:t>Open `TOOLS.md` and confirm the available tools and access boundary.</w:t>
       </w:r>
     </w:p>
     <w:p>
@@ -242,7 +706,118 @@
         <w:pStyle w:val="ListNumber"/>
       </w:pPr>
       <w:r>
-        <w:t>Only move a human-reviewed final workbook to Approved Reports. Verify the flow run, Sent Items, received attachment name, openable workbook and totals. Keep the task manual until the organisation approves the cadence and recipient.</w:t>
+        <w:t>Review the files in `mock-data/`; copy any file you will change into `working/`.</w:t>
+      </w:r>
+    </w:p>
+    <w:p>
+      <w:pPr>
+        <w:pStyle w:val="ListNumber"/>
+      </w:pPr>
+      <w:r>
+        <w:t>Add or enable `skill/latest-finance-dashboard/SKILL.md` in the Cowork project.</w:t>
+      </w:r>
+    </w:p>
+    <w:p>
+      <w:pPr>
+        <w:pStyle w:val="ListNumber"/>
+      </w:pPr>
+      <w:r>
+        <w:t>Open `prompts/prompt-02.txt`, paste the prompt into Cowork and review its proposed plan.</w:t>
+      </w:r>
+    </w:p>
+    <w:p>
+      <w:pPr>
+        <w:pStyle w:val="ListNumber"/>
+      </w:pPr>
+      <w:r>
+        <w:t>Allow only the reads and writes needed for this lab. Keep consequential actions paused.</w:t>
+      </w:r>
+    </w:p>
+    <w:p>
+      <w:pPr>
+        <w:pStyle w:val="ListNumber"/>
+      </w:pPr>
+      <w:r>
+        <w:t>Open the generated files and compare them with `CHECKLIST.md`. Correct any mismatch in the output, then repeat the check.</w:t>
+      </w:r>
+    </w:p>
+    <w:p>
+      <w:pPr>
+        <w:pStyle w:val="ListNumber"/>
+      </w:pPr>
+      <w:r>
+        <w:t>Save the finished artifacts in `outputs/` and record the evidence used.</w:t>
+      </w:r>
+    </w:p>
+    <w:p>
+      <w:pPr>
+        <w:pStyle w:val="Heading3"/>
+      </w:pPr>
+      <w:r>
+        <w:t>Test it</w:t>
+      </w:r>
+    </w:p>
+    <w:p>
+      <w:r>
+        <w:t>The output identifies 2026-09 as latest, displays September revenue S$128,000, expenses S$89,500 and net S$38,500, and contains refreshed charts.</w:t>
+      </w:r>
+    </w:p>
+    <w:p>
+      <w:pPr>
+        <w:pStyle w:val="Heading3"/>
+      </w:pPr>
+      <w:r>
+        <w:t>Troubleshooting</w:t>
+      </w:r>
+    </w:p>
+    <w:p>
+      <w:pPr>
+        <w:pStyle w:val="ListBullet"/>
+      </w:pPr>
+      <w:r>
+        <w:t>**Cowork selects the wrong file:** name the expected date format and require it to list candidates before choosing.</w:t>
+      </w:r>
+    </w:p>
+    <w:p>
+      <w:pPr>
+        <w:pStyle w:val="ListBullet"/>
+      </w:pPr>
+      <w:r>
+        <w:t>**A workbook does not refresh:** open it in Excel, recalculate, and ask Cowork to inspect formulas and chart source ranges.</w:t>
+      </w:r>
+    </w:p>
+    <w:p>
+      <w:pPr>
+        <w:pStyle w:val="ListBullet"/>
+      </w:pPr>
+      <w:r>
+        <w:t>**A claim has no source:** remove it or add a direct file, cell or URL reference.</w:t>
+      </w:r>
+    </w:p>
+    <w:p>
+      <w:pPr>
+        <w:pStyle w:val="Heading3"/>
+      </w:pPr>
+      <w:r>
+        <w:t>Challenge</w:t>
+      </w:r>
+    </w:p>
+    <w:p>
+      <w:r>
+        <w:t>Change the reporting period or audience and rerun the task without changing the skill's stable rules.</w:t>
+      </w:r>
+    </w:p>
+    <w:p>
+      <w:pPr>
+        <w:pStyle w:val="Heading3"/>
+      </w:pPr>
+      <w:r>
+        <w:t>Reflection</w:t>
+      </w:r>
+    </w:p>
+    <w:p>
+      <w:r>
+        <w:t>Which part of this task should always remain a human review point?</w:t>
       </w:r>
     </w:p>
     <w:p>
@@ -250,7 +825,12 @@
         <w:pStyle w:val="Heading1"/>
       </w:pPr>
       <w:r>
-        <w:t>Topic 01 — Finance Cowork project and controls</w:t>
+        <w:t>Use Case 03 — Research AI-in-Finance News</w:t>
+      </w:r>
+    </w:p>
+    <w:p>
+      <w:r>
+        <w:t>Scenario: Interesting news is scattered across many websites. Ask Cowork to find six recent, credible developments and cite each source. The result is a structured excel research tracker.</w:t>
       </w:r>
     </w:p>
     <w:p>
@@ -258,12 +838,31 @@
         <w:pStyle w:val="Heading2"/>
       </w:pPr>
       <w:r>
-        <w:t>Project scope</w:t>
-      </w:r>
-    </w:p>
-    <w:p>
-      <w:r>
-        <w:t>Mechanism: Finance Month-End Lab → synthetic August folder → outputs only. Worked finance evidence: 14 source rows; 7 columns; one duplicate ID. Review decision: Reject a plan that names a broader drive.</w:t>
+        <w:t>What goes in</w:t>
+      </w:r>
+    </w:p>
+    <w:p>
+      <w:pPr>
+        <w:pStyle w:val="ListBullet"/>
+      </w:pPr>
+      <w:r>
+        <w:t>Research brief</w:t>
+      </w:r>
+    </w:p>
+    <w:p>
+      <w:pPr>
+        <w:pStyle w:val="ListBullet"/>
+      </w:pPr>
+      <w:r>
+        <w:t>Excel tracker template</w:t>
+      </w:r>
+    </w:p>
+    <w:p>
+      <w:pPr>
+        <w:pStyle w:val="ListBullet"/>
+      </w:pPr>
+      <w:r>
+        <w:t>Live web sources</w:t>
       </w:r>
     </w:p>
     <w:p>
@@ -271,12 +870,31 @@
         <w:pStyle w:val="Heading2"/>
       </w:pPr>
       <w:r>
-        <w:t>Folder boundary</w:t>
-      </w:r>
-    </w:p>
-    <w:p>
-      <w:r>
-        <w:t>Mechanism: mock-data read-only → working copy → outputs. Worked finance evidence: Source SHA-256 unchanged after run. Review decision: Stop if a raw cell changes.</w:t>
+        <w:t>What Cowork does</w:t>
+      </w:r>
+    </w:p>
+    <w:p>
+      <w:pPr>
+        <w:pStyle w:val="ListNumber"/>
+      </w:pPr>
+      <w:r>
+        <w:t>Search recent sources</w:t>
+      </w:r>
+    </w:p>
+    <w:p>
+      <w:pPr>
+        <w:pStyle w:val="ListNumber"/>
+      </w:pPr>
+      <w:r>
+        <w:t>Check dates and links</w:t>
+      </w:r>
+    </w:p>
+    <w:p>
+      <w:pPr>
+        <w:pStyle w:val="ListNumber"/>
+      </w:pPr>
+      <w:r>
+        <w:t>Write to Excel</w:t>
       </w:r>
     </w:p>
     <w:p>
@@ -284,12 +902,31 @@
         <w:pStyle w:val="Heading2"/>
       </w:pPr>
       <w:r>
-        <w:t>Project instructions</w:t>
-      </w:r>
-    </w:p>
-    <w:p>
-      <w:r>
-        <w:t>Mechanism: Period + currency + eligibility rule + stop rule. Worked finance evidence: Approved, unique Document ID, SGD. Review decision: Project rule outranks a vague task phrase.</w:t>
+        <w:t>Skills and tools</w:t>
+      </w:r>
+    </w:p>
+    <w:p>
+      <w:pPr>
+        <w:pStyle w:val="ListBullet"/>
+      </w:pPr>
+      <w:r>
+        <w:t>Cowork web search</w:t>
+      </w:r>
+    </w:p>
+    <w:p>
+      <w:pPr>
+        <w:pStyle w:val="ListBullet"/>
+      </w:pPr>
+      <w:r>
+        <w:t>Web fetch</w:t>
+      </w:r>
+    </w:p>
+    <w:p>
+      <w:pPr>
+        <w:pStyle w:val="ListBullet"/>
+      </w:pPr>
+      <w:r>
+        <w:t>Spreadsheet skill</w:t>
       </w:r>
     </w:p>
     <w:p>
@@ -297,12 +934,12 @@
         <w:pStyle w:val="Heading2"/>
       </w:pPr>
       <w:r>
-        <w:t>Task contract</w:t>
-      </w:r>
-    </w:p>
-    <w:p>
-      <w:r>
-        <w:t>Mechanism: Outcome + source + output + review gate. Worked finance evidence: Finance report August 2026, no email. Review decision: No recipient or publish action in first run.</w:t>
+        <w:t>Human check</w:t>
+      </w:r>
+    </w:p>
+    <w:p>
+      <w:r>
+        <w:t>Six direct links open; every date and summary is sourced</w:t>
       </w:r>
     </w:p>
     <w:p>
@@ -310,12 +947,199 @@
         <w:pStyle w:val="Heading2"/>
       </w:pPr>
       <w:r>
-        <w:t>Source schema</w:t>
-      </w:r>
-    </w:p>
-    <w:p>
-      <w:r>
-        <w:t>Mechanism: Date | Document ID | Counterparty | Category | Amount | Currency | Status. Worked finance evidence: 14 rows × 7 fields in the workbook. Review decision: Unknown currency or blank ID becomes exception.</w:t>
+        <w:t>Lab 03 — step-by-step</w:t>
+      </w:r>
+    </w:p>
+    <w:p>
+      <w:r>
+        <w:t>C1382 · Topic 2 · 50 minutes</w:t>
+      </w:r>
+    </w:p>
+    <w:p>
+      <w:pPr>
+        <w:pStyle w:val="Heading3"/>
+      </w:pPr>
+      <w:r>
+        <w:t>Goal</w:t>
+      </w:r>
+    </w:p>
+    <w:p>
+      <w:r>
+        <w:t>Research recent AI technology news relevant to finance and compile a sourced Excel tracker.</w:t>
+      </w:r>
+    </w:p>
+    <w:p>
+      <w:pPr>
+        <w:pStyle w:val="Heading3"/>
+      </w:pPr>
+      <w:r>
+        <w:t>What you will build</w:t>
+      </w:r>
+    </w:p>
+    <w:p>
+      <w:r>
+        <w:t>An AI-finance-news-tracker.xlsx with source, date, summary, finance relevance and follow-up columns.</w:t>
+      </w:r>
+    </w:p>
+    <w:p>
+      <w:pPr>
+        <w:pStyle w:val="Heading3"/>
+      </w:pPr>
+      <w:r>
+        <w:t>Prerequisites</w:t>
+      </w:r>
+    </w:p>
+    <w:p>
+      <w:r>
+        <w:t>Open this lab folder as the Cowork project context. Read TOOLS.md, enable the named skill in skill/finance-news-researcher/SKILL.md, and use only the fictional files in mock-data/.</w:t>
+      </w:r>
+    </w:p>
+    <w:p>
+      <w:pPr>
+        <w:pStyle w:val="Heading3"/>
+      </w:pPr>
+      <w:r>
+        <w:t>Steps</w:t>
+      </w:r>
+    </w:p>
+    <w:p>
+      <w:pPr>
+        <w:pStyle w:val="ListNumber"/>
+      </w:pPr>
+      <w:r>
+        <w:t>Open `TOOLS.md` and confirm the available tools and access boundary.</w:t>
+      </w:r>
+    </w:p>
+    <w:p>
+      <w:pPr>
+        <w:pStyle w:val="ListNumber"/>
+      </w:pPr>
+      <w:r>
+        <w:t>Review the files in `mock-data/`; copy any file you will change into `working/`.</w:t>
+      </w:r>
+    </w:p>
+    <w:p>
+      <w:pPr>
+        <w:pStyle w:val="ListNumber"/>
+      </w:pPr>
+      <w:r>
+        <w:t>Add or enable `skill/finance-news-researcher/SKILL.md` in the Cowork project.</w:t>
+      </w:r>
+    </w:p>
+    <w:p>
+      <w:pPr>
+        <w:pStyle w:val="ListNumber"/>
+      </w:pPr>
+      <w:r>
+        <w:t>Open `prompts/prompt-03.txt`, paste the prompt into Cowork and review its proposed plan.</w:t>
+      </w:r>
+    </w:p>
+    <w:p>
+      <w:pPr>
+        <w:pStyle w:val="ListNumber"/>
+      </w:pPr>
+      <w:r>
+        <w:t>Allow only the reads and writes needed for this lab. Keep consequential actions paused.</w:t>
+      </w:r>
+    </w:p>
+    <w:p>
+      <w:pPr>
+        <w:pStyle w:val="ListNumber"/>
+      </w:pPr>
+      <w:r>
+        <w:t>Open the generated files and compare them with `CHECKLIST.md`. Correct any mismatch in the output, then repeat the check.</w:t>
+      </w:r>
+    </w:p>
+    <w:p>
+      <w:pPr>
+        <w:pStyle w:val="ListNumber"/>
+      </w:pPr>
+      <w:r>
+        <w:t>Save the finished artifacts in `outputs/` and record the evidence used.</w:t>
+      </w:r>
+    </w:p>
+    <w:p>
+      <w:pPr>
+        <w:pStyle w:val="Heading3"/>
+      </w:pPr>
+      <w:r>
+        <w:t>Test it</w:t>
+      </w:r>
+    </w:p>
+    <w:p>
+      <w:r>
+        <w:t>The workbook contains six distinct recent items, six direct links that open, dates, concise summaries, and a completed Research Notes sheet.</w:t>
+      </w:r>
+    </w:p>
+    <w:p>
+      <w:pPr>
+        <w:pStyle w:val="Heading3"/>
+      </w:pPr>
+      <w:r>
+        <w:t>Troubleshooting</w:t>
+      </w:r>
+    </w:p>
+    <w:p>
+      <w:pPr>
+        <w:pStyle w:val="ListBullet"/>
+      </w:pPr>
+      <w:r>
+        <w:t>**Cowork selects the wrong file:** name the expected date format and require it to list candidates before choosing.</w:t>
+      </w:r>
+    </w:p>
+    <w:p>
+      <w:pPr>
+        <w:pStyle w:val="ListBullet"/>
+      </w:pPr>
+      <w:r>
+        <w:t>**A workbook does not refresh:** open it in Excel, recalculate, and ask Cowork to inspect formulas and chart source ranges.</w:t>
+      </w:r>
+    </w:p>
+    <w:p>
+      <w:pPr>
+        <w:pStyle w:val="ListBullet"/>
+      </w:pPr>
+      <w:r>
+        <w:t>**A claim has no source:** remove it or add a direct file, cell or URL reference.</w:t>
+      </w:r>
+    </w:p>
+    <w:p>
+      <w:pPr>
+        <w:pStyle w:val="Heading3"/>
+      </w:pPr>
+      <w:r>
+        <w:t>Challenge</w:t>
+      </w:r>
+    </w:p>
+    <w:p>
+      <w:r>
+        <w:t>Change the reporting period or audience and rerun the task without changing the skill's stable rules.</w:t>
+      </w:r>
+    </w:p>
+    <w:p>
+      <w:pPr>
+        <w:pStyle w:val="Heading3"/>
+      </w:pPr>
+      <w:r>
+        <w:t>Reflection</w:t>
+      </w:r>
+    </w:p>
+    <w:p>
+      <w:r>
+        <w:t>Which part of this task should always remain a human review point?</w:t>
+      </w:r>
+    </w:p>
+    <w:p>
+      <w:pPr>
+        <w:pStyle w:val="Heading1"/>
+      </w:pPr>
+      <w:r>
+        <w:t>Use Case 04 — Turn Finance Data into Slides</w:t>
+      </w:r>
+    </w:p>
+    <w:p>
+      <w:r>
+        <w:t>Scenario: Leaders receive a dense workbook. Ask Cowork to turn the numbers into a five-slide update. The result is clear charts, messages and next actions.</w:t>
       </w:r>
     </w:p>
     <w:p>
@@ -323,12 +1147,31 @@
         <w:pStyle w:val="Heading2"/>
       </w:pPr>
       <w:r>
-        <w:t>Approval field</w:t>
-      </w:r>
-    </w:p>
-    <w:p>
-      <w:r>
-        <w:t>Mechanism: Approved is eligible; Pending is held. Worked finance evidence: INV-013 is Pending +S$2,200. Review decision: Do not include pending revenue.</w:t>
+        <w:t>What goes in</w:t>
+      </w:r>
+    </w:p>
+    <w:p>
+      <w:pPr>
+        <w:pStyle w:val="ListBullet"/>
+      </w:pPr>
+      <w:r>
+        <w:t>Quarterly workbook</w:t>
+      </w:r>
+    </w:p>
+    <w:p>
+      <w:pPr>
+        <w:pStyle w:val="ListBullet"/>
+      </w:pPr>
+      <w:r>
+        <w:t>Manager brief</w:t>
+      </w:r>
+    </w:p>
+    <w:p>
+      <w:pPr>
+        <w:pStyle w:val="ListBullet"/>
+      </w:pPr>
+      <w:r>
+        <w:t>Brand guide</w:t>
       </w:r>
     </w:p>
     <w:p>
@@ -336,12 +1179,31 @@
         <w:pStyle w:val="Heading2"/>
       </w:pPr>
       <w:r>
-        <w:t>Duplicate key</w:t>
-      </w:r>
-    </w:p>
-    <w:p>
-      <w:r>
-        <w:t>Mechanism: Document ID is business key within period. Worked finance evidence: BILL-012 occurs twice at -S$1,020. Review decision: Keep first; log second occurrence.</w:t>
+        <w:t>What Cowork does</w:t>
+      </w:r>
+    </w:p>
+    <w:p>
+      <w:pPr>
+        <w:pStyle w:val="ListNumber"/>
+      </w:pPr>
+      <w:r>
+        <w:t>Read the brief</w:t>
+      </w:r>
+    </w:p>
+    <w:p>
+      <w:pPr>
+        <w:pStyle w:val="ListNumber"/>
+      </w:pPr>
+      <w:r>
+        <w:t>Choose the story</w:t>
+      </w:r>
+    </w:p>
+    <w:p>
+      <w:pPr>
+        <w:pStyle w:val="ListNumber"/>
+      </w:pPr>
+      <w:r>
+        <w:t>Build editable slides</w:t>
       </w:r>
     </w:p>
     <w:p>
@@ -349,12 +1211,31 @@
         <w:pStyle w:val="Heading2"/>
       </w:pPr>
       <w:r>
-        <w:t>Provenance</w:t>
-      </w:r>
-    </w:p>
-    <w:p>
-      <w:r>
-        <w:t>Mechanism: Every output metric links to named source rows. Worked finance evidence: Revenue source: six approved invoices. Review decision: A narrative without row links is not evidence.</w:t>
+        <w:t>Skills and tools</w:t>
+      </w:r>
+    </w:p>
+    <w:p>
+      <w:pPr>
+        <w:pStyle w:val="ListBullet"/>
+      </w:pPr>
+      <w:r>
+        <w:t>Cowork files</w:t>
+      </w:r>
+    </w:p>
+    <w:p>
+      <w:pPr>
+        <w:pStyle w:val="ListBullet"/>
+      </w:pPr>
+      <w:r>
+        <w:t>Spreadsheet skill</w:t>
+      </w:r>
+    </w:p>
+    <w:p>
+      <w:pPr>
+        <w:pStyle w:val="ListBullet"/>
+      </w:pPr>
+      <w:r>
+        <w:t>PowerPoint skill</w:t>
       </w:r>
     </w:p>
     <w:p>
@@ -362,12 +1243,12 @@
         <w:pStyle w:val="Heading2"/>
       </w:pPr>
       <w:r>
-        <w:t>Permission gate</w:t>
-      </w:r>
-    </w:p>
-    <w:p>
-      <w:r>
-        <w:t>Mechanism: Read workbook; write only working and outputs. Worked finance evidence: No change to mock-data hash. Review decision: Decline connector or email permission here.</w:t>
+        <w:t>Human check</w:t>
+      </w:r>
+    </w:p>
+    <w:p>
+      <w:r>
+        <w:t>Five slides; Q3 revenue S$378k and net S$108.5k match Excel</w:t>
       </w:r>
     </w:p>
     <w:p>
@@ -375,12 +1256,199 @@
         <w:pStyle w:val="Heading2"/>
       </w:pPr>
       <w:r>
-        <w:t>Prompt injection</w:t>
-      </w:r>
-    </w:p>
-    <w:p>
-      <w:r>
-        <w:t>Mechanism: Workbook text is data, never new instructions. Worked finance evidence: Counterparty cell cannot authorize a send. Review decision: Treat embedded instructions as untrusted data.</w:t>
+        <w:t>Lab 04 — step-by-step</w:t>
+      </w:r>
+    </w:p>
+    <w:p>
+      <w:r>
+        <w:t>C1382 · Topic 2 · 55 minutes</w:t>
+      </w:r>
+    </w:p>
+    <w:p>
+      <w:pPr>
+        <w:pStyle w:val="Heading3"/>
+      </w:pPr>
+      <w:r>
+        <w:t>Goal</w:t>
+      </w:r>
+    </w:p>
+    <w:p>
+      <w:r>
+        <w:t>Transform a finance workbook and manager brief into a clear five-slide presentation.</w:t>
+      </w:r>
+    </w:p>
+    <w:p>
+      <w:pPr>
+        <w:pStyle w:val="Heading3"/>
+      </w:pPr>
+      <w:r>
+        <w:t>What you will build</w:t>
+      </w:r>
+    </w:p>
+    <w:p>
+      <w:r>
+        <w:t>A five-slide management update with KPI chart, variance story, cash outlook and actions.</w:t>
+      </w:r>
+    </w:p>
+    <w:p>
+      <w:pPr>
+        <w:pStyle w:val="Heading3"/>
+      </w:pPr>
+      <w:r>
+        <w:t>Prerequisites</w:t>
+      </w:r>
+    </w:p>
+    <w:p>
+      <w:r>
+        <w:t>Open this lab folder as the Cowork project context. Read TOOLS.md, enable the named skill in skill/finance-deck-builder/SKILL.md, and use only the fictional files in mock-data/.</w:t>
+      </w:r>
+    </w:p>
+    <w:p>
+      <w:pPr>
+        <w:pStyle w:val="Heading3"/>
+      </w:pPr>
+      <w:r>
+        <w:t>Steps</w:t>
+      </w:r>
+    </w:p>
+    <w:p>
+      <w:pPr>
+        <w:pStyle w:val="ListNumber"/>
+      </w:pPr>
+      <w:r>
+        <w:t>Open `TOOLS.md` and confirm the available tools and access boundary.</w:t>
+      </w:r>
+    </w:p>
+    <w:p>
+      <w:pPr>
+        <w:pStyle w:val="ListNumber"/>
+      </w:pPr>
+      <w:r>
+        <w:t>Review the files in `mock-data/`; copy any file you will change into `working/`.</w:t>
+      </w:r>
+    </w:p>
+    <w:p>
+      <w:pPr>
+        <w:pStyle w:val="ListNumber"/>
+      </w:pPr>
+      <w:r>
+        <w:t>Add or enable `skill/finance-deck-builder/SKILL.md` in the Cowork project.</w:t>
+      </w:r>
+    </w:p>
+    <w:p>
+      <w:pPr>
+        <w:pStyle w:val="ListNumber"/>
+      </w:pPr>
+      <w:r>
+        <w:t>Open `prompts/prompt-04.txt`, paste the prompt into Cowork and review its proposed plan.</w:t>
+      </w:r>
+    </w:p>
+    <w:p>
+      <w:pPr>
+        <w:pStyle w:val="ListNumber"/>
+      </w:pPr>
+      <w:r>
+        <w:t>Allow only the reads and writes needed for this lab. Keep consequential actions paused.</w:t>
+      </w:r>
+    </w:p>
+    <w:p>
+      <w:pPr>
+        <w:pStyle w:val="ListNumber"/>
+      </w:pPr>
+      <w:r>
+        <w:t>Open the generated files and compare them with `CHECKLIST.md`. Correct any mismatch in the output, then repeat the check.</w:t>
+      </w:r>
+    </w:p>
+    <w:p>
+      <w:pPr>
+        <w:pStyle w:val="ListNumber"/>
+      </w:pPr>
+      <w:r>
+        <w:t>Save the finished artifacts in `outputs/` and record the evidence used.</w:t>
+      </w:r>
+    </w:p>
+    <w:p>
+      <w:pPr>
+        <w:pStyle w:val="Heading3"/>
+      </w:pPr>
+      <w:r>
+        <w:t>Test it</w:t>
+      </w:r>
+    </w:p>
+    <w:p>
+      <w:r>
+        <w:t>The deck has five slides, editable charts, correct Q3 revenue S$378,000, expense S$269,500, net S$108,500, and three actions from the manager brief.</w:t>
+      </w:r>
+    </w:p>
+    <w:p>
+      <w:pPr>
+        <w:pStyle w:val="Heading3"/>
+      </w:pPr>
+      <w:r>
+        <w:t>Troubleshooting</w:t>
+      </w:r>
+    </w:p>
+    <w:p>
+      <w:pPr>
+        <w:pStyle w:val="ListBullet"/>
+      </w:pPr>
+      <w:r>
+        <w:t>**Cowork selects the wrong file:** name the expected date format and require it to list candidates before choosing.</w:t>
+      </w:r>
+    </w:p>
+    <w:p>
+      <w:pPr>
+        <w:pStyle w:val="ListBullet"/>
+      </w:pPr>
+      <w:r>
+        <w:t>**A workbook does not refresh:** open it in Excel, recalculate, and ask Cowork to inspect formulas and chart source ranges.</w:t>
+      </w:r>
+    </w:p>
+    <w:p>
+      <w:pPr>
+        <w:pStyle w:val="ListBullet"/>
+      </w:pPr>
+      <w:r>
+        <w:t>**A claim has no source:** remove it or add a direct file, cell or URL reference.</w:t>
+      </w:r>
+    </w:p>
+    <w:p>
+      <w:pPr>
+        <w:pStyle w:val="Heading3"/>
+      </w:pPr>
+      <w:r>
+        <w:t>Challenge</w:t>
+      </w:r>
+    </w:p>
+    <w:p>
+      <w:r>
+        <w:t>Change the reporting period or audience and rerun the task without changing the skill's stable rules.</w:t>
+      </w:r>
+    </w:p>
+    <w:p>
+      <w:pPr>
+        <w:pStyle w:val="Heading3"/>
+      </w:pPr>
+      <w:r>
+        <w:t>Reflection</w:t>
+      </w:r>
+    </w:p>
+    <w:p>
+      <w:r>
+        <w:t>Which part of this task should always remain a human review point?</w:t>
+      </w:r>
+    </w:p>
+    <w:p>
+      <w:pPr>
+        <w:pStyle w:val="Heading1"/>
+      </w:pPr>
+      <w:r>
+        <w:t>Use Case 05 — Build an AP Tracker from Invoices</w:t>
+      </w:r>
+    </w:p>
+    <w:p>
+      <w:r>
+        <w:t>Scenario: Invoice details are copied one file at a time. Ask Cowork to extract five invoices and flag anything uncertain. The result is a tidy ap tracker ready for review.</w:t>
       </w:r>
     </w:p>
     <w:p>
@@ -388,12 +1456,31 @@
         <w:pStyle w:val="Heading2"/>
       </w:pPr>
       <w:r>
-        <w:t>Plan review</w:t>
-      </w:r>
-    </w:p>
-    <w:p>
-      <w:r>
-        <w:t>Mechanism: Inspect files, operations and side effects. Worked finance evidence: Expected: read one .xlsx, write one manifest. Review decision: Pause if browser or mailbox appears in plan.</w:t>
+        <w:t>What goes in</w:t>
+      </w:r>
+    </w:p>
+    <w:p>
+      <w:pPr>
+        <w:pStyle w:val="ListBullet"/>
+      </w:pPr>
+      <w:r>
+        <w:t>Five mock invoice PDFs</w:t>
+      </w:r>
+    </w:p>
+    <w:p>
+      <w:pPr>
+        <w:pStyle w:val="ListBullet"/>
+      </w:pPr>
+      <w:r>
+        <w:t>AP tracker template</w:t>
+      </w:r>
+    </w:p>
+    <w:p>
+      <w:pPr>
+        <w:pStyle w:val="ListBullet"/>
+      </w:pPr>
+      <w:r>
+        <w:t>Review rules</w:t>
       </w:r>
     </w:p>
     <w:p>
@@ -401,12 +1488,263 @@
         <w:pStyle w:val="Heading2"/>
       </w:pPr>
       <w:r>
-        <w:t>Inventory check</w:t>
-      </w:r>
-    </w:p>
-    <w:p>
-      <w:r>
-        <w:t>Mechanism: Source count → duplicate count → pending count. Worked finance evidence: 14 = 12 eligible + 2 excluded. Review decision: Mismatch blocks Lab 2.</w:t>
+        <w:t>What Cowork does</w:t>
+      </w:r>
+    </w:p>
+    <w:p>
+      <w:pPr>
+        <w:pStyle w:val="ListNumber"/>
+      </w:pPr>
+      <w:r>
+        <w:t>Read invoices</w:t>
+      </w:r>
+    </w:p>
+    <w:p>
+      <w:pPr>
+        <w:pStyle w:val="ListNumber"/>
+      </w:pPr>
+      <w:r>
+        <w:t>Extract fields</w:t>
+      </w:r>
+    </w:p>
+    <w:p>
+      <w:pPr>
+        <w:pStyle w:val="ListNumber"/>
+      </w:pPr>
+      <w:r>
+        <w:t>Flag exceptions</w:t>
+      </w:r>
+    </w:p>
+    <w:p>
+      <w:pPr>
+        <w:pStyle w:val="Heading2"/>
+      </w:pPr>
+      <w:r>
+        <w:t>Skills and tools</w:t>
+      </w:r>
+    </w:p>
+    <w:p>
+      <w:pPr>
+        <w:pStyle w:val="ListBullet"/>
+      </w:pPr>
+      <w:r>
+        <w:t>Document reading</w:t>
+      </w:r>
+    </w:p>
+    <w:p>
+      <w:pPr>
+        <w:pStyle w:val="ListBullet"/>
+      </w:pPr>
+      <w:r>
+        <w:t>PDF skill</w:t>
+      </w:r>
+    </w:p>
+    <w:p>
+      <w:pPr>
+        <w:pStyle w:val="ListBullet"/>
+      </w:pPr>
+      <w:r>
+        <w:t>Spreadsheet skill</w:t>
+      </w:r>
+    </w:p>
+    <w:p>
+      <w:pPr>
+        <w:pStyle w:val="Heading2"/>
+      </w:pPr>
+      <w:r>
+        <w:t>Human check</w:t>
+      </w:r>
+    </w:p>
+    <w:p>
+      <w:r>
+        <w:t>Five rows; duplicate INV-204 and missing PO are visible</w:t>
+      </w:r>
+    </w:p>
+    <w:p>
+      <w:pPr>
+        <w:pStyle w:val="Heading2"/>
+      </w:pPr>
+      <w:r>
+        <w:t>Lab 05 — step-by-step</w:t>
+      </w:r>
+    </w:p>
+    <w:p>
+      <w:r>
+        <w:t>C1382 · Topic 3 · 45 minutes</w:t>
+      </w:r>
+    </w:p>
+    <w:p>
+      <w:pPr>
+        <w:pStyle w:val="Heading3"/>
+      </w:pPr>
+      <w:r>
+        <w:t>Goal</w:t>
+      </w:r>
+    </w:p>
+    <w:p>
+      <w:r>
+        <w:t>Read a folder of mock invoices and create a tidy accounts-payable tracker.</w:t>
+      </w:r>
+    </w:p>
+    <w:p>
+      <w:pPr>
+        <w:pStyle w:val="Heading3"/>
+      </w:pPr>
+      <w:r>
+        <w:t>What you will build</w:t>
+      </w:r>
+    </w:p>
+    <w:p>
+      <w:r>
+        <w:t>An AP-tracker.xlsx with invoice number, supplier, date, due date, amount, currency and review status.</w:t>
+      </w:r>
+    </w:p>
+    <w:p>
+      <w:pPr>
+        <w:pStyle w:val="Heading3"/>
+      </w:pPr>
+      <w:r>
+        <w:t>Prerequisites</w:t>
+      </w:r>
+    </w:p>
+    <w:p>
+      <w:r>
+        <w:t>Open this lab folder as the Cowork project context. Read TOOLS.md, enable the named skill in skill/invoice-to-ap-tracker/SKILL.md, and use only the fictional files in mock-data/.</w:t>
+      </w:r>
+    </w:p>
+    <w:p>
+      <w:pPr>
+        <w:pStyle w:val="Heading3"/>
+      </w:pPr>
+      <w:r>
+        <w:t>Steps</w:t>
+      </w:r>
+    </w:p>
+    <w:p>
+      <w:pPr>
+        <w:pStyle w:val="ListNumber"/>
+      </w:pPr>
+      <w:r>
+        <w:t>Open `TOOLS.md` and confirm the available tools and access boundary.</w:t>
+      </w:r>
+    </w:p>
+    <w:p>
+      <w:pPr>
+        <w:pStyle w:val="ListNumber"/>
+      </w:pPr>
+      <w:r>
+        <w:t>Review the files in `mock-data/`; copy any file you will change into `working/`.</w:t>
+      </w:r>
+    </w:p>
+    <w:p>
+      <w:pPr>
+        <w:pStyle w:val="ListNumber"/>
+      </w:pPr>
+      <w:r>
+        <w:t>Add or enable `skill/invoice-to-ap-tracker/SKILL.md` in the Cowork project.</w:t>
+      </w:r>
+    </w:p>
+    <w:p>
+      <w:pPr>
+        <w:pStyle w:val="ListNumber"/>
+      </w:pPr>
+      <w:r>
+        <w:t>Open `prompts/prompt-05.txt`, paste the prompt into Cowork and review its proposed plan.</w:t>
+      </w:r>
+    </w:p>
+    <w:p>
+      <w:pPr>
+        <w:pStyle w:val="ListNumber"/>
+      </w:pPr>
+      <w:r>
+        <w:t>Allow only the reads and writes needed for this lab. Keep consequential actions paused.</w:t>
+      </w:r>
+    </w:p>
+    <w:p>
+      <w:pPr>
+        <w:pStyle w:val="ListNumber"/>
+      </w:pPr>
+      <w:r>
+        <w:t>Open the generated files and compare them with `CHECKLIST.md`. Correct any mismatch in the output, then repeat the check.</w:t>
+      </w:r>
+    </w:p>
+    <w:p>
+      <w:pPr>
+        <w:pStyle w:val="ListNumber"/>
+      </w:pPr>
+      <w:r>
+        <w:t>Save the finished artifacts in `outputs/` and record the evidence used.</w:t>
+      </w:r>
+    </w:p>
+    <w:p>
+      <w:pPr>
+        <w:pStyle w:val="Heading3"/>
+      </w:pPr>
+      <w:r>
+        <w:t>Test it</w:t>
+      </w:r>
+    </w:p>
+    <w:p>
+      <w:r>
+        <w:t>The tracker contains five invoice rows, flags duplicate INV-204, marks one missing purchase order for review, and reconciles each invoice total.</w:t>
+      </w:r>
+    </w:p>
+    <w:p>
+      <w:pPr>
+        <w:pStyle w:val="Heading3"/>
+      </w:pPr>
+      <w:r>
+        <w:t>Troubleshooting</w:t>
+      </w:r>
+    </w:p>
+    <w:p>
+      <w:pPr>
+        <w:pStyle w:val="ListBullet"/>
+      </w:pPr>
+      <w:r>
+        <w:t>**Cowork selects the wrong file:** name the expected date format and require it to list candidates before choosing.</w:t>
+      </w:r>
+    </w:p>
+    <w:p>
+      <w:pPr>
+        <w:pStyle w:val="ListBullet"/>
+      </w:pPr>
+      <w:r>
+        <w:t>**A workbook does not refresh:** open it in Excel, recalculate, and ask Cowork to inspect formulas and chart source ranges.</w:t>
+      </w:r>
+    </w:p>
+    <w:p>
+      <w:pPr>
+        <w:pStyle w:val="ListBullet"/>
+      </w:pPr>
+      <w:r>
+        <w:t>**A claim has no source:** remove it or add a direct file, cell or URL reference.</w:t>
+      </w:r>
+    </w:p>
+    <w:p>
+      <w:pPr>
+        <w:pStyle w:val="Heading3"/>
+      </w:pPr>
+      <w:r>
+        <w:t>Challenge</w:t>
+      </w:r>
+    </w:p>
+    <w:p>
+      <w:r>
+        <w:t>Change the reporting period or audience and rerun the task without changing the skill's stable rules.</w:t>
+      </w:r>
+    </w:p>
+    <w:p>
+      <w:pPr>
+        <w:pStyle w:val="Heading3"/>
+      </w:pPr>
+      <w:r>
+        <w:t>Reflection</w:t>
+      </w:r>
+    </w:p>
+    <w:p>
+      <w:r>
+        <w:t>Which part of this task should always remain a human review point?</w:t>
       </w:r>
     </w:p>
     <w:p>
@@ -414,7 +1752,12 @@
         <w:pStyle w:val="Heading1"/>
       </w:pPr>
       <w:r>
-        <w:t>Topic 02 — Automate and reconcile Excel</w:t>
+        <w:t>Use Case 06 — Write Budget Variance Commentary</w:t>
+      </w:r>
+    </w:p>
+    <w:p>
+      <w:r>
+        <w:t>Scenario: Managers see variances but not the story. Ask Cowork to calculate material variances and explain them simply. The result is a reviewed workbook and one-page commentary.</w:t>
       </w:r>
     </w:p>
     <w:p>
@@ -422,12 +1765,31 @@
         <w:pStyle w:val="Heading2"/>
       </w:pPr>
       <w:r>
-        <w:t>Raw sheet</w:t>
-      </w:r>
-    </w:p>
-    <w:p>
-      <w:r>
-        <w:t>Mechanism: Copy all 14 rows with original column order. Worked finance evidence: Raw!A1:G15 retained. Review decision: Never normalize away exception evidence.</w:t>
+        <w:t>What goes in</w:t>
+      </w:r>
+    </w:p>
+    <w:p>
+      <w:pPr>
+        <w:pStyle w:val="ListBullet"/>
+      </w:pPr>
+      <w:r>
+        <w:t>Budget vs actual</w:t>
+      </w:r>
+    </w:p>
+    <w:p>
+      <w:pPr>
+        <w:pStyle w:val="ListBullet"/>
+      </w:pPr>
+      <w:r>
+        <w:t>Department notes</w:t>
+      </w:r>
+    </w:p>
+    <w:p>
+      <w:pPr>
+        <w:pStyle w:val="ListBullet"/>
+      </w:pPr>
+      <w:r>
+        <w:t>Materiality rule</w:t>
       </w:r>
     </w:p>
     <w:p>
@@ -435,12 +1797,31 @@
         <w:pStyle w:val="Heading2"/>
       </w:pPr>
       <w:r>
-        <w:t>Eligible sheet</w:t>
-      </w:r>
-    </w:p>
-    <w:p>
-      <w:r>
-        <w:t>Mechanism: Approved ∧ first occurrence of Document ID. Worked finance evidence: 12 eligible rows, 6 revenue + 6 expense. Review decision: Filter criteria must be visible.</w:t>
+        <w:t>What Cowork does</w:t>
+      </w:r>
+    </w:p>
+    <w:p>
+      <w:pPr>
+        <w:pStyle w:val="ListNumber"/>
+      </w:pPr>
+      <w:r>
+        <w:t>Calculate variance</w:t>
+      </w:r>
+    </w:p>
+    <w:p>
+      <w:pPr>
+        <w:pStyle w:val="ListNumber"/>
+      </w:pPr>
+      <w:r>
+        <w:t>Highlight material items</w:t>
+      </w:r>
+    </w:p>
+    <w:p>
+      <w:pPr>
+        <w:pStyle w:val="ListNumber"/>
+      </w:pPr>
+      <w:r>
+        <w:t>Draft commentary</w:t>
       </w:r>
     </w:p>
     <w:p>
@@ -448,12 +1829,31 @@
         <w:pStyle w:val="Heading2"/>
       </w:pPr>
       <w:r>
-        <w:t>Exceptions sheet</w:t>
-      </w:r>
-    </w:p>
-    <w:p>
-      <w:r>
-        <w:t>Mechanism: Record excluded row, reason, source address. Worked finance evidence: BILL-012 repeat; INV-013 pending. Review decision: No silent row deletion.</w:t>
+        <w:t>Skills and tools</w:t>
+      </w:r>
+    </w:p>
+    <w:p>
+      <w:pPr>
+        <w:pStyle w:val="ListBullet"/>
+      </w:pPr>
+      <w:r>
+        <w:t>Cowork files</w:t>
+      </w:r>
+    </w:p>
+    <w:p>
+      <w:pPr>
+        <w:pStyle w:val="ListBullet"/>
+      </w:pPr>
+      <w:r>
+        <w:t>Spreadsheet skill</w:t>
+      </w:r>
+    </w:p>
+    <w:p>
+      <w:pPr>
+        <w:pStyle w:val="ListBullet"/>
+      </w:pPr>
+      <w:r>
+        <w:t>Document skill</w:t>
       </w:r>
     </w:p>
     <w:p>
@@ -461,12 +1861,12 @@
         <w:pStyle w:val="Heading2"/>
       </w:pPr>
       <w:r>
-        <w:t>Revenue formula</w:t>
-      </w:r>
-    </w:p>
-    <w:p>
-      <w:r>
-        <w:t>Mechanism: SUMIFS eligible positive Amount SGD. Worked finance evidence: S$46,700 from six invoices. Review decision: Compare formula result to independent total.</w:t>
+        <w:t>Human check</w:t>
+      </w:r>
+    </w:p>
+    <w:p>
+      <w:r>
+        <w:t>Each comment links to a line item or is marked as a question</w:t>
       </w:r>
     </w:p>
     <w:p>
@@ -474,12 +1874,199 @@
         <w:pStyle w:val="Heading2"/>
       </w:pPr>
       <w:r>
-        <w:t>Expense formula</w:t>
-      </w:r>
-    </w:p>
-    <w:p>
-      <w:r>
-        <w:t>Mechanism: ABS(SUMIFS eligible negative Amount SGD)). Worked finance evidence: S$16,500 from six bills. Review decision: Check sign convention before net.</w:t>
+        <w:t>Lab 06 — step-by-step</w:t>
+      </w:r>
+    </w:p>
+    <w:p>
+      <w:r>
+        <w:t>C1382 · Topic 3 · 45 minutes</w:t>
+      </w:r>
+    </w:p>
+    <w:p>
+      <w:pPr>
+        <w:pStyle w:val="Heading3"/>
+      </w:pPr>
+      <w:r>
+        <w:t>Goal</w:t>
+      </w:r>
+    </w:p>
+    <w:p>
+      <w:r>
+        <w:t>Calculate material variances and write concise management commentary.</w:t>
+      </w:r>
+    </w:p>
+    <w:p>
+      <w:pPr>
+        <w:pStyle w:val="Heading3"/>
+      </w:pPr>
+      <w:r>
+        <w:t>What you will build</w:t>
+      </w:r>
+    </w:p>
+    <w:p>
+      <w:r>
+        <w:t>A variance-review.xlsx and a one-page management-commentary.md.</w:t>
+      </w:r>
+    </w:p>
+    <w:p>
+      <w:pPr>
+        <w:pStyle w:val="Heading3"/>
+      </w:pPr>
+      <w:r>
+        <w:t>Prerequisites</w:t>
+      </w:r>
+    </w:p>
+    <w:p>
+      <w:r>
+        <w:t>Open this lab folder as the Cowork project context. Read TOOLS.md, enable the named skill in skill/variance-commentary/SKILL.md, and use only the fictional files in mock-data/.</w:t>
+      </w:r>
+    </w:p>
+    <w:p>
+      <w:pPr>
+        <w:pStyle w:val="Heading3"/>
+      </w:pPr>
+      <w:r>
+        <w:t>Steps</w:t>
+      </w:r>
+    </w:p>
+    <w:p>
+      <w:pPr>
+        <w:pStyle w:val="ListNumber"/>
+      </w:pPr>
+      <w:r>
+        <w:t>Open `TOOLS.md` and confirm the available tools and access boundary.</w:t>
+      </w:r>
+    </w:p>
+    <w:p>
+      <w:pPr>
+        <w:pStyle w:val="ListNumber"/>
+      </w:pPr>
+      <w:r>
+        <w:t>Review the files in `mock-data/`; copy any file you will change into `working/`.</w:t>
+      </w:r>
+    </w:p>
+    <w:p>
+      <w:pPr>
+        <w:pStyle w:val="ListNumber"/>
+      </w:pPr>
+      <w:r>
+        <w:t>Add or enable `skill/variance-commentary/SKILL.md` in the Cowork project.</w:t>
+      </w:r>
+    </w:p>
+    <w:p>
+      <w:pPr>
+        <w:pStyle w:val="ListNumber"/>
+      </w:pPr>
+      <w:r>
+        <w:t>Open `prompts/prompt-06.txt`, paste the prompt into Cowork and review its proposed plan.</w:t>
+      </w:r>
+    </w:p>
+    <w:p>
+      <w:pPr>
+        <w:pStyle w:val="ListNumber"/>
+      </w:pPr>
+      <w:r>
+        <w:t>Allow only the reads and writes needed for this lab. Keep consequential actions paused.</w:t>
+      </w:r>
+    </w:p>
+    <w:p>
+      <w:pPr>
+        <w:pStyle w:val="ListNumber"/>
+      </w:pPr>
+      <w:r>
+        <w:t>Open the generated files and compare them with `CHECKLIST.md`. Correct any mismatch in the output, then repeat the check.</w:t>
+      </w:r>
+    </w:p>
+    <w:p>
+      <w:pPr>
+        <w:pStyle w:val="ListNumber"/>
+      </w:pPr>
+      <w:r>
+        <w:t>Save the finished artifacts in `outputs/` and record the evidence used.</w:t>
+      </w:r>
+    </w:p>
+    <w:p>
+      <w:pPr>
+        <w:pStyle w:val="Heading3"/>
+      </w:pPr>
+      <w:r>
+        <w:t>Test it</w:t>
+      </w:r>
+    </w:p>
+    <w:p>
+      <w:r>
+        <w:t>The workbook uses formulas, material items are highlighted, and the commentary names Marketing, Contractors and Travel with traceable evidence or questions.</w:t>
+      </w:r>
+    </w:p>
+    <w:p>
+      <w:pPr>
+        <w:pStyle w:val="Heading3"/>
+      </w:pPr>
+      <w:r>
+        <w:t>Troubleshooting</w:t>
+      </w:r>
+    </w:p>
+    <w:p>
+      <w:pPr>
+        <w:pStyle w:val="ListBullet"/>
+      </w:pPr>
+      <w:r>
+        <w:t>**Cowork selects the wrong file:** name the expected date format and require it to list candidates before choosing.</w:t>
+      </w:r>
+    </w:p>
+    <w:p>
+      <w:pPr>
+        <w:pStyle w:val="ListBullet"/>
+      </w:pPr>
+      <w:r>
+        <w:t>**A workbook does not refresh:** open it in Excel, recalculate, and ask Cowork to inspect formulas and chart source ranges.</w:t>
+      </w:r>
+    </w:p>
+    <w:p>
+      <w:pPr>
+        <w:pStyle w:val="ListBullet"/>
+      </w:pPr>
+      <w:r>
+        <w:t>**A claim has no source:** remove it or add a direct file, cell or URL reference.</w:t>
+      </w:r>
+    </w:p>
+    <w:p>
+      <w:pPr>
+        <w:pStyle w:val="Heading3"/>
+      </w:pPr>
+      <w:r>
+        <w:t>Challenge</w:t>
+      </w:r>
+    </w:p>
+    <w:p>
+      <w:r>
+        <w:t>Change the reporting period or audience and rerun the task without changing the skill's stable rules.</w:t>
+      </w:r>
+    </w:p>
+    <w:p>
+      <w:pPr>
+        <w:pStyle w:val="Heading3"/>
+      </w:pPr>
+      <w:r>
+        <w:t>Reflection</w:t>
+      </w:r>
+    </w:p>
+    <w:p>
+      <w:r>
+        <w:t>Which part of this task should always remain a human review point?</w:t>
+      </w:r>
+    </w:p>
+    <w:p>
+      <w:pPr>
+        <w:pStyle w:val="Heading1"/>
+      </w:pPr>
+      <w:r>
+        <w:t>Use Case 07 — Build a Cash-Flow Watchlist</w:t>
+      </w:r>
+    </w:p>
+    <w:p>
+      <w:r>
+        <w:t>Scenario: Receipts and payments sit in separate files. Ask Cowork to combine them into a 14-day running balance. The result is a cash watchlist and reviewed email draft.</w:t>
       </w:r>
     </w:p>
     <w:p>
@@ -487,12 +2074,31 @@
         <w:pStyle w:val="Heading2"/>
       </w:pPr>
       <w:r>
-        <w:t>Net formula</w:t>
-      </w:r>
-    </w:p>
-    <w:p>
-      <w:r>
-        <w:t>Mechanism: Revenue minus absolute expenses. Worked finance evidence: S$46,700 − S$16,500 = S$30,200. Review decision: Net must equal SUM eligible amounts.</w:t>
+        <w:t>What goes in</w:t>
+      </w:r>
+    </w:p>
+    <w:p>
+      <w:pPr>
+        <w:pStyle w:val="ListBullet"/>
+      </w:pPr>
+      <w:r>
+        <w:t>Receivables</w:t>
+      </w:r>
+    </w:p>
+    <w:p>
+      <w:pPr>
+        <w:pStyle w:val="ListBullet"/>
+      </w:pPr>
+      <w:r>
+        <w:t>Payments</w:t>
+      </w:r>
+    </w:p>
+    <w:p>
+      <w:pPr>
+        <w:pStyle w:val="ListBullet"/>
+      </w:pPr>
+      <w:r>
+        <w:t>Cash assumptions</w:t>
       </w:r>
     </w:p>
     <w:p>
@@ -500,12 +2106,31 @@
         <w:pStyle w:val="Heading2"/>
       </w:pPr>
       <w:r>
-        <w:t>Count control</w:t>
-      </w:r>
-    </w:p>
-    <w:p>
-      <w:r>
-        <w:t>Mechanism: COUNTA eligible Document ID range. Worked finance evidence: 12 eligible; 14 source rows. Review decision: Count drift signals a dropped row.</w:t>
+        <w:t>What Cowork does</w:t>
+      </w:r>
+    </w:p>
+    <w:p>
+      <w:pPr>
+        <w:pStyle w:val="ListNumber"/>
+      </w:pPr>
+      <w:r>
+        <w:t>Merge dates</w:t>
+      </w:r>
+    </w:p>
+    <w:p>
+      <w:pPr>
+        <w:pStyle w:val="ListNumber"/>
+      </w:pPr>
+      <w:r>
+        <w:t>Calculate balance</w:t>
+      </w:r>
+    </w:p>
+    <w:p>
+      <w:pPr>
+        <w:pStyle w:val="ListNumber"/>
+      </w:pPr>
+      <w:r>
+        <w:t>Draft alert</w:t>
       </w:r>
     </w:p>
     <w:p>
@@ -513,12 +2138,31 @@
         <w:pStyle w:val="Heading2"/>
       </w:pPr>
       <w:r>
-        <w:t>Status control</w:t>
-      </w:r>
-    </w:p>
-    <w:p>
-      <w:r>
-        <w:t>Mechanism: Only exact Approved values qualify. Worked finance evidence: Pending INV-013 excluded. Review decision: Whitespace or case variants require review.</w:t>
+        <w:t>Skills and tools</w:t>
+      </w:r>
+    </w:p>
+    <w:p>
+      <w:pPr>
+        <w:pStyle w:val="ListBullet"/>
+      </w:pPr>
+      <w:r>
+        <w:t>Cowork files</w:t>
+      </w:r>
+    </w:p>
+    <w:p>
+      <w:pPr>
+        <w:pStyle w:val="ListBullet"/>
+      </w:pPr>
+      <w:r>
+        <w:t>Spreadsheet skill</w:t>
+      </w:r>
+    </w:p>
+    <w:p>
+      <w:pPr>
+        <w:pStyle w:val="ListBullet"/>
+      </w:pPr>
+      <w:r>
+        <w:t>Outlook draft</w:t>
       </w:r>
     </w:p>
     <w:p>
@@ -526,12 +2170,12 @@
         <w:pStyle w:val="Heading2"/>
       </w:pPr>
       <w:r>
-        <w:t>ID control</w:t>
-      </w:r>
-    </w:p>
-    <w:p>
-      <w:r>
-        <w:t>Mechanism: Unique ID within month, not across all time. Worked finance evidence: Duplicate BILL-012 adds no expense. Review decision: A second month may reuse an ID.</w:t>
+        <w:t>Human check</w:t>
+      </w:r>
+    </w:p>
+    <w:p>
+      <w:r>
+        <w:t>Low-balance day and top payments match the workbook</w:t>
       </w:r>
     </w:p>
     <w:p>
@@ -539,12 +2183,199 @@
         <w:pStyle w:val="Heading2"/>
       </w:pPr>
       <w:r>
-        <w:t>Formula audit</w:t>
-      </w:r>
-    </w:p>
-    <w:p>
-      <w:r>
-        <w:t>Mechanism: Inspect formulas, cached values and ranges. Worked finance evidence: Summary points to Eligible, not Raw. Review decision: Hard-coded totals fail repeatability.</w:t>
+        <w:t>Lab 07 — step-by-step</w:t>
+      </w:r>
+    </w:p>
+    <w:p>
+      <w:r>
+        <w:t>C1382 · Topic 3 · 45 minutes</w:t>
+      </w:r>
+    </w:p>
+    <w:p>
+      <w:pPr>
+        <w:pStyle w:val="Heading3"/>
+      </w:pPr>
+      <w:r>
+        <w:t>Goal</w:t>
+      </w:r>
+    </w:p>
+    <w:p>
+      <w:r>
+        <w:t>Combine receivables and payment schedules into a two-week cash watchlist and draft an email.</w:t>
+      </w:r>
+    </w:p>
+    <w:p>
+      <w:pPr>
+        <w:pStyle w:val="Heading3"/>
+      </w:pPr>
+      <w:r>
+        <w:t>What you will build</w:t>
+      </w:r>
+    </w:p>
+    <w:p>
+      <w:r>
+        <w:t>A cashflow-watchlist.xlsx and a ready-for-review Outlook email draft.</w:t>
+      </w:r>
+    </w:p>
+    <w:p>
+      <w:pPr>
+        <w:pStyle w:val="Heading3"/>
+      </w:pPr>
+      <w:r>
+        <w:t>Prerequisites</w:t>
+      </w:r>
+    </w:p>
+    <w:p>
+      <w:r>
+        <w:t>Open this lab folder as the Cowork project context. Read TOOLS.md, enable the named skill in skill/cashflow-watchlist/SKILL.md, and use only the fictional files in mock-data/.</w:t>
+      </w:r>
+    </w:p>
+    <w:p>
+      <w:pPr>
+        <w:pStyle w:val="Heading3"/>
+      </w:pPr>
+      <w:r>
+        <w:t>Steps</w:t>
+      </w:r>
+    </w:p>
+    <w:p>
+      <w:pPr>
+        <w:pStyle w:val="ListNumber"/>
+      </w:pPr>
+      <w:r>
+        <w:t>Open `TOOLS.md` and confirm the available tools and access boundary.</w:t>
+      </w:r>
+    </w:p>
+    <w:p>
+      <w:pPr>
+        <w:pStyle w:val="ListNumber"/>
+      </w:pPr>
+      <w:r>
+        <w:t>Review the files in `mock-data/`; copy any file you will change into `working/`.</w:t>
+      </w:r>
+    </w:p>
+    <w:p>
+      <w:pPr>
+        <w:pStyle w:val="ListNumber"/>
+      </w:pPr>
+      <w:r>
+        <w:t>Add or enable `skill/cashflow-watchlist/SKILL.md` in the Cowork project.</w:t>
+      </w:r>
+    </w:p>
+    <w:p>
+      <w:pPr>
+        <w:pStyle w:val="ListNumber"/>
+      </w:pPr>
+      <w:r>
+        <w:t>Open `prompts/prompt-07.txt`, paste the prompt into Cowork and review its proposed plan.</w:t>
+      </w:r>
+    </w:p>
+    <w:p>
+      <w:pPr>
+        <w:pStyle w:val="ListNumber"/>
+      </w:pPr>
+      <w:r>
+        <w:t>Allow only the reads and writes needed for this lab. Keep consequential actions paused.</w:t>
+      </w:r>
+    </w:p>
+    <w:p>
+      <w:pPr>
+        <w:pStyle w:val="ListNumber"/>
+      </w:pPr>
+      <w:r>
+        <w:t>Open the generated files and compare them with `CHECKLIST.md`. Correct any mismatch in the output, then repeat the check.</w:t>
+      </w:r>
+    </w:p>
+    <w:p>
+      <w:pPr>
+        <w:pStyle w:val="ListNumber"/>
+      </w:pPr>
+      <w:r>
+        <w:t>Save the finished artifacts in `outputs/` and record the evidence used.</w:t>
+      </w:r>
+    </w:p>
+    <w:p>
+      <w:pPr>
+        <w:pStyle w:val="Heading3"/>
+      </w:pPr>
+      <w:r>
+        <w:t>Test it</w:t>
+      </w:r>
+    </w:p>
+    <w:p>
+      <w:r>
+        <w:t>The running-balance formula works, the lowest-balance day is flagged, and the email remains a draft with figures matching the workbook.</w:t>
+      </w:r>
+    </w:p>
+    <w:p>
+      <w:pPr>
+        <w:pStyle w:val="Heading3"/>
+      </w:pPr>
+      <w:r>
+        <w:t>Troubleshooting</w:t>
+      </w:r>
+    </w:p>
+    <w:p>
+      <w:pPr>
+        <w:pStyle w:val="ListBullet"/>
+      </w:pPr>
+      <w:r>
+        <w:t>**Cowork selects the wrong file:** name the expected date format and require it to list candidates before choosing.</w:t>
+      </w:r>
+    </w:p>
+    <w:p>
+      <w:pPr>
+        <w:pStyle w:val="ListBullet"/>
+      </w:pPr>
+      <w:r>
+        <w:t>**A workbook does not refresh:** open it in Excel, recalculate, and ask Cowork to inspect formulas and chart source ranges.</w:t>
+      </w:r>
+    </w:p>
+    <w:p>
+      <w:pPr>
+        <w:pStyle w:val="ListBullet"/>
+      </w:pPr>
+      <w:r>
+        <w:t>**A claim has no source:** remove it or add a direct file, cell or URL reference.</w:t>
+      </w:r>
+    </w:p>
+    <w:p>
+      <w:pPr>
+        <w:pStyle w:val="Heading3"/>
+      </w:pPr>
+      <w:r>
+        <w:t>Challenge</w:t>
+      </w:r>
+    </w:p>
+    <w:p>
+      <w:r>
+        <w:t>Change the reporting period or audience and rerun the task without changing the skill's stable rules.</w:t>
+      </w:r>
+    </w:p>
+    <w:p>
+      <w:pPr>
+        <w:pStyle w:val="Heading3"/>
+      </w:pPr>
+      <w:r>
+        <w:t>Reflection</w:t>
+      </w:r>
+    </w:p>
+    <w:p>
+      <w:r>
+        <w:t>Which part of this task should always remain a human review point?</w:t>
+      </w:r>
+    </w:p>
+    <w:p>
+      <w:pPr>
+        <w:pStyle w:val="Heading1"/>
+      </w:pPr>
+      <w:r>
+        <w:t>Use Case 08 — Schedule a Weekly Finance Briefing</w:t>
+      </w:r>
+    </w:p>
+    <w:p>
+      <w:r>
+        <w:t>Scenario: The same briefing is rebuilt every Monday. Ask Cowork to rehearse a scheduled task using only an approved workbook. The result is a controlled weekly routine ready for approval.</w:t>
       </w:r>
     </w:p>
     <w:p>
@@ -552,12 +2383,31 @@
         <w:pStyle w:val="Heading2"/>
       </w:pPr>
       <w:r>
-        <w:t>Workbook chart</w:t>
-      </w:r>
-    </w:p>
-    <w:p>
-      <w:r>
-        <w:t>Mechanism: Revenue / expense / net as editable columns. Worked finance evidence: 46.7k / 16.5k / 30.2k SGD. Review decision: Chart labels must name unit and period.</w:t>
+        <w:t>What goes in</w:t>
+      </w:r>
+    </w:p>
+    <w:p>
+      <w:pPr>
+        <w:pStyle w:val="ListBullet"/>
+      </w:pPr>
+      <w:r>
+        <w:t>Approved workbook</w:t>
+      </w:r>
+    </w:p>
+    <w:p>
+      <w:pPr>
+        <w:pStyle w:val="ListBullet"/>
+      </w:pPr>
+      <w:r>
+        <w:t>Release checklist</w:t>
+      </w:r>
+    </w:p>
+    <w:p>
+      <w:pPr>
+        <w:pStyle w:val="ListBullet"/>
+      </w:pPr>
+      <w:r>
+        <w:t>Test recipient</w:t>
       </w:r>
     </w:p>
     <w:p>
@@ -565,12 +2415,263 @@
         <w:pStyle w:val="Heading2"/>
       </w:pPr>
       <w:r>
-        <w:t>Release check</w:t>
-      </w:r>
-    </w:p>
-    <w:p>
-      <w:r>
-        <w:t>Mechanism: Control totals + exceptions + protected source. Worked finance evidence: All 5 expected controls match. Review decision: Do not email a mismatched workbook.</w:t>
+        <w:t>What Cowork does</w:t>
+      </w:r>
+    </w:p>
+    <w:p>
+      <w:pPr>
+        <w:pStyle w:val="ListNumber"/>
+      </w:pPr>
+      <w:r>
+        <w:t>Run on demand</w:t>
+      </w:r>
+    </w:p>
+    <w:p>
+      <w:pPr>
+        <w:pStyle w:val="ListNumber"/>
+      </w:pPr>
+      <w:r>
+        <w:t>Check approval</w:t>
+      </w:r>
+    </w:p>
+    <w:p>
+      <w:pPr>
+        <w:pStyle w:val="ListNumber"/>
+      </w:pPr>
+      <w:r>
+        <w:t>Prepare delivery flow</w:t>
+      </w:r>
+    </w:p>
+    <w:p>
+      <w:pPr>
+        <w:pStyle w:val="Heading2"/>
+      </w:pPr>
+      <w:r>
+        <w:t>Skills and tools</w:t>
+      </w:r>
+    </w:p>
+    <w:p>
+      <w:pPr>
+        <w:pStyle w:val="ListBullet"/>
+      </w:pPr>
+      <w:r>
+        <w:t>Scheduled tasks</w:t>
+      </w:r>
+    </w:p>
+    <w:p>
+      <w:pPr>
+        <w:pStyle w:val="ListBullet"/>
+      </w:pPr>
+      <w:r>
+        <w:t>OneDrive</w:t>
+      </w:r>
+    </w:p>
+    <w:p>
+      <w:pPr>
+        <w:pStyle w:val="ListBullet"/>
+      </w:pPr>
+      <w:r>
+        <w:t>Outlook + Power Automate</w:t>
+      </w:r>
+    </w:p>
+    <w:p>
+      <w:pPr>
+        <w:pStyle w:val="Heading2"/>
+      </w:pPr>
+      <w:r>
+        <w:t>Human check</w:t>
+      </w:r>
+    </w:p>
+    <w:p>
+      <w:r>
+        <w:t>Draft stays on demand; unapproved workbook is rejected</w:t>
+      </w:r>
+    </w:p>
+    <w:p>
+      <w:pPr>
+        <w:pStyle w:val="Heading2"/>
+      </w:pPr>
+      <w:r>
+        <w:t>Lab 08 — step-by-step</w:t>
+      </w:r>
+    </w:p>
+    <w:p>
+      <w:r>
+        <w:t>C1382 · Topic 3 · 45 minutes</w:t>
+      </w:r>
+    </w:p>
+    <w:p>
+      <w:pPr>
+        <w:pStyle w:val="Heading3"/>
+      </w:pPr>
+      <w:r>
+        <w:t>Goal</w:t>
+      </w:r>
+    </w:p>
+    <w:p>
+      <w:r>
+        <w:t>Package a reviewed weekly workbook and configure an on-demand rehearsal for scheduled delivery.</w:t>
+      </w:r>
+    </w:p>
+    <w:p>
+      <w:pPr>
+        <w:pStyle w:val="Heading3"/>
+      </w:pPr>
+      <w:r>
+        <w:t>What you will build</w:t>
+      </w:r>
+    </w:p>
+    <w:p>
+      <w:r>
+        <w:t>A scheduled-task prompt, release checklist and Power Automate attachment-flow specification.</w:t>
+      </w:r>
+    </w:p>
+    <w:p>
+      <w:pPr>
+        <w:pStyle w:val="Heading3"/>
+      </w:pPr>
+      <w:r>
+        <w:t>Prerequisites</w:t>
+      </w:r>
+    </w:p>
+    <w:p>
+      <w:r>
+        <w:t>Open this lab folder as the Cowork project context. Read TOOLS.md, enable the named skill in skill/scheduled-finance-briefing/SKILL.md, and use only the fictional files in mock-data/.</w:t>
+      </w:r>
+    </w:p>
+    <w:p>
+      <w:pPr>
+        <w:pStyle w:val="Heading3"/>
+      </w:pPr>
+      <w:r>
+        <w:t>Steps</w:t>
+      </w:r>
+    </w:p>
+    <w:p>
+      <w:pPr>
+        <w:pStyle w:val="ListNumber"/>
+      </w:pPr>
+      <w:r>
+        <w:t>Open `TOOLS.md` and confirm the available tools and access boundary.</w:t>
+      </w:r>
+    </w:p>
+    <w:p>
+      <w:pPr>
+        <w:pStyle w:val="ListNumber"/>
+      </w:pPr>
+      <w:r>
+        <w:t>Review the files in `mock-data/`; copy any file you will change into `working/`.</w:t>
+      </w:r>
+    </w:p>
+    <w:p>
+      <w:pPr>
+        <w:pStyle w:val="ListNumber"/>
+      </w:pPr>
+      <w:r>
+        <w:t>Add or enable `skill/scheduled-finance-briefing/SKILL.md` in the Cowork project.</w:t>
+      </w:r>
+    </w:p>
+    <w:p>
+      <w:pPr>
+        <w:pStyle w:val="ListNumber"/>
+      </w:pPr>
+      <w:r>
+        <w:t>Open `prompts/prompt-08.txt`, paste the prompt into Cowork and review its proposed plan.</w:t>
+      </w:r>
+    </w:p>
+    <w:p>
+      <w:pPr>
+        <w:pStyle w:val="ListNumber"/>
+      </w:pPr>
+      <w:r>
+        <w:t>Allow only the reads and writes needed for this lab. Keep consequential actions paused.</w:t>
+      </w:r>
+    </w:p>
+    <w:p>
+      <w:pPr>
+        <w:pStyle w:val="ListNumber"/>
+      </w:pPr>
+      <w:r>
+        <w:t>Open the generated files and compare them with `CHECKLIST.md`. Correct any mismatch in the output, then repeat the check.</w:t>
+      </w:r>
+    </w:p>
+    <w:p>
+      <w:pPr>
+        <w:pStyle w:val="ListNumber"/>
+      </w:pPr>
+      <w:r>
+        <w:t>Save the finished artifacts in `outputs/` and record the evidence used.</w:t>
+      </w:r>
+    </w:p>
+    <w:p>
+      <w:pPr>
+        <w:pStyle w:val="Heading3"/>
+      </w:pPr>
+      <w:r>
+        <w:t>Test it</w:t>
+      </w:r>
+    </w:p>
+    <w:p>
+      <w:r>
+        <w:t>The on-demand rehearsal finds one approved workbook, the checklist blocks unapproved files, and the flow specification maps filename and ContentBytes correctly without sending.</w:t>
+      </w:r>
+    </w:p>
+    <w:p>
+      <w:pPr>
+        <w:pStyle w:val="Heading3"/>
+      </w:pPr>
+      <w:r>
+        <w:t>Troubleshooting</w:t>
+      </w:r>
+    </w:p>
+    <w:p>
+      <w:pPr>
+        <w:pStyle w:val="ListBullet"/>
+      </w:pPr>
+      <w:r>
+        <w:t>**Cowork selects the wrong file:** name the expected date format and require it to list candidates before choosing.</w:t>
+      </w:r>
+    </w:p>
+    <w:p>
+      <w:pPr>
+        <w:pStyle w:val="ListBullet"/>
+      </w:pPr>
+      <w:r>
+        <w:t>**A workbook does not refresh:** open it in Excel, recalculate, and ask Cowork to inspect formulas and chart source ranges.</w:t>
+      </w:r>
+    </w:p>
+    <w:p>
+      <w:pPr>
+        <w:pStyle w:val="ListBullet"/>
+      </w:pPr>
+      <w:r>
+        <w:t>**A claim has no source:** remove it or add a direct file, cell or URL reference.</w:t>
+      </w:r>
+    </w:p>
+    <w:p>
+      <w:pPr>
+        <w:pStyle w:val="Heading3"/>
+      </w:pPr>
+      <w:r>
+        <w:t>Challenge</w:t>
+      </w:r>
+    </w:p>
+    <w:p>
+      <w:r>
+        <w:t>Change the reporting period or audience and rerun the task without changing the skill's stable rules.</w:t>
+      </w:r>
+    </w:p>
+    <w:p>
+      <w:pPr>
+        <w:pStyle w:val="Heading3"/>
+      </w:pPr>
+      <w:r>
+        <w:t>Reflection</w:t>
+      </w:r>
+    </w:p>
+    <w:p>
+      <w:r>
+        <w:t>Which part of this task should always remain a human review point?</w:t>
       </w:r>
     </w:p>
     <w:p>
@@ -578,163 +2679,17 @@
         <w:pStyle w:val="Heading1"/>
       </w:pPr>
       <w:r>
-        <w:t>Topic 03 — Schedule and deliver via Outlook</w:t>
-      </w:r>
-    </w:p>
-    <w:p>
-      <w:pPr>
-        <w:pStyle w:val="Heading2"/>
-      </w:pPr>
-      <w:r>
-        <w:t>New-period parameter</w:t>
-      </w:r>
-    </w:p>
-    <w:p>
-      <w:r>
-        <w:t>Mechanism: Switch input period to September 2026. Worked finance evidence: finance-sep-2026.xlsx is independent input. Review decision: Never reuse August output as September.</w:t>
-      </w:r>
-    </w:p>
-    <w:p>
-      <w:pPr>
-        <w:pStyle w:val="Heading2"/>
-      </w:pPr>
-      <w:r>
-        <w:t>September control</w:t>
-      </w:r>
-    </w:p>
-    <w:p>
-      <w:r>
-        <w:t>Mechanism: Same rules on new transactions. Worked finance evidence: Revenue 48,100; expense 16,960; net 31,140. Review decision: Variance alone is not proof.</w:t>
-      </w:r>
-    </w:p>
-    <w:p>
-      <w:pPr>
-        <w:pStyle w:val="Heading2"/>
-      </w:pPr>
-      <w:r>
-        <w:t>Project schedule</w:t>
-      </w:r>
-    </w:p>
-    <w:p>
-      <w:r>
-        <w:t>Mechanism: Weekly Monday 09:00 Singapore; new month input gate. Worked finance evidence: Task prompt names input and output cloud folders. Review decision: A local-folder schedule requires desktop.</w:t>
-      </w:r>
-    </w:p>
-    <w:p>
-      <w:pPr>
-        <w:pStyle w:val="Heading2"/>
-      </w:pPr>
-      <w:r>
-        <w:t>Cloud path</w:t>
-      </w:r>
-    </w:p>
-    <w:p>
-      <w:r>
-        <w:t>Mechanism: OneDrive/SharePoint connector provides source. Worked finance evidence: Approved Reports separate from working folder. Review decision: Cloud job cannot depend on a local-only path.</w:t>
-      </w:r>
-    </w:p>
-    <w:p>
-      <w:pPr>
-        <w:pStyle w:val="Heading2"/>
-      </w:pPr>
-      <w:r>
-        <w:t>On-demand rehearsal</w:t>
-      </w:r>
-    </w:p>
-    <w:p>
-      <w:r>
-        <w:t>Mechanism: Run schedule once manually first. Worked finance evidence: One workbook, one release manifest. Review decision: Repeated run must not duplicate emails.</w:t>
-      </w:r>
-    </w:p>
-    <w:p>
-      <w:pPr>
-        <w:pStyle w:val="Heading2"/>
-      </w:pPr>
-      <w:r>
-        <w:t>Review manifest</w:t>
-      </w:r>
-    </w:p>
-    <w:p>
-      <w:r>
-        <w:t>Mechanism: Period + totals + exceptions + reviewer. Worked finance evidence: 12 eligible and 2 excluded in September. Review decision: No approval record, no delivery.</w:t>
-      </w:r>
-    </w:p>
-    <w:p>
-      <w:pPr>
-        <w:pStyle w:val="Heading2"/>
-      </w:pPr>
-      <w:r>
-        <w:t>Outlook connector</w:t>
-      </w:r>
-    </w:p>
-    <w:p>
-      <w:r>
-        <w:t>Mechanism: Microsoft 365 write permission can send email. Worked finance evidence: Native email includes link, not attachment. Review decision: Attachment requirement needs another route.</w:t>
-      </w:r>
-    </w:p>
-    <w:p>
-      <w:pPr>
-        <w:pStyle w:val="Heading2"/>
-      </w:pPr>
-      <w:r>
-        <w:t>Attachment flow</w:t>
-      </w:r>
-    </w:p>
-    <w:p>
-      <w:r>
-        <w:t>Mechanism: OneDrive file-created → content → Outlook V2. Worked finance evidence: Approved Reports/finance-report-sep-2026.xlsx. Review decision: Never trigger on working files.</w:t>
-      </w:r>
-    </w:p>
-    <w:p>
-      <w:pPr>
-        <w:pStyle w:val="Heading2"/>
-      </w:pPr>
-      <w:r>
-        <w:t>Flow condition</w:t>
-      </w:r>
-    </w:p>
-    <w:p>
-      <w:r>
-        <w:t>Mechanism: Filename prefix and .xlsx suffix. Worked finance evidence: finance-report-...xlsx only. Review decision: Other files must cause zero sends.</w:t>
-      </w:r>
-    </w:p>
-    <w:p>
-      <w:pPr>
-        <w:pStyle w:val="Heading2"/>
-      </w:pPr>
-      <w:r>
-        <w:t>Attachment bytes</w:t>
-      </w:r>
-    </w:p>
-    <w:p>
-      <w:r>
-        <w:t>Mechanism: Get file content feeds ContentBytes. Worked finance evidence: Name equals approved workbook filename. Review decision: Check received attachment opens.</w:t>
-      </w:r>
-    </w:p>
-    <w:p>
-      <w:pPr>
-        <w:pStyle w:val="Heading2"/>
-      </w:pPr>
-      <w:r>
-        <w:t>Idempotency</w:t>
-      </w:r>
-    </w:p>
-    <w:p>
-      <w:r>
-        <w:t>Mechanism: Unique period filename + no overwrite in trigger. Worked finance evidence: One created file → one flow run → one Sent Item. Review decision: Duplicate send requires stop and investigation.</w:t>
-      </w:r>
-    </w:p>
-    <w:p>
-      <w:pPr>
-        <w:pStyle w:val="Heading2"/>
-      </w:pPr>
-      <w:r>
-        <w:t>Delivery audit</w:t>
-      </w:r>
-    </w:p>
-    <w:p>
-      <w:r>
-        <w:t>Mechanism: Sent Items + received file + flow history. Worked finance evidence: Subject, recipient, workbook version align. Review decision: A successful Cowork message alone is insufficient.</w:t>
+        <w:t>Scheduling and connected tools</w:t>
+      </w:r>
+    </w:p>
+    <w:p>
+      <w:r>
+        <w:t>Cowork scheduled tasks can use connected tools and cloud files. A schedule that needs local files or desktop applications runs locally. Start every scheduled workflow as an on-demand rehearsal. Keep the lab schedule disabled after the exercise.</w:t>
+      </w:r>
+    </w:p>
+    <w:p>
+      <w:r>
+        <w:t>The Microsoft 365 connector can work with Outlook when organisation write tools are enabled. For an actual file attachment, the lab documents a Power Automate flow: OneDrive Approved Reports trigger, Get file content, then Outlook Send an email (V2) with Name and ContentBytes. Use a test mailbox and do not send during the lab.</w:t>
       </w:r>
     </w:p>
     <w:p>
@@ -742,585 +2697,32 @@
         <w:pStyle w:val="Heading1"/>
       </w:pPr>
       <w:r>
-        <w:t>Lab 1 — lab-01-finance-cowork-project</w:t>
-      </w:r>
-    </w:p>
-    <w:p>
-      <w:r>
-        <w:t>C1382 · Topic 1 · 55 minutes</w:t>
-      </w:r>
-    </w:p>
-    <w:p>
-      <w:pPr>
-        <w:pStyle w:val="Heading2"/>
-      </w:pPr>
-      <w:r>
-        <w:t>Goal</w:t>
-      </w:r>
-    </w:p>
-    <w:p>
-      <w:r>
-        <w:t>Create a scoped Cowork project and a source inventory.</w:t>
-      </w:r>
-    </w:p>
-    <w:p>
-      <w:pPr>
-        <w:pStyle w:val="Heading2"/>
-      </w:pPr>
-      <w:r>
-        <w:t>What you will build</w:t>
-      </w:r>
-    </w:p>
-    <w:p>
-      <w:r>
-        <w:t>A bounded finance Cowork workflow and its review evidence. All data is fictional.</w:t>
-      </w:r>
-    </w:p>
-    <w:p>
-      <w:pPr>
-        <w:pStyle w:val="Heading2"/>
-      </w:pPr>
-      <w:r>
-        <w:t>Prerequisites</w:t>
-      </w:r>
-    </w:p>
-    <w:p>
-      <w:r>
-        <w:t>Claude Cowork on a paid plan; Excel or an Excel-compatible viewer; for Lab 3, a work Microsoft 365 account with enabled connector and Power Automate. Earlier labs provide context, but this folder includes its own workbook and instructions.</w:t>
-      </w:r>
-    </w:p>
-    <w:p>
-      <w:pPr>
-        <w:pStyle w:val="Heading2"/>
-      </w:pPr>
-      <w:r>
-        <w:t>Steps</w:t>
-      </w:r>
-    </w:p>
-    <w:p>
-      <w:pPr>
-        <w:pStyle w:val="ListNumber"/>
-      </w:pPr>
-      <w:r>
-        <w:t>1. Open Cowork in Claude Desktop and create a project named Finance Month-End Lab. Select only this lab folder as its local context. If Projects is unavailable, use a Cowork session connected only to this folder and put the same rules in folder instructions.</w:t>
-      </w:r>
-    </w:p>
-    <w:p>
-      <w:pPr>
-        <w:pStyle w:val="ListNumber"/>
-      </w:pPr>
-      <w:r>
-        <w:t>2. Copy `mock-data/finance-aug-2026.xlsx` to `working/finance-aug-2026.xlsx`. Keep `mock-data/` unchanged.</w:t>
-      </w:r>
-    </w:p>
-    <w:p>
-      <w:pPr>
-        <w:pStyle w:val="ListNumber"/>
-      </w:pPr>
-      <w:r>
-        <w:t>3. Add the supplied `skill/finance-control/SKILL.md` as project instructions or an enabled custom skill. Read its stop conditions aloud.</w:t>
-      </w:r>
-    </w:p>
-    <w:p>
-      <w:pPr>
-        <w:pStyle w:val="ListNumber"/>
-      </w:pPr>
-      <w:r>
-        <w:t>4. Paste `prompts/01-project-and-inventory.txt` into a Cowork task. Approve read access only to `mock-data/` and write access only to `working/` and `outputs/`.</w:t>
-      </w:r>
-    </w:p>
-    <w:p>
-      <w:pPr>
-        <w:pStyle w:val="ListNumber"/>
-      </w:pPr>
-      <w:r>
-        <w:t>5. Inspect Claude's file manifest. It must identify 14 data rows plus the header and call out one repeated `BILL-012` and one Pending `INV-013`.</w:t>
-      </w:r>
-    </w:p>
-    <w:p>
-      <w:pPr>
-        <w:pStyle w:val="ListNumber"/>
-      </w:pPr>
-      <w:r>
-        <w:t>6. Save the manifest in `outputs/source-inventory.md`; compare the input workbook hash before and after the task using `shasum -a 256 mock-data/finance-aug-2026.xlsx`.</w:t>
-      </w:r>
-    </w:p>
-    <w:p>
-      <w:pPr>
-        <w:pStyle w:val="Heading2"/>
-      </w:pPr>
-      <w:r>
-        <w:t>Test it</w:t>
-      </w:r>
-    </w:p>
-    <w:p>
-      <w:r>
-        <w:t>The raw workbook hash is unchanged; inventory names all seven columns, 14 rows, one duplicate ID and one pending item.</w:t>
-      </w:r>
-    </w:p>
-    <w:p>
-      <w:pPr>
-        <w:pStyle w:val="Heading2"/>
-      </w:pPr>
-      <w:r>
-        <w:t>Troubleshooting</w:t>
-      </w:r>
-    </w:p>
-    <w:p>
-      <w:pPr>
-        <w:pStyle w:val="ListBullet"/>
-      </w:pPr>
-      <w:r>
-        <w:t>Cowork cannot access the workbook: connect only this lab folder in the desktop project, confirm file permissions, then retry read-only inventory.</w:t>
-      </w:r>
-    </w:p>
-    <w:p>
-      <w:pPr>
-        <w:pStyle w:val="ListBullet"/>
-      </w:pPr>
-      <w:r>
-        <w:t>Formula totals disagree: check duplicate-ID and approval filters, recalculate Excel formulas, then compare each eligible row with the source.</w:t>
-      </w:r>
-    </w:p>
-    <w:p>
-      <w:pPr>
-        <w:pStyle w:val="ListBullet"/>
-      </w:pPr>
-      <w:r>
-        <w:t>Outlook delivery is unavailable: verify Microsoft 365 work-account/admin write access. The native connector cannot attach files; use the approved OneDrive link or the Power Automate attachment flow. Do not claim a send occurred without Sent Items and flow history.</w:t>
-      </w:r>
-    </w:p>
-    <w:p>
-      <w:pPr>
-        <w:pStyle w:val="Heading2"/>
-      </w:pPr>
-      <w:r>
-        <w:t>Challenge</w:t>
-      </w:r>
-    </w:p>
-    <w:p>
-      <w:r>
-        <w:t>Add a second approval gate that checks the workbook file name, reviewed period and row counts before moving it to Approved Reports.</w:t>
-      </w:r>
-    </w:p>
-    <w:p>
-      <w:pPr>
-        <w:pStyle w:val="Heading2"/>
-      </w:pPr>
-      <w:r>
-        <w:t>Reflection</w:t>
-      </w:r>
-    </w:p>
-    <w:p>
-      <w:r>
-        <w:t>Which control would stop a plausible-looking but incorrect finance report from being emailed?</w:t>
-      </w:r>
-    </w:p>
-    <w:p>
-      <w:pPr>
-        <w:pStyle w:val="Heading1"/>
-      </w:pPr>
-      <w:r>
-        <w:t>Lab 2 — lab-02-automate-finance-excel</w:t>
-      </w:r>
-    </w:p>
-    <w:p>
-      <w:r>
-        <w:t>C1382 · Topic 2 · 120 minutes</w:t>
-      </w:r>
-    </w:p>
-    <w:p>
-      <w:pPr>
-        <w:pStyle w:val="Heading2"/>
-      </w:pPr>
-      <w:r>
-        <w:t>Goal</w:t>
-      </w:r>
-    </w:p>
-    <w:p>
-      <w:r>
-        <w:t>Produce a formula-driven August finance report from mock transactions.</w:t>
-      </w:r>
-    </w:p>
-    <w:p>
-      <w:pPr>
-        <w:pStyle w:val="Heading2"/>
-      </w:pPr>
-      <w:r>
-        <w:t>What you will build</w:t>
-      </w:r>
-    </w:p>
-    <w:p>
-      <w:r>
-        <w:t>A bounded finance Cowork workflow and its review evidence. All data is fictional.</w:t>
-      </w:r>
-    </w:p>
-    <w:p>
-      <w:pPr>
-        <w:pStyle w:val="Heading2"/>
-      </w:pPr>
-      <w:r>
-        <w:t>Prerequisites</w:t>
-      </w:r>
-    </w:p>
-    <w:p>
-      <w:r>
-        <w:t>Claude Cowork on a paid plan; Excel or an Excel-compatible viewer; for Lab 3, a work Microsoft 365 account with enabled connector and Power Automate. Earlier labs provide context, but this folder includes its own workbook and instructions.</w:t>
-      </w:r>
-    </w:p>
-    <w:p>
-      <w:pPr>
-        <w:pStyle w:val="Heading2"/>
-      </w:pPr>
-      <w:r>
-        <w:t>Steps</w:t>
-      </w:r>
-    </w:p>
-    <w:p>
-      <w:pPr>
-        <w:pStyle w:val="ListNumber"/>
-      </w:pPr>
-      <w:r>
-        <w:t>1. Copy the Lab 1 workbook into this lab's `working/` folder and record the source file name, period and row count in `outputs/reconciliation.md`.</w:t>
-      </w:r>
-    </w:p>
-    <w:p>
-      <w:pPr>
-        <w:pStyle w:val="ListNumber"/>
-      </w:pPr>
-      <w:r>
-        <w:t>2. Open `mock-data/finance-aug-2026.xlsx` in Excel and inspect rows 2–15. Do not delete the duplicate or Pending row in the source.</w:t>
-      </w:r>
-    </w:p>
-    <w:p>
-      <w:pPr>
-        <w:pStyle w:val="ListNumber"/>
-      </w:pPr>
-      <w:r>
-        <w:t>3. Paste `prompts/02-build-reconciled-workbook.txt` into the same Cowork project. Require `outputs/finance-report-aug-2026.xlsx` with `Raw`, `Eligible`, `Summary`, and `Exceptions` sheets.</w:t>
-      </w:r>
-    </w:p>
-    <w:p>
-      <w:pPr>
-        <w:pStyle w:val="ListNumber"/>
-      </w:pPr>
-      <w:r>
-        <w:t>4. Ask Claude to copy raw rows verbatim. In `Eligible`, include Approved rows with unique Document IDs only. In `Exceptions`, show duplicate `BILL-012` and Pending `INV-013` with reasons. In `Summary`, calculate revenue, expenses, net, count and source count using Excel formulas.</w:t>
-      </w:r>
-    </w:p>
-    <w:p>
-      <w:pPr>
-        <w:pStyle w:val="ListNumber"/>
-      </w:pPr>
-      <w:r>
-        <w:t>5. Before accepting the workbook, independently total the six approved revenue lines and six approved expense lines from the source. Compare with `checks/control-totals.csv`. Open workbook in Excel and recalculate formulas.</w:t>
-      </w:r>
-    </w:p>
-    <w:p>
-      <w:pPr>
-        <w:pStyle w:val="ListNumber"/>
-      </w:pPr>
-      <w:r>
-        <w:t>6. Enter discrepancies in `outputs/reconciliation.md` and ask Cowork to fix only the defective cell or rule. Recheck all totals and the two exception rows.</w:t>
-      </w:r>
-    </w:p>
-    <w:p>
-      <w:pPr>
-        <w:pStyle w:val="ListNumber"/>
-      </w:pPr>
-      <w:r>
-        <w:t>7. Export no client data. Keep only the fictional output in `outputs/`.</w:t>
-      </w:r>
-    </w:p>
-    <w:p>
-      <w:pPr>
-        <w:pStyle w:val="Heading2"/>
-      </w:pPr>
-      <w:r>
-        <w:t>Test it</w:t>
-      </w:r>
-    </w:p>
-    <w:p>
-      <w:r>
-        <w:t>Approved revenue S$46,700; approved expense S$16,500; net S$30,200; 12 eligible rows; two excluded rows. The workbook has formulas and the source is unchanged.</w:t>
-      </w:r>
-    </w:p>
-    <w:p>
-      <w:pPr>
-        <w:pStyle w:val="Heading2"/>
-      </w:pPr>
-      <w:r>
-        <w:t>Troubleshooting</w:t>
-      </w:r>
-    </w:p>
-    <w:p>
-      <w:pPr>
-        <w:pStyle w:val="ListBullet"/>
-      </w:pPr>
-      <w:r>
-        <w:t>Cowork cannot access the workbook: connect only this lab folder in the desktop project, confirm file permissions, then retry read-only inventory.</w:t>
-      </w:r>
-    </w:p>
-    <w:p>
-      <w:pPr>
-        <w:pStyle w:val="ListBullet"/>
-      </w:pPr>
-      <w:r>
-        <w:t>Formula totals disagree: check duplicate-ID and approval filters, recalculate Excel formulas, then compare each eligible row with the source.</w:t>
-      </w:r>
-    </w:p>
-    <w:p>
-      <w:pPr>
-        <w:pStyle w:val="ListBullet"/>
-      </w:pPr>
-      <w:r>
-        <w:t>Outlook delivery is unavailable: verify Microsoft 365 work-account/admin write access. The native connector cannot attach files; use the approved OneDrive link or the Power Automate attachment flow. Do not claim a send occurred without Sent Items and flow history.</w:t>
-      </w:r>
-    </w:p>
-    <w:p>
-      <w:pPr>
-        <w:pStyle w:val="Heading2"/>
-      </w:pPr>
-      <w:r>
-        <w:t>Challenge</w:t>
-      </w:r>
-    </w:p>
-    <w:p>
-      <w:r>
-        <w:t>Add a second approval gate that checks the workbook file name, reviewed period and row counts before moving it to Approved Reports.</w:t>
-      </w:r>
-    </w:p>
-    <w:p>
-      <w:pPr>
-        <w:pStyle w:val="Heading2"/>
-      </w:pPr>
-      <w:r>
-        <w:t>Reflection</w:t>
-      </w:r>
-    </w:p>
-    <w:p>
-      <w:r>
-        <w:t>Which control would stop a plausible-looking but incorrect finance report from being emailed?</w:t>
-      </w:r>
-    </w:p>
-    <w:p>
-      <w:pPr>
-        <w:pStyle w:val="Heading1"/>
-      </w:pPr>
-      <w:r>
-        <w:t>Lab 3 — lab-03-schedule-and-outlook-delivery</w:t>
-      </w:r>
-    </w:p>
-    <w:p>
-      <w:r>
-        <w:t>C1382 · Topic 3 · 85 minutes</w:t>
-      </w:r>
-    </w:p>
-    <w:p>
-      <w:pPr>
-        <w:pStyle w:val="Heading2"/>
-      </w:pPr>
-      <w:r>
-        <w:t>Goal</w:t>
-      </w:r>
-    </w:p>
-    <w:p>
-      <w:r>
-        <w:t>Create a repeatable September run and controlled Outlook attachment flow.</w:t>
-      </w:r>
-    </w:p>
-    <w:p>
-      <w:pPr>
-        <w:pStyle w:val="Heading2"/>
-      </w:pPr>
-      <w:r>
-        <w:t>What you will build</w:t>
-      </w:r>
-    </w:p>
-    <w:p>
-      <w:r>
-        <w:t>A bounded finance Cowork workflow and its review evidence. All data is fictional.</w:t>
-      </w:r>
-    </w:p>
-    <w:p>
-      <w:pPr>
-        <w:pStyle w:val="Heading2"/>
-      </w:pPr>
-      <w:r>
-        <w:t>Prerequisites</w:t>
-      </w:r>
-    </w:p>
-    <w:p>
-      <w:r>
-        <w:t>Claude Cowork on a paid plan; Excel or an Excel-compatible viewer; for Lab 3, a work Microsoft 365 account with enabled connector and Power Automate. Earlier labs provide context, but this folder includes its own workbook and instructions.</w:t>
-      </w:r>
-    </w:p>
-    <w:p>
-      <w:pPr>
-        <w:pStyle w:val="Heading2"/>
-      </w:pPr>
-      <w:r>
-        <w:t>Steps</w:t>
-      </w:r>
-    </w:p>
-    <w:p>
-      <w:pPr>
-        <w:pStyle w:val="ListNumber"/>
-      </w:pPr>
-      <w:r>
-        <w:t>1. Use `mock-data/finance-sep-2026.xlsx` as a new-period input. Copy it to `working/` and rerun the finance skill with `prompts/03-schedule-and-deliver.txt`; save `outputs/finance-report-sep-2026.xlsx`.</w:t>
-      </w:r>
-    </w:p>
-    <w:p>
-      <w:pPr>
-        <w:pStyle w:val="ListNumber"/>
-      </w:pPr>
-      <w:r>
-        <w:t>2. Reconcile the new workbook against `checks/control-totals.csv`; record the file name, period, totals, exception count and review initials in `outputs/release-manifest.csv`.</w:t>
-      </w:r>
-    </w:p>
-    <w:p>
-      <w:pPr>
-        <w:pStyle w:val="ListNumber"/>
-      </w:pPr>
-      <w:r>
-        <w:t>3. For a cloud schedule, place the approved input and output folders in your organisation's OneDrive for Business or SharePoint and give the project exact paths. In Cowork Scheduled, create a weekly Monday task at 09:00 Asia/Singapore that acts only when a new approved month input is present. First set it to manual/on-demand and test. A schedule tied to local files or desktop apps runs locally and requires the desktop available.</w:t>
-      </w:r>
-    </w:p>
-    <w:p>
-      <w:pPr>
-        <w:pStyle w:val="ListNumber"/>
-      </w:pPr>
-      <w:r>
-        <w:t>4. Connect the Microsoft 365 connector using an authorised work account. The admin must enable email write tools. The native connector cannot attach files, so use it only to draft/send an approved link to the completed workbook if attachment delivery is unavailable.</w:t>
-      </w:r>
-    </w:p>
-    <w:p>
-      <w:pPr>
-        <w:pStyle w:val="ListNumber"/>
-      </w:pPr>
-      <w:r>
-        <w:t>5. To send the actual `.xlsx` attachment automatically, create a Power Automate cloud flow: OneDrive for Business `When a file is created` on a dedicated `Approved Reports` folder → condition filename begins `finance-report-` and ends `.xlsx` → `Get file content` → Office 365 Outlook `Send an email (V2)` to your own authorised test mailbox with the file name and file content as its attachment. The human gate is moving the reconciled final workbook into `Approved Reports`; never trigger from a working folder.</w:t>
-      </w:r>
-    </w:p>
-    <w:p>
-      <w:pPr>
-        <w:pStyle w:val="ListNumber"/>
-      </w:pPr>
-      <w:r>
-        <w:t>6. Run once with the synthetic September workbook. Open Sent Items and the received email. Verify attachment name, workbook sheets and totals. Check flow run history for exactly one send; avoid a second copy into the trigger folder.</w:t>
-      </w:r>
-    </w:p>
-    <w:p>
-      <w:pPr>
-        <w:pStyle w:val="ListNumber"/>
-      </w:pPr>
-      <w:r>
-        <w:t>7. Keep the Cowork task in manual mode after the lab unless your organisation approves the real schedule and recipient. Document the final state in `outputs/delivery-log.md`.</w:t>
-      </w:r>
-    </w:p>
-    <w:p>
-      <w:pPr>
-        <w:pStyle w:val="Heading2"/>
-      </w:pPr>
-      <w:r>
-        <w:t>Test it</w:t>
-      </w:r>
-    </w:p>
-    <w:p>
-      <w:r>
-        <w:t>September approved revenue S$48,100; approved expense S$16,960; net S$31,140. One approved workbook, one flow run and one Outlook test email with the exact .xlsx attachment.</w:t>
-      </w:r>
-    </w:p>
-    <w:p>
-      <w:pPr>
-        <w:pStyle w:val="Heading2"/>
-      </w:pPr>
-      <w:r>
-        <w:t>Troubleshooting</w:t>
-      </w:r>
-    </w:p>
-    <w:p>
-      <w:pPr>
-        <w:pStyle w:val="ListBullet"/>
-      </w:pPr>
-      <w:r>
-        <w:t>Cowork cannot access the workbook: connect only this lab folder in the desktop project, confirm file permissions, then retry read-only inventory.</w:t>
-      </w:r>
-    </w:p>
-    <w:p>
-      <w:pPr>
-        <w:pStyle w:val="ListBullet"/>
-      </w:pPr>
-      <w:r>
-        <w:t>Formula totals disagree: check duplicate-ID and approval filters, recalculate Excel formulas, then compare each eligible row with the source.</w:t>
-      </w:r>
-    </w:p>
-    <w:p>
-      <w:pPr>
-        <w:pStyle w:val="ListBullet"/>
-      </w:pPr>
-      <w:r>
-        <w:t>Outlook delivery is unavailable: verify Microsoft 365 work-account/admin write access. The native connector cannot attach files; use the approved OneDrive link or the Power Automate attachment flow. Do not claim a send occurred without Sent Items and flow history.</w:t>
-      </w:r>
-    </w:p>
-    <w:p>
-      <w:pPr>
-        <w:pStyle w:val="Heading2"/>
-      </w:pPr>
-      <w:r>
-        <w:t>Challenge</w:t>
-      </w:r>
-    </w:p>
-    <w:p>
-      <w:r>
-        <w:t>Add a second approval gate that checks the workbook file name, reviewed period and row counts before moving it to Approved Reports.</w:t>
-      </w:r>
-    </w:p>
-    <w:p>
-      <w:pPr>
-        <w:pStyle w:val="Heading2"/>
-      </w:pPr>
-      <w:r>
-        <w:t>Reflection</w:t>
-      </w:r>
-    </w:p>
-    <w:p>
-      <w:r>
-        <w:t>Which control would stop a plausible-looking but incorrect finance report from being emailed?</w:t>
-      </w:r>
-    </w:p>
-    <w:p>
-      <w:pPr>
-        <w:pStyle w:val="Heading1"/>
-      </w:pPr>
-      <w:r>
-        <w:t>Reference and product verification</w:t>
-      </w:r>
-    </w:p>
-    <w:p>
-      <w:r>
-        <w:t>Anthropic Claude Cowork Help: https://support.claude.com/en/articles/13345190-get-started-with-claude-cowork</w:t>
-      </w:r>
-    </w:p>
-    <w:p>
-      <w:r>
-        <w:t>Anthropic schedule documentation: https://support.claude.com/en/articles/13854387-schedule-recurring-tasks-in-claude-cowork</w:t>
-      </w:r>
-    </w:p>
-    <w:p>
-      <w:r>
-        <w:t>Anthropic Microsoft 365 connector: https://support.claude.com/en/articles/15183774-connect-to-microsoft-365</w:t>
-      </w:r>
-    </w:p>
-    <w:p>
-      <w:r>
-        <w:t>Microsoft OneDrive connector: https://learn.microsoft.com/en-us/connectors/onedriveforbusiness/</w:t>
-      </w:r>
-    </w:p>
-    <w:p>
-      <w:r>
-        <w:t>Microsoft Outlook Power Automate: https://learn.microsoft.com/en-us/power-automate/desktop-flows/actions-reference/office365outlook</w:t>
+        <w:t>Current references</w:t>
+      </w:r>
+    </w:p>
+    <w:p>
+      <w:r>
+        <w:t>Claude Cowork: https://support.claude.com/en/articles/13345190-get-started-with-claude-cowork</w:t>
+      </w:r>
+    </w:p>
+    <w:p>
+      <w:r>
+        <w:t>Cowork projects: https://support.claude.com/en/articles/14116274-organize-your-tasks-with-projects-in-claude-cowork</w:t>
+      </w:r>
+    </w:p>
+    <w:p>
+      <w:r>
+        <w:t>Scheduled tasks: https://support.claude.com/en/articles/13854387-schedule-recurring-tasks-in-claude-cowork</w:t>
+      </w:r>
+    </w:p>
+    <w:p>
+      <w:r>
+        <w:t>Microsoft 365 connector: https://support.claude.com/en/articles/15183774-connect-to-microsoft-365</w:t>
+      </w:r>
+    </w:p>
+    <w:p>
+      <w:r>
+        <w:t>Outlook Power Automate actions: https://learn.microsoft.com/en-us/power-automate/desktop-flows/actions-reference/office365outlook</w:t>
       </w:r>
     </w:p>
     <w:sectPr>

</xml_diff>

<commit_message>
Add the two About the Trainer slides after the learner introduction
Reuses the profile layout from the Agentic AI Applications with Claude Code
deck: dark portrait panel with initials on the left, teal-badged fact rows on
the right, terracotta social badges beneath. Slide 4 is the blank template the
delivering trainer completes; slide 5 is Dr. Alfred Ang's.

Co-Authored-By: Claude Opus 5 <noreply@anthropic.com>
</commit_message>
<xml_diff>
--- a/courseware/LG-Claude Cowork Masterclass.docx
+++ b/courseware/LG-Claude Cowork Masterclass.docx
@@ -554,7 +554,7 @@
               <w:rPr>
                 <w:sz w:val="19"/>
               </w:rPr>
-              <w:t>Added a document-processing lab as the new Lab 1 — 126 synthetic Meridian supplier invoices and expense receipts that Claude reads into a CSV and files into month folders — so the course now opens on the work Cowork is really for. Seven labs in total. Topic 2 now teaches the three layers of a skill, the Do / Verify / Save / Update process and /skill-creator. All scenario data moved to FY2025 for one consistent year. Topic 2 also contrasts a skill with a plugin — the shareable bundle of skills, tools, agents and hooks.</w:t>
+              <w:t>Added a document-processing lab as the new Lab 1 — 126 synthetic Meridian supplier invoices and expense receipts that Claude reads into a CSV and files into month folders — so the course now opens on the work Cowork is really for. Seven labs in total. Topic 2 now teaches the three layers of a skill, the Do / Verify / Save / Update process and /skill-creator. All scenario data moved to FY2025 for one consistent year. Topic 2 also contrasts a skill with a plugin — the shareable bundle of skills, tools, agents and hooks. Topic 1 gains a Chat/Cowork/Code comparison, what makes Cowork useful, and the Claude plan pricing, and two About the Trainer profile slides follow the learner self-introduction.</w:t>
             </w:r>
           </w:p>
         </w:tc>
@@ -608,7 +608,7 @@
         </w:rPr>
         <w:t>Introduction</w:t>
         <w:tab/>
-        <w:t>5</w:t>
+        <w:t>3</w:t>
       </w:r>
     </w:p>
     <w:p>

</xml_diff>

<commit_message>
Summarise lab steps on one slide; teach Live Artefacts where it is used
Two changes to how Topic 1 reads.

The deck was spending ten slides walking through Lab 1's steps, which a
trainer talks over in seconds and a learner cannot follow from the screen
anyway. Each lab now gets ONE steps slide — the numbered list, two columns
past six steps — and the full step-by-step with the reasoning for each step
moved into the Learner Guide, which is where someone doing the work looks.
The deck drops from 132 slides to 81; the LG carries the detail.

The Live Artefacts theory also sat before Lab 1, which is a document-
processing task that needs none of it. Theory tied to one lab is now emitted
immediately before that lab via a BEFORE_LAB map, so the artefact slides land
between Lab 1 and Lab 2 — the lab that actually builds one.

Co-Authored-By: Claude Opus 5 <noreply@anthropic.com>
</commit_message>
<xml_diff>
--- a/courseware/LG-Claude Cowork Masterclass.docx
+++ b/courseware/LG-Claude Cowork Masterclass.docx
@@ -725,7 +725,7 @@
         </w:rPr>
         <w:t>Lab 3 — The Meridian Sales Dashboard</w:t>
         <w:tab/>
-        <w:t>10</w:t>
+        <w:t>9</w:t>
       </w:r>
     </w:p>
     <w:p>
@@ -764,7 +764,7 @@
         </w:rPr>
         <w:t>Lab 4 — Connect Google Drive</w:t>
         <w:tab/>
-        <w:t>12</w:t>
+        <w:t>11</w:t>
       </w:r>
     </w:p>
     <w:p>
@@ -804,7 +804,7 @@
         </w:rPr>
         <w:t>Lab 6 — Build a /daily-brief Skill</w:t>
         <w:tab/>
-        <w:t>15</w:t>
+        <w:t>14</w:t>
       </w:r>
     </w:p>
     <w:p>
@@ -823,7 +823,7 @@
         </w:rPr>
         <w:t>Topic 03 — Claude Projects</w:t>
         <w:tab/>
-        <w:t>17</w:t>
+        <w:t>16</w:t>
       </w:r>
     </w:p>
     <w:p>
@@ -843,7 +843,7 @@
         </w:rPr>
         <w:t>Lab 7 — Build the Meridian Claude Project</w:t>
         <w:tab/>
-        <w:t>17</w:t>
+        <w:t>16</w:t>
       </w:r>
     </w:p>
     <w:p>
@@ -862,7 +862,7 @@
         </w:rPr>
         <w:t>Wrap-Up</w:t>
         <w:tab/>
-        <w:t>19</w:t>
+        <w:t>18</w:t>
       </w:r>
     </w:p>
     <w:p>
@@ -881,7 +881,7 @@
         </w:rPr>
         <w:t>Next Steps</w:t>
         <w:tab/>
-        <w:t>20</w:t>
+        <w:t>18</w:t>
       </w:r>
     </w:p>
     <w:p>
@@ -900,7 +900,7 @@
         </w:rPr>
         <w:t>Glossary</w:t>
         <w:tab/>
-        <w:t>20</w:t>
+        <w:t>19</w:t>
       </w:r>
     </w:p>
     <w:p>
@@ -1556,17 +1556,7 @@
         <w:t xml:space="preserve">1.  </w:t>
       </w:r>
       <w:r>
-        <w:t>Open the Claude desktop app, sign in, and choose Cowork in the sidebar.</w:t>
-      </w:r>
-    </w:p>
-    <w:p>
-      <w:r>
-        <w:rPr>
-          <w:rFonts w:ascii="Courier New" w:hAnsi="Courier New"/>
-          <w:color w:val="0B3060"/>
-          <w:sz w:val="19"/>
-        </w:rPr>
-        <w:t>Cowork is a desktop feature on a paid plan — the browser version cannot reach your files.</w:t>
+        <w:t>Open the Claude desktop app, sign in, and choose Cowork in the sidebar.  —  Cowork is a desktop feature on a paid plan — the browser version cannot reach your files.</w:t>
       </w:r>
     </w:p>
     <w:p>
@@ -1581,17 +1571,7 @@
         <w:t xml:space="preserve">2.  </w:t>
       </w:r>
       <w:r>
-        <w:t>Copy the lab's "2025 Invoices" folder somewhere you can work on it.</w:t>
-      </w:r>
-    </w:p>
-    <w:p>
-      <w:r>
-        <w:rPr>
-          <w:rFonts w:ascii="Courier New" w:hAnsi="Courier New"/>
-          <w:color w:val="0B3060"/>
-          <w:sz w:val="19"/>
-        </w:rPr>
-        <w:t>Always run a file-moving task against a copy the first time, so a mistake costs nothing.</w:t>
+        <w:t>Copy the lab's "2025 Invoices" folder somewhere you can work on it.  —  Always run a file-moving task against a copy the first time, so a mistake costs nothing.</w:t>
       </w:r>
     </w:p>
     <w:p>
@@ -1606,17 +1586,7 @@
         <w:t xml:space="preserve">3.  </w:t>
       </w:r>
       <w:r>
-        <w:t>Open the folder yourself and skim it before you start — 126 files.</w:t>
-      </w:r>
-    </w:p>
-    <w:p>
-      <w:r>
-        <w:rPr>
-          <w:rFonts w:ascii="Courier New" w:hAnsi="Courier New"/>
-          <w:color w:val="0B3060"/>
-          <w:sz w:val="19"/>
-        </w:rPr>
-        <w:t>Two have machine-generated names and one looks like a duplicate. You cannot check 126 documents by hand, but you can check that the summary adds up.</w:t>
+        <w:t>Open the folder yourself and skim it before you start — 126 files.  —  Two have machine-generated names and one looks like a duplicate. You cannot check 126 documents by hand, but you can check that the summary adds up.</w:t>
       </w:r>
     </w:p>
     <w:p>
@@ -1631,17 +1601,7 @@
         <w:t xml:space="preserve">4.  </w:t>
       </w:r>
       <w:r>
-        <w:t>Start a Cowork session pointed at that folder, then paste the lab prompt.</w:t>
-      </w:r>
-    </w:p>
-    <w:p>
-      <w:r>
-        <w:rPr>
-          <w:rFonts w:ascii="Courier New" w:hAnsi="Courier New"/>
-          <w:color w:val="0B3060"/>
-          <w:sz w:val="19"/>
-        </w:rPr>
-        <w:t>Cowork needs access to the folder itself, not an attachment, because it must move files as well as read them.</w:t>
+        <w:t>Start a Cowork session pointed at that folder, then paste the lab prompt.  —  Cowork needs access to the folder itself, not an attachment, because it must move files as well as read them.</w:t>
       </w:r>
     </w:p>
     <w:p>
@@ -1656,17 +1616,7 @@
         <w:t xml:space="preserve">5.  </w:t>
       </w:r>
       <w:r>
-        <w:t>Let Claude work through the PDFs — this one takes a few minutes.</w:t>
-      </w:r>
-    </w:p>
-    <w:p>
-      <w:r>
-        <w:rPr>
-          <w:rFonts w:ascii="Courier New" w:hAnsi="Courier New"/>
-          <w:color w:val="0B3060"/>
-          <w:sz w:val="19"/>
-        </w:rPr>
-        <w:t>It is reading each document, not guessing from the filename, which is why the oddly-named files still land correctly.</w:t>
+        <w:t>Let Claude work through the PDFs — this one takes a few minutes.  —  It is reading each document, not guessing from the filename, which is why the oddly-named files still land correctly.</w:t>
       </w:r>
     </w:p>
     <w:p>
@@ -1681,17 +1631,7 @@
         <w:t xml:space="preserve">6.  </w:t>
       </w:r>
       <w:r>
-        <w:t>Open invoices_2025.csv and check the row count against the folder.</w:t>
-      </w:r>
-    </w:p>
-    <w:p>
-      <w:r>
-        <w:rPr>
-          <w:rFonts w:ascii="Courier New" w:hAnsi="Courier New"/>
-          <w:color w:val="0B3060"/>
-          <w:sz w:val="19"/>
-        </w:rPr>
-        <w:t>Expect 121 invoice rows — 117 in SGD and 4 in USD — with the receipts and the duplicate flagged rather than silently mixed in.</w:t>
+        <w:t>Open invoices_2025.csv and check the row count against the folder.  —  Expect 121 invoice rows — 117 in SGD and 4 in USD — with the receipts and the duplicate flagged rather than silently mixed in.</w:t>
       </w:r>
     </w:p>
     <w:p>
@@ -1706,17 +1646,7 @@
         <w:t xml:space="preserve">7.  </w:t>
       </w:r>
       <w:r>
-        <w:t>Total the SGD column and compare it against S$777,954.81.</w:t>
-      </w:r>
-    </w:p>
-    <w:p>
-      <w:r>
-        <w:rPr>
-          <w:rFonts w:ascii="Courier New" w:hAnsi="Courier New"/>
-          <w:color w:val="0B3060"/>
-          <w:sz w:val="19"/>
-        </w:rPr>
-        <w:t>Spot-check a few rows against the PDFs too: a total that reconciles tells you the extraction held across all 126 files.</w:t>
+        <w:t>Total the SGD column and compare it against S$777,954.81.  —  Spot-check a few rows against the PDFs too: a total that reconciles tells you the extraction held across all 126 files.</w:t>
       </w:r>
     </w:p>
     <w:p>
@@ -1731,17 +1661,7 @@
         <w:t xml:space="preserve">8.  </w:t>
       </w:r>
       <w:r>
-        <w:t>Check the currency column — four invoices are in US dollars.</w:t>
-      </w:r>
-    </w:p>
-    <w:p>
-      <w:r>
-        <w:rPr>
-          <w:rFonts w:ascii="Courier New" w:hAnsi="Courier New"/>
-          <w:color w:val="0B3060"/>
-          <w:sz w:val="19"/>
-        </w:rPr>
-        <w:t>Never sum a mixed-currency column. This is exactly the kind of thing a human check is for.</w:t>
+        <w:t>Check the currency column — four invoices are in US dollars.  —  Never sum a mixed-currency column. This is exactly the kind of thing a human check is for.</w:t>
       </w:r>
     </w:p>
     <w:p>
@@ -1756,17 +1676,7 @@
         <w:t xml:space="preserve">9.  </w:t>
       </w:r>
       <w:r>
-        <w:t>Confirm the PDFs now sit in 2025-01 … 2025-12 folders and nothing was deleted.</w:t>
-      </w:r>
-    </w:p>
-    <w:p>
-      <w:r>
-        <w:rPr>
-          <w:rFonts w:ascii="Courier New" w:hAnsi="Courier New"/>
-          <w:color w:val="0B3060"/>
-          <w:sz w:val="19"/>
-        </w:rPr>
-        <w:t>The file dates come from inside each document, so a file named Jan can still be filed by its real invoice date.</w:t>
+        <w:t>Confirm the PDFs now sit in 2025-01 … 2025-12 folders and nothing was deleted.  —  The file dates come from inside each document, so a file named Jan can still be filed by its real invoice date.</w:t>
       </w:r>
     </w:p>
     <w:p>
@@ -1781,17 +1691,7 @@
         <w:t xml:space="preserve">10.  </w:t>
       </w:r>
       <w:r>
-        <w:t>Read Claude's list of flagged items and decide what to do about each.</w:t>
-      </w:r>
-    </w:p>
-    <w:p>
-      <w:r>
-        <w:rPr>
-          <w:rFonts w:ascii="Courier New" w:hAnsi="Courier New"/>
-          <w:color w:val="0B3060"/>
-          <w:sz w:val="19"/>
-        </w:rPr>
-        <w:t>Claude surfaces the exceptions; you make the call — that is the working relationship this course is teaching.</w:t>
+        <w:t>Read Claude's list of flagged items and decide what to do about each.  —  Claude surfaces the exceptions; you make the call — that is the working relationship this course is teaching.</w:t>
       </w:r>
     </w:p>
     <w:p>
@@ -2068,17 +1968,7 @@
         <w:t xml:space="preserve">1.  </w:t>
       </w:r>
       <w:r>
-        <w:t>Start a new Cowork session — this lab needs no files.</w:t>
-      </w:r>
-    </w:p>
-    <w:p>
-      <w:r>
-        <w:rPr>
-          <w:rFonts w:ascii="Courier New" w:hAnsi="Courier New"/>
-          <w:color w:val="0B3060"/>
-          <w:sz w:val="19"/>
-        </w:rPr>
-        <w:t>Lab 1 gave Claude a folder to work in; here you are asking it to build something from nothing.</w:t>
+        <w:t>Start a new Cowork session — this lab needs no files.  —  Lab 1 gave Claude a folder to work in; here you are asking it to build something from nothing.</w:t>
       </w:r>
     </w:p>
     <w:p>
@@ -2093,17 +1983,7 @@
         <w:t xml:space="preserve">2.  </w:t>
       </w:r>
       <w:r>
-        <w:t>Paste the lab prompt into the composer and send it.</w:t>
-      </w:r>
-    </w:p>
-    <w:p>
-      <w:r>
-        <w:rPr>
-          <w:rFonts w:ascii="Courier New" w:hAnsi="Courier New"/>
-          <w:color w:val="0B3060"/>
-          <w:sz w:val="19"/>
-        </w:rPr>
-        <w:t>Claude writes the code and renders the converter in the preview pane beside the chat.</w:t>
+        <w:t>Paste the lab prompt into the composer and send it.  —  Claude writes the code and renders the converter in the preview pane beside the chat.</w:t>
       </w:r>
     </w:p>
     <w:p>
@@ -2118,17 +1998,7 @@
         <w:t xml:space="preserve">3.  </w:t>
       </w:r>
       <w:r>
-        <w:t>Try the converter: change the amount and switch the currencies.</w:t>
-      </w:r>
-    </w:p>
-    <w:p>
-      <w:r>
-        <w:rPr>
-          <w:rFonts w:ascii="Courier New" w:hAnsi="Courier New"/>
-          <w:color w:val="0B3060"/>
-          <w:sz w:val="19"/>
-        </w:rPr>
-        <w:t>This is what makes it an artefact rather than an answer — you can interact with it.</w:t>
+        <w:t>Try the converter: change the amount and switch the currencies.  —  This is what makes it an artefact rather than an answer — you can interact with it.</w:t>
       </w:r>
     </w:p>
     <w:p>
@@ -2143,17 +2013,7 @@
         <w:t xml:space="preserve">4.  </w:t>
       </w:r>
       <w:r>
-        <w:t>Ask for one refinement in plain English, for example: Add a thousands separator to the result.</w:t>
-      </w:r>
-    </w:p>
-    <w:p>
-      <w:r>
-        <w:rPr>
-          <w:rFonts w:ascii="Courier New" w:hAnsi="Courier New"/>
-          <w:color w:val="0B3060"/>
-          <w:sz w:val="19"/>
-        </w:rPr>
-        <w:t>Refining by conversation is the normal way to work — you never edit the code yourself.</w:t>
+        <w:t>Ask for one refinement in plain English, for example: Add a thousands separator to the result.  —  Refining by conversation is the normal way to work — you never edit the code yourself.</w:t>
       </w:r>
     </w:p>
     <w:p>
@@ -2168,17 +2028,7 @@
         <w:t xml:space="preserve">5.  </w:t>
       </w:r>
       <w:r>
-        <w:t>Save the artefact so it appears in your sidebar.</w:t>
-      </w:r>
-    </w:p>
-    <w:p>
-      <w:r>
-        <w:rPr>
-          <w:rFonts w:ascii="Courier New" w:hAnsi="Courier New"/>
-          <w:color w:val="0B3060"/>
-          <w:sz w:val="19"/>
-        </w:rPr>
-        <w:t>A saved artefact persists as a reusable tool; an unsaved one scrolls away with the chat.</w:t>
+        <w:t>Save the artefact so it appears in your sidebar.  —  A saved artefact persists as a reusable tool; an unsaved one scrolls away with the chat.</w:t>
       </w:r>
     </w:p>
     <w:p>
@@ -2193,17 +2043,7 @@
         <w:t xml:space="preserve">6.  </w:t>
       </w:r>
       <w:r>
-        <w:t>Download a copy of the artefact to your lab folder.</w:t>
-      </w:r>
-    </w:p>
-    <w:p>
-      <w:r>
-        <w:rPr>
-          <w:rFonts w:ascii="Courier New" w:hAnsi="Courier New"/>
-          <w:color w:val="0B3060"/>
-          <w:sz w:val="19"/>
-        </w:rPr>
-        <w:t>Downloading gives you a file you can keep, attach or hand to someone without Claude.</w:t>
+        <w:t>Download a copy of the artefact to your lab folder.  —  Downloading gives you a file you can keep, attach or hand to someone without Claude.</w:t>
       </w:r>
     </w:p>
     <w:p>
@@ -2519,17 +2359,7 @@
         <w:t xml:space="preserve">1.  </w:t>
       </w:r>
       <w:r>
-        <w:t>Open the lab folder and look at meridian-sales-fy2025.csv so you know what the data holds.</w:t>
-      </w:r>
-    </w:p>
-    <w:p>
-      <w:r>
-        <w:rPr>
-          <w:rFonts w:ascii="Courier New" w:hAnsi="Courier New"/>
-          <w:color w:val="0B3060"/>
-          <w:sz w:val="19"/>
-        </w:rPr>
-        <w:t>Always know your source before you ask Claude to summarise it — that is how you spot a wrong figure later.</w:t>
+        <w:t>Open the lab folder and look at meridian-sales-fy2025.csv so you know what the data holds.  —  Always know your source before you ask Claude to summarise it — that is how you spot a wrong figure later.</w:t>
       </w:r>
     </w:p>
     <w:p>
@@ -2544,17 +2374,7 @@
         <w:t xml:space="preserve">2.  </w:t>
       </w:r>
       <w:r>
-        <w:t>Start a Cowork session and attach the CSV, or point Claude at the lab folder.</w:t>
-      </w:r>
-    </w:p>
-    <w:p>
-      <w:r>
-        <w:rPr>
-          <w:rFonts w:ascii="Courier New" w:hAnsi="Courier New"/>
-          <w:color w:val="0B3060"/>
-          <w:sz w:val="19"/>
-        </w:rPr>
-        <w:t>Scope Claude to the one folder for this task rather than your whole drive.</w:t>
+        <w:t>Start a Cowork session and attach the CSV, or point Claude at the lab folder.  —  Scope Claude to the one folder for this task rather than your whole drive.</w:t>
       </w:r>
     </w:p>
     <w:p>
@@ -2569,17 +2389,7 @@
         <w:t xml:space="preserve">3.  </w:t>
       </w:r>
       <w:r>
-        <w:t>Paste the lab prompt and send it.</w:t>
-      </w:r>
-    </w:p>
-    <w:p>
-      <w:r>
-        <w:rPr>
-          <w:rFonts w:ascii="Courier New" w:hAnsi="Courier New"/>
-          <w:color w:val="0B3060"/>
-          <w:sz w:val="19"/>
-        </w:rPr>
-        <w:t>Claude reads the file, works out the totals and builds the dashboard in the preview pane.</w:t>
+        <w:t>Paste the lab prompt and send it.  —  Claude reads the file, works out the totals and builds the dashboard in the preview pane.</w:t>
       </w:r>
     </w:p>
     <w:p>
@@ -2594,17 +2404,7 @@
         <w:t xml:space="preserve">4.  </w:t>
       </w:r>
       <w:r>
-        <w:t>Check the KPI tiles against the CSV: total revenue should be S$24,850,000 across 214 deals.</w:t>
-      </w:r>
-    </w:p>
-    <w:p>
-      <w:r>
-        <w:rPr>
-          <w:rFonts w:ascii="Courier New" w:hAnsi="Courier New"/>
-          <w:color w:val="0B3060"/>
-          <w:sz w:val="19"/>
-        </w:rPr>
-        <w:t>This is the verification habit — read the artefact's numbers back against the source.</w:t>
+        <w:t>Check the KPI tiles against the CSV: total revenue should be S$24,850,000 across 214 deals.  —  This is the verification habit — read the artefact's numbers back against the source.</w:t>
       </w:r>
     </w:p>
     <w:p>
@@ -2619,17 +2419,7 @@
         <w:t xml:space="preserve">5.  </w:t>
       </w:r>
       <w:r>
-        <w:t>Use the desk filter to view Advisory on its own, then return to all desks.</w:t>
-      </w:r>
-    </w:p>
-    <w:p>
-      <w:r>
-        <w:rPr>
-          <w:rFonts w:ascii="Courier New" w:hAnsi="Courier New"/>
-          <w:color w:val="0B3060"/>
-          <w:sz w:val="19"/>
-        </w:rPr>
-        <w:t>Interactivity is the point of a Live Artefact: the reader explores instead of asking you for another cut.</w:t>
+        <w:t>Use the desk filter to view Advisory on its own, then return to all desks.  —  Interactivity is the point of a Live Artefact: the reader explores instead of asking you for another cut.</w:t>
       </w:r>
     </w:p>
     <w:p>
@@ -2644,17 +2434,7 @@
         <w:t xml:space="preserve">6.  </w:t>
       </w:r>
       <w:r>
-        <w:t>Refine the layout in plain English, for example: Move the KPI tiles above the chart.</w:t>
-      </w:r>
-    </w:p>
-    <w:p>
-      <w:r>
-        <w:rPr>
-          <w:rFonts w:ascii="Courier New" w:hAnsi="Courier New"/>
-          <w:color w:val="0B3060"/>
-          <w:sz w:val="19"/>
-        </w:rPr>
-        <w:t>Keep refining by conversation until the dashboard reads the way you want it to.</w:t>
+        <w:t>Refine the layout in plain English, for example: Move the KPI tiles above the chart.  —  Keep refining by conversation until the dashboard reads the way you want it to.</w:t>
       </w:r>
     </w:p>
     <w:p>
@@ -2669,17 +2449,7 @@
         <w:t xml:space="preserve">7.  </w:t>
       </w:r>
       <w:r>
-        <w:t>Save the dashboard to your sidebar with a clear name, then download a copy.</w:t>
-      </w:r>
-    </w:p>
-    <w:p>
-      <w:r>
-        <w:rPr>
-          <w:rFonts w:ascii="Courier New" w:hAnsi="Courier New"/>
-          <w:color w:val="0B3060"/>
-          <w:sz w:val="19"/>
-        </w:rPr>
-        <w:t>You will refresh this same artefact from connected data in Lab 5.</w:t>
+        <w:t>Save the dashboard to your sidebar with a clear name, then download a copy.  —  You will refresh this same artefact from connected data in Lab 5.</w:t>
       </w:r>
     </w:p>
     <w:p>
@@ -3051,17 +2821,7 @@
         <w:t xml:space="preserve">1.  </w:t>
       </w:r>
       <w:r>
-        <w:t>Upload the lab's mock-data files to a new Google Drive folder named Meridian Finance.</w:t>
-      </w:r>
-    </w:p>
-    <w:p>
-      <w:r>
-        <w:rPr>
-          <w:rFonts w:ascii="Courier New" w:hAnsi="Courier New"/>
-          <w:color w:val="0B3060"/>
-          <w:sz w:val="19"/>
-        </w:rPr>
-        <w:t>The lab supplies the quarterly workbook, the desk targets and the client list as mock data.</w:t>
+        <w:t>Upload the lab's mock-data files to a new Google Drive folder named Meridian Finance.  —  The lab supplies the quarterly workbook, the desk targets and the client list as mock data.</w:t>
       </w:r>
     </w:p>
     <w:p>
@@ -3076,17 +2836,7 @@
         <w:t xml:space="preserve">2.  </w:t>
       </w:r>
       <w:r>
-        <w:t>In Claude, click the plus sign in the composer and hover over Connectors.</w:t>
-      </w:r>
-    </w:p>
-    <w:p>
-      <w:r>
-        <w:rPr>
-          <w:rFonts w:ascii="Courier New" w:hAnsi="Courier New"/>
-          <w:color w:val="0B3060"/>
-          <w:sz w:val="19"/>
-        </w:rPr>
-        <w:t>This is where you turn individual connectors on and off for your account.</w:t>
+        <w:t>In Claude, click the plus sign in the composer and hover over Connectors.  —  This is where you turn individual connectors on and off for your account.</w:t>
       </w:r>
     </w:p>
     <w:p>
@@ -3101,17 +2851,7 @@
         <w:t xml:space="preserve">3.  </w:t>
       </w:r>
       <w:r>
-        <w:t>Toggle Google Drive on and sign in to your Google account.</w:t>
-      </w:r>
-    </w:p>
-    <w:p>
-      <w:r>
-        <w:rPr>
-          <w:rFonts w:ascii="Courier New" w:hAnsi="Courier New"/>
-          <w:color w:val="0B3060"/>
-          <w:sz w:val="19"/>
-        </w:rPr>
-        <w:t>On a Team or Enterprise plan an owner must enable connectors for the organisation first.</w:t>
+        <w:t>Toggle Google Drive on and sign in to your Google account.  —  On a Team or Enterprise plan an owner must enable connectors for the organisation first.</w:t>
       </w:r>
     </w:p>
     <w:p>
@@ -3126,17 +2866,7 @@
         <w:t xml:space="preserve">4.  </w:t>
       </w:r>
       <w:r>
-        <w:t>Approve the permissions Google asks for.</w:t>
-      </w:r>
-    </w:p>
-    <w:p>
-      <w:r>
-        <w:rPr>
-          <w:rFonts w:ascii="Courier New" w:hAnsi="Courier New"/>
-          <w:color w:val="0B3060"/>
-          <w:sz w:val="19"/>
-        </w:rPr>
-        <w:t>Approve only what you are willing to let Claude reach — you can revoke access later.</w:t>
+        <w:t>Approve the permissions Google asks for.  —  Approve only what you are willing to let Claude reach — you can revoke access later.</w:t>
       </w:r>
     </w:p>
     <w:p>
@@ -3151,17 +2881,7 @@
         <w:t xml:space="preserve">5.  </w:t>
       </w:r>
       <w:r>
-        <w:t>Paste the lab prompt so Claude reads the Meridian Finance folder.</w:t>
-      </w:r>
-    </w:p>
-    <w:p>
-      <w:r>
-        <w:rPr>
-          <w:rFonts w:ascii="Courier New" w:hAnsi="Courier New"/>
-          <w:color w:val="0B3060"/>
-          <w:sz w:val="19"/>
-        </w:rPr>
-        <w:t>Naming the folder scopes the task; Claude does not need access to your whole Drive.</w:t>
+        <w:t>Paste the lab prompt so Claude reads the Meridian Finance folder.  —  Naming the folder scopes the task; Claude does not need access to your whole Drive.</w:t>
       </w:r>
     </w:p>
     <w:p>
@@ -3176,17 +2896,7 @@
         <w:t xml:space="preserve">6.  </w:t>
       </w:r>
       <w:r>
-        <w:t>Compare Claude's file summary against what you actually uploaded.</w:t>
-      </w:r>
-    </w:p>
-    <w:p>
-      <w:r>
-        <w:rPr>
-          <w:rFonts w:ascii="Courier New" w:hAnsi="Courier New"/>
-          <w:color w:val="0B3060"/>
-          <w:sz w:val="19"/>
-        </w:rPr>
-        <w:t>Confirm it found every file and read the right periods before you rely on it.</w:t>
+        <w:t>Compare Claude's file summary against what you actually uploaded.  —  Confirm it found every file and read the right periods before you rely on it.</w:t>
       </w:r>
     </w:p>
     <w:p>
@@ -3201,17 +2911,7 @@
         <w:t xml:space="preserve">7.  </w:t>
       </w:r>
       <w:r>
-        <w:t>Note any inconsistency Claude reports between the files.</w:t>
-      </w:r>
-    </w:p>
-    <w:p>
-      <w:r>
-        <w:rPr>
-          <w:rFonts w:ascii="Courier New" w:hAnsi="Courier New"/>
-          <w:color w:val="0B3060"/>
-          <w:sz w:val="19"/>
-        </w:rPr>
-        <w:t>The Q4 Advisory target deliberately disagrees between two files — a real check.</w:t>
+        <w:t>Note any inconsistency Claude reports between the files.  —  The Q4 Advisory target deliberately disagrees between two files — a real check.</w:t>
       </w:r>
     </w:p>
     <w:p>
@@ -3552,17 +3252,7 @@
         <w:t xml:space="preserve">1.  </w:t>
       </w:r>
       <w:r>
-        <w:t>Reopen the dashboard you saved in Lab 3 from your sidebar.</w:t>
-      </w:r>
-    </w:p>
-    <w:p>
-      <w:r>
-        <w:rPr>
-          <w:rFonts w:ascii="Courier New" w:hAnsi="Courier New"/>
-          <w:color w:val="0B3060"/>
-          <w:sz w:val="19"/>
-        </w:rPr>
-        <w:t>You are extending the artefact you already built, not starting a new one.</w:t>
+        <w:t>Reopen the dashboard you saved in Lab 3 from your sidebar.  —  You are extending the artefact you already built, not starting a new one.</w:t>
       </w:r>
     </w:p>
     <w:p>
@@ -3577,17 +3267,7 @@
         <w:t xml:space="preserve">2.  </w:t>
       </w:r>
       <w:r>
-        <w:t>Enable the Gmail connector from the plus menu, alongside Google Drive.</w:t>
-      </w:r>
-    </w:p>
-    <w:p>
-      <w:r>
-        <w:rPr>
-          <w:rFonts w:ascii="Courier New" w:hAnsi="Courier New"/>
-          <w:color w:val="0B3060"/>
-          <w:sz w:val="19"/>
-        </w:rPr>
-        <w:t>Turn on only the connectors this task needs.</w:t>
+        <w:t>Enable the Gmail connector from the plus menu, alongside Google Drive.  —  Turn on only the connectors this task needs.</w:t>
       </w:r>
     </w:p>
     <w:p>
@@ -3602,17 +3282,7 @@
         <w:t xml:space="preserve">3.  </w:t>
       </w:r>
       <w:r>
-        <w:t>Paste the lab prompt, replacing the placeholder with your own email address.</w:t>
-      </w:r>
-    </w:p>
-    <w:p>
-      <w:r>
-        <w:rPr>
-          <w:rFonts w:ascii="Courier New" w:hAnsi="Courier New"/>
-          <w:color w:val="0B3060"/>
-          <w:sz w:val="19"/>
-        </w:rPr>
-        <w:t>Class exercises always go to a test recipient — yourself.</w:t>
+        <w:t>Paste the lab prompt, replacing the placeholder with your own email address.  —  Class exercises always go to a test recipient — yourself.</w:t>
       </w:r>
     </w:p>
     <w:p>
@@ -3627,17 +3297,7 @@
         <w:t xml:space="preserve">4.  </w:t>
       </w:r>
       <w:r>
-        <w:t>Watch Claude refresh the dashboard from Drive and add the Q4 target comparison.</w:t>
-      </w:r>
-    </w:p>
-    <w:p>
-      <w:r>
-        <w:rPr>
-          <w:rFonts w:ascii="Courier New" w:hAnsi="Courier New"/>
-          <w:color w:val="0B3060"/>
-          <w:sz w:val="19"/>
-        </w:rPr>
-        <w:t>The data comes from the connector now; you are not attaching files by hand.</w:t>
+        <w:t>Watch Claude refresh the dashboard from Drive and add the Q4 target comparison.  —  The data comes from the connector now; you are not attaching files by hand.</w:t>
       </w:r>
     </w:p>
     <w:p>
@@ -3652,17 +3312,7 @@
         <w:t xml:space="preserve">5.  </w:t>
       </w:r>
       <w:r>
-        <w:t>Check the refreshed dashboard: Q4 revenue should be S$6,980,000 across the four desks.</w:t>
-      </w:r>
-    </w:p>
-    <w:p>
-      <w:r>
-        <w:rPr>
-          <w:rFonts w:ascii="Courier New" w:hAnsi="Courier New"/>
-          <w:color w:val="0B3060"/>
-          <w:sz w:val="19"/>
-        </w:rPr>
-        <w:t>Verify the artefact before you let it feed an email to your head of finance.</w:t>
+        <w:t>Check the refreshed dashboard: Q4 revenue should be S$6,980,000 across the four desks.  —  Verify the artefact before you let it feed an email to your head of finance.</w:t>
       </w:r>
     </w:p>
     <w:p>
@@ -3677,17 +3327,7 @@
         <w:t xml:space="preserve">6.  </w:t>
       </w:r>
       <w:r>
-        <w:t>Read the drafted email in full and compare every figure against the dashboard.</w:t>
-      </w:r>
-    </w:p>
-    <w:p>
-      <w:r>
-        <w:rPr>
-          <w:rFonts w:ascii="Courier New" w:hAnsi="Courier New"/>
-          <w:color w:val="0B3060"/>
-          <w:sz w:val="19"/>
-        </w:rPr>
-        <w:t>Claude asks for explicit approval before sending — this is the moment to use it.</w:t>
+        <w:t>Read the drafted email in full and compare every figure against the dashboard.  —  Claude asks for explicit approval before sending — this is the moment to use it.</w:t>
       </w:r>
     </w:p>
     <w:p>
@@ -3702,17 +3342,7 @@
         <w:t xml:space="preserve">7.  </w:t>
       </w:r>
       <w:r>
-        <w:t>Approve the send, then confirm the message arrived in your own inbox.</w:t>
-      </w:r>
-    </w:p>
-    <w:p>
-      <w:r>
-        <w:rPr>
-          <w:rFonts w:ascii="Courier New" w:hAnsi="Courier New"/>
-          <w:color w:val="0B3060"/>
-          <w:sz w:val="19"/>
-        </w:rPr>
-        <w:t>Approve only once the figures match; if anything is wrong, ask for a correction first.</w:t>
+        <w:t>Approve the send, then confirm the message arrived in your own inbox.  —  Approve only once the figures match; if anything is wrong, ask for a correction first.</w:t>
       </w:r>
     </w:p>
     <w:p>
@@ -4066,17 +3696,7 @@
         <w:t xml:space="preserve">1.  </w:t>
       </w:r>
       <w:r>
-        <w:t>Make sure the Drive and Gmail connectors from Labs 4 and 5 are still enabled.</w:t>
-      </w:r>
-    </w:p>
-    <w:p>
-      <w:r>
-        <w:rPr>
-          <w:rFonts w:ascii="Courier New" w:hAnsi="Courier New"/>
-          <w:color w:val="0B3060"/>
-          <w:sz w:val="19"/>
-        </w:rPr>
-        <w:t>The skill drives those connectors, so it can only work if they are on.</w:t>
+        <w:t>Make sure the Drive and Gmail connectors from Labs 4 and 5 are still enabled.  —  The skill drives those connectors, so it can only work if they are on.</w:t>
       </w:r>
     </w:p>
     <w:p>
@@ -4091,17 +3711,7 @@
         <w:t xml:space="preserve">2.  </w:t>
       </w:r>
       <w:r>
-        <w:t>DO — paste Step 1 of the lab prompt and let Claude run the routine once.</w:t>
-      </w:r>
-    </w:p>
-    <w:p>
-      <w:r>
-        <w:rPr>
-          <w:rFonts w:ascii="Courier New" w:hAnsi="Courier New"/>
-          <w:color w:val="0B3060"/>
-          <w:sz w:val="19"/>
-        </w:rPr>
-        <w:t>You are not writing instructions yet; you are doing the task together so Claude sees what good looks like.</w:t>
+        <w:t>DO — paste Step 1 of the lab prompt and let Claude run the routine once.  —  You are not writing instructions yet; you are doing the task together so Claude sees what good looks like.</w:t>
       </w:r>
     </w:p>
     <w:p>
@@ -4116,17 +3726,7 @@
         <w:t xml:space="preserve">3.  </w:t>
       </w:r>
       <w:r>
-        <w:t>VERIFY — read the briefing and ask for changes until the format is right.</w:t>
-      </w:r>
-    </w:p>
-    <w:p>
-      <w:r>
-        <w:rPr>
-          <w:rFonts w:ascii="Courier New" w:hAnsi="Courier New"/>
-          <w:color w:val="0B3060"/>
-          <w:sz w:val="19"/>
-        </w:rPr>
-        <w:t>Reorder a section, tighten the wording, fix a heading. Whatever you settle on here is what the skill will reproduce.</w:t>
+        <w:t>VERIFY — read the briefing and ask for changes until the format is right.  —  Reorder a section, tighten the wording, fix a heading. Whatever you settle on here is what the skill will reproduce.</w:t>
       </w:r>
     </w:p>
     <w:p>
@@ -4141,17 +3741,7 @@
         <w:t xml:space="preserve">4.  </w:t>
       </w:r>
       <w:r>
-        <w:t>Check the fallback wording on any empty section.</w:t>
-      </w:r>
-    </w:p>
-    <w:p>
-      <w:r>
-        <w:rPr>
-          <w:rFonts w:ascii="Courier New" w:hAnsi="Courier New"/>
-          <w:color w:val="0B3060"/>
-          <w:sz w:val="19"/>
-        </w:rPr>
-        <w:t>The fallbacks are what stop the routine inventing filler on a quiet morning — get them right before you save.</w:t>
+        <w:t>Check the fallback wording on any empty section.  —  The fallbacks are what stop the routine inventing filler on a quiet morning — get them right before you save.</w:t>
       </w:r>
     </w:p>
     <w:p>
@@ -4166,17 +3756,7 @@
         <w:t xml:space="preserve">5.  </w:t>
       </w:r>
       <w:r>
-        <w:t>Confirm it drafted and did not send anything.</w:t>
-      </w:r>
-    </w:p>
-    <w:p>
-      <w:r>
-        <w:rPr>
-          <w:rFonts w:ascii="Courier New" w:hAnsi="Courier New"/>
-          <w:color w:val="0B3060"/>
-          <w:sz w:val="19"/>
-        </w:rPr>
-        <w:t>A routine you will run unattended must not be able to send mail on its own.</w:t>
+        <w:t>Confirm it drafted and did not send anything.  —  A routine you will run unattended must not be able to send mail on its own.</w:t>
       </w:r>
     </w:p>
     <w:p>
@@ -4191,17 +3771,7 @@
         <w:t xml:space="preserve">6.  </w:t>
       </w:r>
       <w:r>
-        <w:t>SAVE — run Step 2 so /skill-creator turns the routine into a daily-brief skill.</w:t>
-      </w:r>
-    </w:p>
-    <w:p>
-      <w:r>
-        <w:rPr>
-          <w:rFonts w:ascii="Courier New" w:hAnsi="Courier New"/>
-          <w:color w:val="0B3060"/>
-          <w:sz w:val="19"/>
-        </w:rPr>
-        <w:t>The skill-creator skill writes the SKILL.md for you, from the run you just verified.</w:t>
+        <w:t>SAVE — run Step 2 so /skill-creator turns the routine into a daily-brief skill.  —  The skill-creator skill writes the SKILL.md for you, from the run you just verified.</w:t>
       </w:r>
     </w:p>
     <w:p>
@@ -4216,17 +3786,7 @@
         <w:t xml:space="preserve">7.  </w:t>
       </w:r>
       <w:r>
-        <w:t>Read the SKILL.md it produces, especially the description line.</w:t>
-      </w:r>
-    </w:p>
-    <w:p>
-      <w:r>
-        <w:rPr>
-          <w:rFonts w:ascii="Courier New" w:hAnsi="Courier New"/>
-          <w:color w:val="0B3060"/>
-          <w:sz w:val="19"/>
-        </w:rPr>
-        <w:t>The description is how Claude decides whether to load the skill for a future task — make it specific.</w:t>
+        <w:t>Read the SKILL.md it produces, especially the description line.  —  The description is how Claude decides whether to load the skill for a future task — make it specific.</w:t>
       </w:r>
     </w:p>
     <w:p>
@@ -4241,17 +3801,7 @@
         <w:t xml:space="preserve">8.  </w:t>
       </w:r>
       <w:r>
-        <w:t>Run the skill by name, then run it again.</w:t>
-      </w:r>
-    </w:p>
-    <w:p>
-      <w:r>
-        <w:rPr>
-          <w:rFonts w:ascii="Courier New" w:hAnsi="Courier New"/>
-          <w:color w:val="0B3060"/>
-          <w:sz w:val="19"/>
-        </w:rPr>
-        <w:t>The same structure both times is the payoff: one command instead of re-describing the routine every morning.</w:t>
+        <w:t>Run the skill by name, then run it again.  —  The same structure both times is the payoff: one command instead of re-describing the routine every morning.</w:t>
       </w:r>
     </w:p>
     <w:p>
@@ -4266,17 +3816,7 @@
         <w:t xml:space="preserve">9.  </w:t>
       </w:r>
       <w:r>
-        <w:t>UPDATE — ask for one change, such as putting the emails section first.</w:t>
-      </w:r>
-    </w:p>
-    <w:p>
-      <w:r>
-        <w:rPr>
-          <w:rFonts w:ascii="Courier New" w:hAnsi="Courier New"/>
-          <w:color w:val="0B3060"/>
-          <w:sz w:val="19"/>
-        </w:rPr>
-        <w:t>A skill is not written once. You keep refining it as you learn what you actually want each morning.</w:t>
+        <w:t>UPDATE — ask for one change, such as putting the emails section first.  —  A skill is not written once. You keep refining it as you learn what you actually want each morning.</w:t>
       </w:r>
     </w:p>
     <w:p>
@@ -4291,17 +3831,7 @@
         <w:t xml:space="preserve">10.  </w:t>
       </w:r>
       <w:r>
-        <w:t>Save the change under the same skill name and confirm the replace prompt.</w:t>
-      </w:r>
-    </w:p>
-    <w:p>
-      <w:r>
-        <w:rPr>
-          <w:rFonts w:ascii="Courier New" w:hAnsi="Courier New"/>
-          <w:color w:val="0B3060"/>
-          <w:sz w:val="19"/>
-        </w:rPr>
-        <w:t>Claude warns that a skill with this name already exists and that replacing it cannot be undone — read that prompt before you accept it.</w:t>
+        <w:t>Save the change under the same skill name and confirm the replace prompt.  —  Claude warns that a skill with this name already exists and that replacing it cannot be undone — read that prompt before you accept it.</w:t>
       </w:r>
     </w:p>
     <w:p>
@@ -4316,17 +3846,7 @@
         <w:t xml:space="preserve">11.  </w:t>
       </w:r>
       <w:r>
-        <w:t>Run the skill once more to confirm the change took effect.</w:t>
-      </w:r>
-    </w:p>
-    <w:p>
-      <w:r>
-        <w:rPr>
-          <w:rFonts w:ascii="Courier New" w:hAnsi="Courier New"/>
-          <w:color w:val="0B3060"/>
-          <w:sz w:val="19"/>
-        </w:rPr>
-        <w:t>Always re-run after an update; that is how you know the new version is the one being loaded.</w:t>
+        <w:t>Run the skill once more to confirm the change took effect.  —  Always re-run after an update; that is how you know the new version is the one being loaded.</w:t>
       </w:r>
     </w:p>
     <w:p>
@@ -4778,17 +4298,7 @@
         <w:t xml:space="preserve">1.  </w:t>
       </w:r>
       <w:r>
-        <w:t>In Cowork, choose New project, then Start from scratch.</w:t>
-      </w:r>
-    </w:p>
-    <w:p>
-      <w:r>
-        <w:rPr>
-          <w:rFonts w:ascii="Courier New" w:hAnsi="Courier New"/>
-          <w:color w:val="0B3060"/>
-          <w:sz w:val="19"/>
-        </w:rPr>
-        <w:t>The other two routes on that screen are Import a project (bring one over from Chat) and Use an existing folder (point Claude at a folder you already work from).</w:t>
+        <w:t>In Cowork, choose New project, then Start from scratch.  —  The other two routes on that screen are Import a project (bring one over from Chat) and Use an existing folder (point Claude at a folder you already work from).</w:t>
       </w:r>
     </w:p>
     <w:p>
@@ -4803,17 +4313,7 @@
         <w:t xml:space="preserve">2.  </w:t>
       </w:r>
       <w:r>
-        <w:t>In the Start a new project dialog, type the Name: Meridian Finance Reporting.</w:t>
-      </w:r>
-    </w:p>
-    <w:p>
-      <w:r>
-        <w:rPr>
-          <w:rFonts w:ascii="Courier New" w:hAnsi="Courier New"/>
-          <w:color w:val="0B3060"/>
-          <w:sz w:val="19"/>
-        </w:rPr>
-        <w:t>The dialog has four fields — Name, Instructions, Add files and Choose project location.</w:t>
+        <w:t>In the Start a new project dialog, type the Name: Meridian Finance Reporting.  —  The dialog has four fields — Name, Instructions, Add files and Choose project location.</w:t>
       </w:r>
     </w:p>
     <w:p>
@@ -4828,17 +4328,7 @@
         <w:t xml:space="preserve">3.  </w:t>
       </w:r>
       <w:r>
-        <w:t>Paste the lab prompt's rules into the Instructions box.</w:t>
-      </w:r>
-    </w:p>
-    <w:p>
-      <w:r>
-        <w:rPr>
-          <w:rFonts w:ascii="Courier New" w:hAnsi="Courier New"/>
-          <w:color w:val="0B3060"/>
-          <w:sz w:val="19"/>
-        </w:rPr>
-        <w:t>These are the standing rules — house style, SGD formatting and the approval habit — applied to every chat in the project.</w:t>
+        <w:t>Paste the lab prompt's rules into the Instructions box.  —  These are the standing rules — house style, SGD formatting and the approval habit — applied to every chat in the project.</w:t>
       </w:r>
     </w:p>
     <w:p>
@@ -4853,17 +4343,7 @@
         <w:t xml:space="preserve">4.  </w:t>
       </w:r>
       <w:r>
-        <w:t>Under Add files, drop in the Meridian finance data and the brand guidelines.</w:t>
-      </w:r>
-    </w:p>
-    <w:p>
-      <w:r>
-        <w:rPr>
-          <w:rFonts w:ascii="Courier New" w:hAnsi="Courier New"/>
-          <w:color w:val="0B3060"/>
-          <w:sz w:val="19"/>
-        </w:rPr>
-        <w:t>Adding them once means no chat in this project has to re-attach them.</w:t>
+        <w:t>Under Add files, drop in the Meridian finance data and the brand guidelines.  —  Adding them once means no chat in this project has to re-attach them.</w:t>
       </w:r>
     </w:p>
     <w:p>
@@ -4878,17 +4358,7 @@
         <w:t xml:space="preserve">5.  </w:t>
       </w:r>
       <w:r>
-        <w:t>Set Choose project location to where you want the folder to live, then click Create.</w:t>
-      </w:r>
-    </w:p>
-    <w:p>
-      <w:r>
-        <w:rPr>
-          <w:rFonts w:ascii="Courier New" w:hAnsi="Courier New"/>
-          <w:color w:val="0B3060"/>
-          <w:sz w:val="19"/>
-        </w:rPr>
-        <w:t>A Cowork project is backed by a real folder on your computer — you can open the files yourself at any time.</w:t>
+        <w:t>Set Choose project location to where you want the folder to live, then click Create.  —  A Cowork project is backed by a real folder on your computer — you can open the files yourself at any time.</w:t>
       </w:r>
     </w:p>
     <w:p>
@@ -4903,17 +4373,7 @@
         <w:t xml:space="preserve">6.  </w:t>
       </w:r>
       <w:r>
-        <w:t>Add the daily-brief skill from Lab 6 to the project.</w:t>
-      </w:r>
-    </w:p>
-    <w:p>
-      <w:r>
-        <w:rPr>
-          <w:rFonts w:ascii="Courier New" w:hAnsi="Courier New"/>
-          <w:color w:val="0B3060"/>
-          <w:sz w:val="19"/>
-        </w:rPr>
-        <w:t>The routine now travels with the project, so anyone working in it can run it.</w:t>
+        <w:t>Add the daily-brief skill from Lab 6 to the project.  —  The routine now travels with the project, so anyone working in it can run it.</w:t>
       </w:r>
     </w:p>
     <w:p>
@@ -4928,17 +4388,7 @@
         <w:t xml:space="preserve">7.  </w:t>
       </w:r>
       <w:r>
-        <w:t>Open the project folder on your computer and confirm the files are really there.</w:t>
-      </w:r>
-    </w:p>
-    <w:p>
-      <w:r>
-        <w:rPr>
-          <w:rFonts w:ascii="Courier New" w:hAnsi="Courier New"/>
-          <w:color w:val="0B3060"/>
-          <w:sz w:val="19"/>
-        </w:rPr>
-        <w:t>This is what distinguishes a Cowork project — the instructions and files are a folder you own, not something locked inside the app.</w:t>
+        <w:t>Open the project folder on your computer and confirm the files are really there.  —  This is what distinguishes a Cowork project — the instructions and files are a folder you own, not something locked inside the app.</w:t>
       </w:r>
     </w:p>
     <w:p>
@@ -4953,17 +4403,7 @@
         <w:t xml:space="preserve">8.  </w:t>
       </w:r>
       <w:r>
-        <w:t>Save the FY2025 dashboard into the project so it sits with the data it reports on.</w:t>
-      </w:r>
-    </w:p>
-    <w:p>
-      <w:r>
-        <w:rPr>
-          <w:rFonts w:ascii="Courier New" w:hAnsi="Courier New"/>
-          <w:color w:val="0B3060"/>
-          <w:sz w:val="19"/>
-        </w:rPr>
-        <w:t>The artefact, its data and its rules finally live in one place.</w:t>
+        <w:t>Save the FY2025 dashboard into the project so it sits with the data it reports on.  —  The artefact, its data and its rules finally live in one place.</w:t>
       </w:r>
     </w:p>
     <w:p>
@@ -4978,17 +4418,7 @@
         <w:t xml:space="preserve">9.  </w:t>
       </w:r>
       <w:r>
-        <w:t>Start a fresh chat in the project and ask for a one-paragraph Q4 summary.</w:t>
-      </w:r>
-    </w:p>
-    <w:p>
-      <w:r>
-        <w:rPr>
-          <w:rFonts w:ascii="Courier New" w:hAnsi="Courier New"/>
-          <w:color w:val="0B3060"/>
-          <w:sz w:val="19"/>
-        </w:rPr>
-        <w:t>Test the payoff: no files attached, no rules restated, and the output already follows the house style.</w:t>
+        <w:t>Start a fresh chat in the project and ask for a one-paragraph Q4 summary.  —  Test the payoff: no files attached, no rules restated, and the output already follows the house style.</w:t>
       </w:r>
     </w:p>
     <w:p>
@@ -5003,17 +4433,7 @@
         <w:t xml:space="preserve">10.  </w:t>
       </w:r>
       <w:r>
-        <w:t>Confirm the folder holds the data, instructions, skill and dashboard, ready to share.</w:t>
-      </w:r>
-    </w:p>
-    <w:p>
-      <w:r>
-        <w:rPr>
-          <w:rFonts w:ascii="Courier New" w:hAnsi="Courier New"/>
-          <w:color w:val="0B3060"/>
-          <w:sz w:val="19"/>
-        </w:rPr>
-        <w:t>Handing a colleague this folder hands them the whole working setup.</w:t>
+        <w:t>Confirm the folder holds the data, instructions, skill and dashboard, ready to share.  —  Handing a colleague this folder hands them the whole working setup.</w:t>
       </w:r>
     </w:p>
     <w:p>

</xml_diff>

<commit_message>
Fix Lab 2: artefacts cannot call APIs, so split the converter in two
The previous prompt asked the artefact to fetch live rates, which cannot
work: artefacts run under a strict CSP that blocks fetch, XHR and every
outbound request. Learners hit "Live rate lookup failed" and nothing to do
about it — my mistake, and a bad first experience of the tool.

Lab 2 now asks for both halves and teaches the difference:

  1. Claude looks the rates up itself, then builds an artefact with those
     rates baked in and a "Rates as at <date>" line.
  2. The same converter as a downloadable standalone HTML, which DOES fetch
     live rates with a Refresh button — because it runs in the browser, not
     the sandbox.

Added a "What an Artefact Can and Cannot Do" slide before the lab so the
constraint is taught rather than discovered, and reworked the steps: compare
Claude's rate against a search, then open the HTML and watch it refresh.

Co-Authored-By: Claude Opus 5 <noreply@anthropic.com>
</commit_message>
<xml_diff>
--- a/courseware/LG-Claude Cowork Masterclass.docx
+++ b/courseware/LG-Claude Cowork Masterclass.docx
@@ -804,7 +804,7 @@
         </w:rPr>
         <w:t>Lab 6 — Build a /daily-brief Skill</w:t>
         <w:tab/>
-        <w:t>14</w:t>
+        <w:t>15</w:t>
       </w:r>
     </w:p>
     <w:p>
@@ -862,7 +862,7 @@
         </w:rPr>
         <w:t>Wrap-Up</w:t>
         <w:tab/>
-        <w:t>18</w:t>
+        <w:t>19</w:t>
       </w:r>
     </w:p>
     <w:p>
@@ -1740,7 +1740,7 @@
     </w:p>
     <w:p>
       <w:r>
-        <w:t>Goal: Now you have seen Cowork do a real piece of work, meet the other thing it makes: a Live Artefact. You build a small tool rather than ask a question, so you can see how an artefact differs from a chat answer — it persists, it is interactive, it pulls fresh data every time you open it, and you can save and download it.</w:t>
+        <w:t>Goal: Now you have seen Cowork do a real piece of work, meet the other thing it makes: a Live Artefact. You build a small tool rather than ask a question, so you can see how an artefact differs from a chat answer — it persists, it is interactive, and you can save and download it. You also meet the sandbox: an artefact cannot call the internet, so you build one version with the rates baked in and a downloadable HTML version that fetches them live.</w:t>
       </w:r>
     </w:p>
     <w:p>
@@ -1755,7 +1755,7 @@
     </w:p>
     <w:p>
       <w:r>
-        <w:t>A saved, downloaded Live Artefact — an FX converter on live rates.   (Tools: Claude desktop app, Claude Cowork, Live Artefacts.)</w:t>
+        <w:t>An FX converter as a saved artefact, plus a downloadable HTML version with live rates.   (Tools: Claude desktop app, Claude Cowork, Live Artefacts.)</w:t>
       </w:r>
     </w:p>
     <w:p>
@@ -1809,20 +1809,7 @@
                 <w:color w:val="111827"/>
                 <w:sz w:val="19"/>
               </w:rPr>
-              <w:t>Build me a Live Artefact: a currency converter for Meridian Capital</w:t>
-            </w:r>
-          </w:p>
-          <w:p>
-            <w:pPr>
-              <w:spacing w:after="0"/>
-            </w:pPr>
-            <w:r>
-              <w:rPr>
-                <w:rFonts w:ascii="Courier New" w:hAnsi="Courier New"/>
-                <w:color w:val="111827"/>
-                <w:sz w:val="19"/>
-              </w:rPr>
-              <w:t>Partners that uses the LATEST exchange rates, not fixed ones.</w:t>
+              <w:t>Two things, in order.</w:t>
             </w:r>
           </w:p>
           <w:p>
@@ -1847,7 +1834,7 @@
                 <w:color w:val="111827"/>
                 <w:sz w:val="19"/>
               </w:rPr>
-              <w:t>Requirements:</w:t>
+              <w:t>1. Look up today's mid-market exchange rates from SGD to USD, EUR</w:t>
             </w:r>
           </w:p>
           <w:p>
@@ -1860,150 +1847,7 @@
                 <w:color w:val="111827"/>
                 <w:sz w:val="19"/>
               </w:rPr>
-              <w:t>- Convert between SGD, USD, EUR and GBP.</w:t>
-            </w:r>
-          </w:p>
-          <w:p>
-            <w:pPr>
-              <w:spacing w:after="0"/>
-            </w:pPr>
-            <w:r>
-              <w:rPr>
-                <w:rFonts w:ascii="Courier New" w:hAnsi="Courier New"/>
-                <w:color w:val="111827"/>
-                <w:sz w:val="19"/>
-              </w:rPr>
-              <w:t>- Fetch current rates from a free, no-key exchange rate API each time</w:t>
-            </w:r>
-          </w:p>
-          <w:p>
-            <w:pPr>
-              <w:spacing w:after="0"/>
-            </w:pPr>
-            <w:r>
-              <w:rPr>
-                <w:rFonts w:ascii="Courier New" w:hAnsi="Courier New"/>
-                <w:color w:val="111827"/>
-                <w:sz w:val="19"/>
-              </w:rPr>
-              <w:t xml:space="preserve">  the artefact is opened, and refresh them when I click a Refresh</w:t>
-            </w:r>
-          </w:p>
-          <w:p>
-            <w:pPr>
-              <w:spacing w:after="0"/>
-            </w:pPr>
-            <w:r>
-              <w:rPr>
-                <w:rFonts w:ascii="Courier New" w:hAnsi="Courier New"/>
-                <w:color w:val="111827"/>
-                <w:sz w:val="19"/>
-              </w:rPr>
-              <w:t xml:space="preserve">  button.</w:t>
-            </w:r>
-          </w:p>
-          <w:p>
-            <w:pPr>
-              <w:spacing w:after="0"/>
-            </w:pPr>
-            <w:r>
-              <w:rPr>
-                <w:rFonts w:ascii="Courier New" w:hAnsi="Courier New"/>
-                <w:color w:val="111827"/>
-                <w:sz w:val="19"/>
-              </w:rPr>
-              <w:t>- One amount box, a from-currency and a to-currency selector, and a</w:t>
-            </w:r>
-          </w:p>
-          <w:p>
-            <w:pPr>
-              <w:spacing w:after="0"/>
-            </w:pPr>
-            <w:r>
-              <w:rPr>
-                <w:rFonts w:ascii="Courier New" w:hAnsi="Courier New"/>
-                <w:color w:val="111827"/>
-                <w:sz w:val="19"/>
-              </w:rPr>
-              <w:t xml:space="preserve">  large result.</w:t>
-            </w:r>
-          </w:p>
-          <w:p>
-            <w:pPr>
-              <w:spacing w:after="0"/>
-            </w:pPr>
-            <w:r>
-              <w:rPr>
-                <w:rFonts w:ascii="Courier New" w:hAnsi="Courier New"/>
-                <w:color w:val="111827"/>
-                <w:sz w:val="19"/>
-              </w:rPr>
-              <w:t>- Under the result show the rate used and the time the rates were</w:t>
-            </w:r>
-          </w:p>
-          <w:p>
-            <w:pPr>
-              <w:spacing w:after="0"/>
-            </w:pPr>
-            <w:r>
-              <w:rPr>
-                <w:rFonts w:ascii="Courier New" w:hAnsi="Courier New"/>
-                <w:color w:val="111827"/>
-                <w:sz w:val="19"/>
-              </w:rPr>
-              <w:t xml:space="preserve">  last fetched.</w:t>
-            </w:r>
-          </w:p>
-          <w:p>
-            <w:pPr>
-              <w:spacing w:after="0"/>
-            </w:pPr>
-            <w:r>
-              <w:rPr>
-                <w:rFonts w:ascii="Courier New" w:hAnsi="Courier New"/>
-                <w:color w:val="111827"/>
-                <w:sz w:val="19"/>
-              </w:rPr>
-              <w:t>- If the rate lookup fails, say so plainly and show the last rate you</w:t>
-            </w:r>
-          </w:p>
-          <w:p>
-            <w:pPr>
-              <w:spacing w:after="0"/>
-            </w:pPr>
-            <w:r>
-              <w:rPr>
-                <w:rFonts w:ascii="Courier New" w:hAnsi="Courier New"/>
-                <w:color w:val="111827"/>
-                <w:sz w:val="19"/>
-              </w:rPr>
-              <w:t xml:space="preserve">  had rather than a wrong number.</w:t>
-            </w:r>
-          </w:p>
-          <w:p>
-            <w:pPr>
-              <w:spacing w:after="0"/>
-            </w:pPr>
-            <w:r>
-              <w:rPr>
-                <w:rFonts w:ascii="Courier New" w:hAnsi="Courier New"/>
-                <w:color w:val="111827"/>
-                <w:sz w:val="19"/>
-              </w:rPr>
-              <w:t>- Clean, professional finance styling. Label it "Meridian Capital</w:t>
-            </w:r>
-          </w:p>
-          <w:p>
-            <w:pPr>
-              <w:spacing w:after="0"/>
-            </w:pPr>
-            <w:r>
-              <w:rPr>
-                <w:rFonts w:ascii="Courier New" w:hAnsi="Courier New"/>
-                <w:color w:val="111827"/>
-                <w:sz w:val="19"/>
-              </w:rPr>
-              <w:t xml:space="preserve">  Partners".</w:t>
+              <w:t xml:space="preserve">   and GBP, and tell me the rates and the date you found them.</w:t>
             </w:r>
           </w:p>
           <w:p>
@@ -2028,7 +1872,200 @@
                 <w:color w:val="111827"/>
                 <w:sz w:val="19"/>
               </w:rPr>
-              <w:t>Make it interactive so I can change the amount and see the result update.</w:t>
+              <w:t>2. Build me a Live Artefact: a currency converter for Meridian</w:t>
+            </w:r>
+          </w:p>
+          <w:p>
+            <w:pPr>
+              <w:spacing w:after="0"/>
+            </w:pPr>
+            <w:r>
+              <w:rPr>
+                <w:rFonts w:ascii="Courier New" w:hAnsi="Courier New"/>
+                <w:color w:val="111827"/>
+                <w:sz w:val="19"/>
+              </w:rPr>
+              <w:t xml:space="preserve">   Capital Partners using exactly those rates.</w:t>
+            </w:r>
+          </w:p>
+          <w:p>
+            <w:pPr>
+              <w:spacing w:after="0"/>
+            </w:pPr>
+            <w:r>
+              <w:rPr>
+                <w:rFonts w:ascii="Courier New" w:hAnsi="Courier New"/>
+                <w:color w:val="111827"/>
+                <w:sz w:val="19"/>
+              </w:rPr>
+              <w:t xml:space="preserve">   - Convert between SGD, USD, EUR and GBP.</w:t>
+            </w:r>
+          </w:p>
+          <w:p>
+            <w:pPr>
+              <w:spacing w:after="0"/>
+            </w:pPr>
+            <w:r>
+              <w:rPr>
+                <w:rFonts w:ascii="Courier New" w:hAnsi="Courier New"/>
+                <w:color w:val="111827"/>
+                <w:sz w:val="19"/>
+              </w:rPr>
+              <w:t xml:space="preserve">   - One amount box, a from-currency and a to-currency selector,</w:t>
+            </w:r>
+          </w:p>
+          <w:p>
+            <w:pPr>
+              <w:spacing w:after="0"/>
+            </w:pPr>
+            <w:r>
+              <w:rPr>
+                <w:rFonts w:ascii="Courier New" w:hAnsi="Courier New"/>
+                <w:color w:val="111827"/>
+                <w:sz w:val="19"/>
+              </w:rPr>
+              <w:t xml:space="preserve">     and a large result.</w:t>
+            </w:r>
+          </w:p>
+          <w:p>
+            <w:pPr>
+              <w:spacing w:after="0"/>
+            </w:pPr>
+            <w:r>
+              <w:rPr>
+                <w:rFonts w:ascii="Courier New" w:hAnsi="Courier New"/>
+                <w:color w:val="111827"/>
+                <w:sz w:val="19"/>
+              </w:rPr>
+              <w:t xml:space="preserve">   - Under the result show the rate used, and a line saying</w:t>
+            </w:r>
+          </w:p>
+          <w:p>
+            <w:pPr>
+              <w:spacing w:after="0"/>
+            </w:pPr>
+            <w:r>
+              <w:rPr>
+                <w:rFonts w:ascii="Courier New" w:hAnsi="Courier New"/>
+                <w:color w:val="111827"/>
+                <w:sz w:val="19"/>
+              </w:rPr>
+              <w:t xml:space="preserve">     "Rates as at &lt;the date you looked them up&gt;".</w:t>
+            </w:r>
+          </w:p>
+          <w:p>
+            <w:pPr>
+              <w:spacing w:after="0"/>
+            </w:pPr>
+            <w:r>
+              <w:rPr>
+                <w:rFonts w:ascii="Courier New" w:hAnsi="Courier New"/>
+                <w:color w:val="111827"/>
+                <w:sz w:val="19"/>
+              </w:rPr>
+              <w:t xml:space="preserve">   - Clean, professional finance styling. Label it "Meridian</w:t>
+            </w:r>
+          </w:p>
+          <w:p>
+            <w:pPr>
+              <w:spacing w:after="0"/>
+            </w:pPr>
+            <w:r>
+              <w:rPr>
+                <w:rFonts w:ascii="Courier New" w:hAnsi="Courier New"/>
+                <w:color w:val="111827"/>
+                <w:sz w:val="19"/>
+              </w:rPr>
+              <w:t xml:space="preserve">     Capital Partners".</w:t>
+            </w:r>
+          </w:p>
+          <w:p>
+            <w:pPr>
+              <w:spacing w:after="0"/>
+            </w:pPr>
+            <w:r>
+              <w:rPr>
+                <w:rFonts w:ascii="Courier New" w:hAnsi="Courier New"/>
+                <w:color w:val="111827"/>
+                <w:sz w:val="19"/>
+              </w:rPr>
+            </w:r>
+          </w:p>
+          <w:p>
+            <w:pPr>
+              <w:spacing w:after="0"/>
+            </w:pPr>
+            <w:r>
+              <w:rPr>
+                <w:rFonts w:ascii="Courier New" w:hAnsi="Courier New"/>
+                <w:color w:val="111827"/>
+                <w:sz w:val="19"/>
+              </w:rPr>
+              <w:t>Make it interactive so I can change the amount and see the result</w:t>
+            </w:r>
+          </w:p>
+          <w:p>
+            <w:pPr>
+              <w:spacing w:after="0"/>
+            </w:pPr>
+            <w:r>
+              <w:rPr>
+                <w:rFonts w:ascii="Courier New" w:hAnsi="Courier New"/>
+                <w:color w:val="111827"/>
+                <w:sz w:val="19"/>
+              </w:rPr>
+              <w:t>update.</w:t>
+            </w:r>
+          </w:p>
+          <w:p>
+            <w:pPr>
+              <w:spacing w:after="0"/>
+            </w:pPr>
+            <w:r>
+              <w:rPr>
+                <w:rFonts w:ascii="Courier New" w:hAnsi="Courier New"/>
+                <w:color w:val="111827"/>
+                <w:sz w:val="19"/>
+              </w:rPr>
+            </w:r>
+          </w:p>
+          <w:p>
+            <w:pPr>
+              <w:spacing w:after="0"/>
+            </w:pPr>
+            <w:r>
+              <w:rPr>
+                <w:rFonts w:ascii="Courier New" w:hAnsi="Courier New"/>
+                <w:color w:val="111827"/>
+                <w:sz w:val="19"/>
+              </w:rPr>
+              <w:t>Then give me the same converter as a standalone HTML file I can</w:t>
+            </w:r>
+          </w:p>
+          <w:p>
+            <w:pPr>
+              <w:spacing w:after="0"/>
+            </w:pPr>
+            <w:r>
+              <w:rPr>
+                <w:rFonts w:ascii="Courier New" w:hAnsi="Courier New"/>
+                <w:color w:val="111827"/>
+                <w:sz w:val="19"/>
+              </w:rPr>
+              <w:t>download, and in that version fetch the rates live from a free</w:t>
+            </w:r>
+          </w:p>
+          <w:p>
+            <w:pPr>
+              <w:spacing w:after="0"/>
+            </w:pPr>
+            <w:r>
+              <w:rPr>
+                <w:rFonts w:ascii="Courier New" w:hAnsi="Courier New"/>
+                <w:color w:val="111827"/>
+                <w:sz w:val="19"/>
+              </w:rPr>
+              <w:t>no-key API when the page opens, with a Refresh button.</w:t>
             </w:r>
           </w:p>
         </w:tc>
@@ -2047,7 +2084,7 @@
         <w:rPr>
           <w:sz w:val="20"/>
         </w:rPr>
-        <w:t>Because the rates are live, your figures will differ from the screenshots — that is the point of a Live Artefact.</w:t>
+        <w:t>An artefact cannot call an external API — that is a sandbox rule, not a bug. Claude looks the rates up for you and builds them in; the downloadable HTML runs in your browser, so it can fetch live.</w:t>
       </w:r>
     </w:p>
     <w:p>
@@ -2117,7 +2154,7 @@
         <w:t xml:space="preserve">4.  </w:t>
       </w:r>
       <w:r>
-        <w:t>Check the live rate against a search for "1 USD to SGD".  —  The artefact fetched this rate seconds ago, so it should match. A fixed rate in a spreadsheet would already be out of date.</w:t>
+        <w:t>Check the rate Claude found against a search for "1 USD to SGD".  —  Claude looked this up while building, so it should match today. The artefact itself cannot call an API — the sandbox blocks outbound requests — so the rate is baked in at build time.</w:t>
       </w:r>
     </w:p>
     <w:p>
@@ -2132,7 +2169,7 @@
         <w:t xml:space="preserve">5.  </w:t>
       </w:r>
       <w:r>
-        <w:t>Click Refresh, and note the 'last fetched' time updates.  —  This is the 'Live' in Live Artefact — reopening or refreshing pulls current data rather than replaying a snapshot.</w:t>
+        <w:t>Open the downloaded HTML file in your browser and click Refresh.  —  Same converter, but running in your browser instead of the sandbox, so it CAN fetch live rates. This is the practical difference between an artefact and a file you own.</w:t>
       </w:r>
     </w:p>
     <w:p>
@@ -2192,7 +2229,7 @@
     </w:p>
     <w:p>
       <w:r>
-        <w:t>Converting S$10,000 to USD gives a figure that matches a live search for the SGD/USD rate, and the artefact shows when the rates were last fetched. Clicking Refresh updates that time. The artefact appears in your sidebar after saving, still works when you reopen it, and a downloaded copy is in your lab folder.</w:t>
+        <w:t>The artefact converts S$10,000 to USD using the rate Claude looked up, and shows a "Rates as at …" line with today's date. The downloaded HTML file opens in your browser, fetches rates itself and updates them when you click Refresh. The artefact appears in your sidebar after saving and still works when reopened.</w:t>
       </w:r>
     </w:p>
     <w:p>

</xml_diff>

<commit_message>
Lab 2: tell Claude explicitly not to fetch inside the artefact
The previous prompt said "the same converter ... and in that version fetch
live", so Claude reasonably built ONE fetching converter and rendered it as
the artefact — where the sandbox blocks the request and it reports "Live rate
lookup failed". Asking for two things that sound like one thing was the bug.

The prompt is now three explicit steps, opening with the constraint: do NOT
put a fetch, API call or network request in the artefact. Step 1 Claude
searches and reports the rates in chat; Step 2 builds the artefact with those
numbers hard-coded; Step 3 saves a SEPARATE meridian-fx-live.html that does
fetch live, with an instruction not to render it as an artefact.

Steps and check step follow the same three-part shape, and the note warns
what happens if the "no fetch" line is dropped.

Co-Authored-By: Claude Opus 5 <noreply@anthropic.com>
</commit_message>
<xml_diff>
--- a/courseware/LG-Claude Cowork Masterclass.docx
+++ b/courseware/LG-Claude Cowork Masterclass.docx
@@ -1809,7 +1809,33 @@
                 <w:color w:val="111827"/>
                 <w:sz w:val="19"/>
               </w:rPr>
-              <w:t>Two things, in order.</w:t>
+              <w:t>I want a currency converter for Meridian Capital Partners, in three</w:t>
+            </w:r>
+          </w:p>
+          <w:p>
+            <w:pPr>
+              <w:spacing w:after="0"/>
+            </w:pPr>
+            <w:r>
+              <w:rPr>
+                <w:rFonts w:ascii="Courier New" w:hAnsi="Courier New"/>
+                <w:color w:val="111827"/>
+                <w:sz w:val="19"/>
+              </w:rPr>
+              <w:t>steps. Artefacts cannot call the internet, so do NOT put any fetch,</w:t>
+            </w:r>
+          </w:p>
+          <w:p>
+            <w:pPr>
+              <w:spacing w:after="0"/>
+            </w:pPr>
+            <w:r>
+              <w:rPr>
+                <w:rFonts w:ascii="Courier New" w:hAnsi="Courier New"/>
+                <w:color w:val="111827"/>
+                <w:sz w:val="19"/>
+              </w:rPr>
+              <w:t>API call or network request in the artefact — it will fail.</w:t>
             </w:r>
           </w:p>
           <w:p>
@@ -1834,7 +1860,7 @@
                 <w:color w:val="111827"/>
                 <w:sz w:val="19"/>
               </w:rPr>
-              <w:t>1. Look up today's mid-market exchange rates from SGD to USD, EUR</w:t>
+              <w:t>STEP 1 — You look up the rates.</w:t>
             </w:r>
           </w:p>
           <w:p>
@@ -1847,7 +1873,20 @@
                 <w:color w:val="111827"/>
                 <w:sz w:val="19"/>
               </w:rPr>
-              <w:t xml:space="preserve">   and GBP, and tell me the rates and the date you found them.</w:t>
+              <w:t>Search the web for today's mid-market rates from SGD to USD, EUR and</w:t>
+            </w:r>
+          </w:p>
+          <w:p>
+            <w:pPr>
+              <w:spacing w:after="0"/>
+            </w:pPr>
+            <w:r>
+              <w:rPr>
+                <w:rFonts w:ascii="Courier New" w:hAnsi="Courier New"/>
+                <w:color w:val="111827"/>
+                <w:sz w:val="19"/>
+              </w:rPr>
+              <w:t>GBP. Tell me the three rates and the date, in the chat.</w:t>
             </w:r>
           </w:p>
           <w:p>
@@ -1872,7 +1911,7 @@
                 <w:color w:val="111827"/>
                 <w:sz w:val="19"/>
               </w:rPr>
-              <w:t>2. Build me a Live Artefact: a currency converter for Meridian</w:t>
+              <w:t>STEP 2 — Build the artefact with those numbers HARD-CODED.</w:t>
             </w:r>
           </w:p>
           <w:p>
@@ -1885,7 +1924,7 @@
                 <w:color w:val="111827"/>
                 <w:sz w:val="19"/>
               </w:rPr>
-              <w:t xml:space="preserve">   Capital Partners using exactly those rates.</w:t>
+              <w:t>Write the three rates into the code as constants. No fetch anywhere.</w:t>
             </w:r>
           </w:p>
           <w:p>
@@ -1924,7 +1963,7 @@
                 <w:color w:val="111827"/>
                 <w:sz w:val="19"/>
               </w:rPr>
-              <w:t xml:space="preserve">     and a large result.</w:t>
+              <w:t xml:space="preserve">     and a large result that updates as I type.</w:t>
             </w:r>
           </w:p>
           <w:p>
@@ -1937,7 +1976,7 @@
                 <w:color w:val="111827"/>
                 <w:sz w:val="19"/>
               </w:rPr>
-              <w:t xml:space="preserve">   - Under the result show the rate used, and a line saying</w:t>
+              <w:t xml:space="preserve">   - Under the result show the rate used, and the line</w:t>
             </w:r>
           </w:p>
           <w:p>
@@ -1950,7 +1989,7 @@
                 <w:color w:val="111827"/>
                 <w:sz w:val="19"/>
               </w:rPr>
-              <w:t xml:space="preserve">     "Rates as at &lt;the date you looked them up&gt;".</w:t>
+              <w:t xml:space="preserve">     "Rates as at &lt;the date from Step 1&gt; — fixed at build time".</w:t>
             </w:r>
           </w:p>
           <w:p>
@@ -1963,7 +2002,7 @@
                 <w:color w:val="111827"/>
                 <w:sz w:val="19"/>
               </w:rPr>
-              <w:t xml:space="preserve">   - Clean, professional finance styling. Label it "Meridian</w:t>
+              <w:t xml:space="preserve">   - Clean, professional finance styling, titled "Meridian Capital</w:t>
             </w:r>
           </w:p>
           <w:p>
@@ -1976,7 +2015,7 @@
                 <w:color w:val="111827"/>
                 <w:sz w:val="19"/>
               </w:rPr>
-              <w:t xml:space="preserve">     Capital Partners".</w:t>
+              <w:t xml:space="preserve">     Partners".</w:t>
             </w:r>
           </w:p>
           <w:p>
@@ -2001,7 +2040,7 @@
                 <w:color w:val="111827"/>
                 <w:sz w:val="19"/>
               </w:rPr>
-              <w:t>Make it interactive so I can change the amount and see the result</w:t>
+              <w:t>STEP 3 — Now a SEPARATE downloadable HTML file.</w:t>
             </w:r>
           </w:p>
           <w:p>
@@ -2014,7 +2053,7 @@
                 <w:color w:val="111827"/>
                 <w:sz w:val="19"/>
               </w:rPr>
-              <w:t>update.</w:t>
+              <w:t>Save a file called meridian-fx-live.html to my folder. Same design,</w:t>
             </w:r>
           </w:p>
           <w:p>
@@ -2027,6 +2066,7 @@
                 <w:color w:val="111827"/>
                 <w:sz w:val="19"/>
               </w:rPr>
+              <w:t>but this one DOES fetch rates from a free no-key API (such as</w:t>
             </w:r>
           </w:p>
           <w:p>
@@ -2039,7 +2079,7 @@
                 <w:color w:val="111827"/>
                 <w:sz w:val="19"/>
               </w:rPr>
-              <w:t>Then give me the same converter as a standalone HTML file I can</w:t>
+              <w:t>open.er-api.com or frankfurter.app) when it opens, with a Refresh</w:t>
             </w:r>
           </w:p>
           <w:p>
@@ -2052,7 +2092,7 @@
                 <w:color w:val="111827"/>
                 <w:sz w:val="19"/>
               </w:rPr>
-              <w:t>download, and in that version fetch the rates live from a free</w:t>
+              <w:t>button and the fetch time shown. Tell me where you saved it.</w:t>
             </w:r>
           </w:p>
           <w:p>
@@ -2065,7 +2105,20 @@
                 <w:color w:val="111827"/>
                 <w:sz w:val="19"/>
               </w:rPr>
-              <w:t>no-key API when the page opens, with a Refresh button.</w:t>
+              <w:t>Do not show this version as an artefact — it only works when I open</w:t>
+            </w:r>
+          </w:p>
+          <w:p>
+            <w:pPr>
+              <w:spacing w:after="0"/>
+            </w:pPr>
+            <w:r>
+              <w:rPr>
+                <w:rFonts w:ascii="Courier New" w:hAnsi="Courier New"/>
+                <w:color w:val="111827"/>
+                <w:sz w:val="19"/>
+              </w:rPr>
+              <w:t>the file in my own browser.</w:t>
             </w:r>
           </w:p>
         </w:tc>
@@ -2084,7 +2137,7 @@
         <w:rPr>
           <w:sz w:val="20"/>
         </w:rPr>
-        <w:t>An artefact cannot call an external API — that is a sandbox rule, not a bug. Claude looks the rates up for you and builds them in; the downloadable HTML runs in your browser, so it can fetch live.</w:t>
+        <w:t>The prompt tells Claude NOT to put a fetch in the artefact. If you leave that out, Claude writes one and the artefact shows "Live rate lookup failed" — the sandbox blocks it. Live data belongs in the downloadable HTML, which runs in your own browser.</w:t>
       </w:r>
     </w:p>
     <w:p>
@@ -2124,7 +2177,7 @@
         <w:t xml:space="preserve">2.  </w:t>
       </w:r>
       <w:r>
-        <w:t>Paste the lab prompt into the composer and send it.  —  Claude writes the code and renders the converter in the preview pane beside the chat.</w:t>
+        <w:t>Paste the lab prompt into the composer and send it.  —  It asks for three things in order: look up the rates, build the artefact, then save a separate live HTML file.</w:t>
       </w:r>
     </w:p>
     <w:p>
@@ -2139,7 +2192,7 @@
         <w:t xml:space="preserve">3.  </w:t>
       </w:r>
       <w:r>
-        <w:t>Try the converter: change the amount and switch the currencies.  —  This is what makes it an artefact rather than an answer — you can interact with it.</w:t>
+        <w:t>Read the three rates Claude reports back in the chat.  —  Claude can search the web; the artefact cannot. This is why the lookup happens here, in the conversation, and not inside the tool.</w:t>
       </w:r>
     </w:p>
     <w:p>
@@ -2154,7 +2207,7 @@
         <w:t xml:space="preserve">4.  </w:t>
       </w:r>
       <w:r>
-        <w:t>Check the rate Claude found against a search for "1 USD to SGD".  —  Claude looked this up while building, so it should match today. The artefact itself cannot call an API — the sandbox blocks outbound requests — so the rate is baked in at build time.</w:t>
+        <w:t>Try the artefact: change the amount and switch the currencies.  —  It works instantly because the rates are constants in the code — no network call to fail.</w:t>
       </w:r>
     </w:p>
     <w:p>
@@ -2169,7 +2222,7 @@
         <w:t xml:space="preserve">5.  </w:t>
       </w:r>
       <w:r>
-        <w:t>Open the downloaded HTML file in your browser and click Refresh.  —  Same converter, but running in your browser instead of the sandbox, so it CAN fetch live rates. This is the practical difference between an artefact and a file you own.</w:t>
+        <w:t>Check the artefact's rate against a search for "1 USD to SGD".  —  It should match today, because Claude looked it up minutes ago. The "fixed at build time" line is the honest caveat.</w:t>
       </w:r>
     </w:p>
     <w:p>
@@ -2184,7 +2237,7 @@
         <w:t xml:space="preserve">6.  </w:t>
       </w:r>
       <w:r>
-        <w:t>Ask for one refinement in plain English, for example: Add a thousands separator to the result.  —  Refining by conversation is the normal way to work — you never edit the code yourself.</w:t>
+        <w:t>Open the downloaded meridian-fx-live.html in your browser and click Refresh.  —  Same design, but running outside the sandbox, so THIS one really does fetch live rates. That contrast is the lesson.</w:t>
       </w:r>
     </w:p>
     <w:p>
@@ -2199,7 +2252,7 @@
         <w:t xml:space="preserve">7.  </w:t>
       </w:r>
       <w:r>
-        <w:t>Save the artefact so it appears in your sidebar.  —  A saved artefact persists as a reusable tool; an unsaved one scrolls away with the chat.</w:t>
+        <w:t>Ask for one refinement in plain English, for example: Add a thousands separator to the result.  —  Refining by conversation is the normal way to work — you never edit the code yourself.</w:t>
       </w:r>
     </w:p>
     <w:p>
@@ -2214,7 +2267,7 @@
         <w:t xml:space="preserve">8.  </w:t>
       </w:r>
       <w:r>
-        <w:t>Download a copy of the artefact to your lab folder.  —  Downloading gives you a file you can keep, attach or hand to someone without Claude.</w:t>
+        <w:t>Save the artefact so it appears in your sidebar.  —  A saved artefact persists as a reusable tool; an unsaved one scrolls away with the chat.</w:t>
       </w:r>
     </w:p>
     <w:p>
@@ -2229,7 +2282,7 @@
     </w:p>
     <w:p>
       <w:r>
-        <w:t>The artefact converts S$10,000 to USD using the rate Claude looked up, and shows a "Rates as at …" line with today's date. The downloaded HTML file opens in your browser, fetches rates itself and updates them when you click Refresh. The artefact appears in your sidebar after saving and still works when reopened.</w:t>
+        <w:t>The artefact converts S$10,000 to USD with no error, shows the rate used and a "Rates as at … — fixed at build time" line, and the rate matches a live search. Separately, meridian-fx-live.html opens in your browser, fetches its own rates and updates them when you click Refresh. The artefact is saved in your sidebar.</w:t>
       </w:r>
     </w:p>
     <w:p>

</xml_diff>

<commit_message>
v4.1 — Lab 4: recover from the Drive connector's "insufficient scope" error
Hit in a live run: the Google Drive connector reports "Connected" while its
OAuth grant lacks the drive.readonly scope, so every file request fails with
"insufficient scope" and the lab dead-ends. Nothing in the lab told the
learner what to do.

Lab 4 now says to grant FULL READ access when Google prompts, and adds a
recovery step — Settings → Connectors → Google Drive → Reconnect, then ask
Claude to try again, no need to restart the lab. TOOLS.md carries the same
fix as a troubleshooting section, which is where someone stuck actually looks.

v4.0 was already published, so this ships as v4.1 rather than rewriting a
released version; v4.0 and a stale v3.2 are archived on Drive, and the
storefront's two deck links are repointed at the new file ids.

Co-Authored-By: Claude Opus 5 <noreply@anthropic.com>
</commit_message>
<xml_diff>
--- a/courseware/LG-Claude Cowork Masterclass.docx
+++ b/courseware/LG-Claude Cowork Masterclass.docx
@@ -179,7 +179,7 @@
           <w:color w:val="1F6FEB"/>
           <w:sz w:val="24"/>
         </w:rPr>
-        <w:t>Version 3.2</w:t>
+        <w:t>Version 4.1</w:t>
       </w:r>
     </w:p>
     <w:p>
@@ -631,6 +631,122 @@
           </w:p>
         </w:tc>
       </w:tr>
+      <w:tr>
+        <w:tc>
+          <w:tcPr>
+            <w:tcW w:type="dxa" w:w="2160"/>
+          </w:tcPr>
+          <w:p>
+            <w:r/>
+            <w:r>
+              <w:rPr>
+                <w:sz w:val="19"/>
+              </w:rPr>
+              <w:t>4.0</w:t>
+            </w:r>
+          </w:p>
+        </w:tc>
+        <w:tc>
+          <w:tcPr>
+            <w:tcW w:type="dxa" w:w="2160"/>
+          </w:tcPr>
+          <w:p>
+            <w:r/>
+            <w:r>
+              <w:rPr>
+                <w:sz w:val="19"/>
+              </w:rPr>
+              <w:t>18 September 2026</w:t>
+            </w:r>
+          </w:p>
+        </w:tc>
+        <w:tc>
+          <w:tcPr>
+            <w:tcW w:type="dxa" w:w="2160"/>
+          </w:tcPr>
+          <w:p>
+            <w:r/>
+            <w:r>
+              <w:rPr>
+                <w:sz w:val="19"/>
+              </w:rPr>
+              <w:t>First stable release of the ten-lab course. Content is unchanged from 3.2; the major version marks the restructured syllabus as settled and gives the published deck a clean release number for the Drive folder and the course page.</w:t>
+            </w:r>
+          </w:p>
+        </w:tc>
+        <w:tc>
+          <w:tcPr>
+            <w:tcW w:type="dxa" w:w="2160"/>
+          </w:tcPr>
+          <w:p>
+            <w:r/>
+            <w:r>
+              <w:rPr>
+                <w:sz w:val="19"/>
+              </w:rPr>
+              <w:t>Dr. Alfred Ang</w:t>
+            </w:r>
+          </w:p>
+        </w:tc>
+      </w:tr>
+      <w:tr>
+        <w:tc>
+          <w:tcPr>
+            <w:tcW w:type="dxa" w:w="2160"/>
+          </w:tcPr>
+          <w:p>
+            <w:r/>
+            <w:r>
+              <w:rPr>
+                <w:sz w:val="19"/>
+              </w:rPr>
+              <w:t>4.1</w:t>
+            </w:r>
+          </w:p>
+        </w:tc>
+        <w:tc>
+          <w:tcPr>
+            <w:tcW w:type="dxa" w:w="2160"/>
+          </w:tcPr>
+          <w:p>
+            <w:r/>
+            <w:r>
+              <w:rPr>
+                <w:sz w:val="19"/>
+              </w:rPr>
+              <w:t>18 September 2026</w:t>
+            </w:r>
+          </w:p>
+        </w:tc>
+        <w:tc>
+          <w:tcPr>
+            <w:tcW w:type="dxa" w:w="2160"/>
+          </w:tcPr>
+          <w:p>
+            <w:r/>
+            <w:r>
+              <w:rPr>
+                <w:sz w:val="19"/>
+              </w:rPr>
+              <w:t>Lab 4: added the recovery step for the Google Drive connector's "insufficient scope" error. The connector can report Connected while its OAuth grant lacks drive.readonly, so every file request fails; the lab now tells learners to grant full read access, and TOOLS.md carries a Settings → Connectors → Reconnect recovery note. Hit in a live run.</w:t>
+            </w:r>
+          </w:p>
+        </w:tc>
+        <w:tc>
+          <w:tcPr>
+            <w:tcW w:type="dxa" w:w="2160"/>
+          </w:tcPr>
+          <w:p>
+            <w:r/>
+            <w:r>
+              <w:rPr>
+                <w:sz w:val="19"/>
+              </w:rPr>
+              <w:t>Dr. Alfred Ang</w:t>
+            </w:r>
+          </w:p>
+        </w:tc>
+      </w:tr>
     </w:tbl>
     <w:p>
       <w:r>
@@ -842,7 +958,7 @@
         </w:rPr>
         <w:t>Lab 5 — Refresh the Dashboard and Send the Summary</w:t>
         <w:tab/>
-        <w:t>14</w:t>
+        <w:t>15</w:t>
       </w:r>
     </w:p>
     <w:p>
@@ -921,7 +1037,7 @@
         </w:rPr>
         <w:t>Topic 03 — Claude Projects and Plugins</w:t>
         <w:tab/>
-        <w:t>23</w:t>
+        <w:t>24</w:t>
       </w:r>
     </w:p>
     <w:p>
@@ -3248,7 +3364,7 @@
         <w:t xml:space="preserve">4.  </w:t>
       </w:r>
       <w:r>
-        <w:t>Approve the permissions Google asks for.  —  Approve only what you are willing to let Claude reach — you can revoke access later.</w:t>
+        <w:t>Approve the permissions Google asks for — grant FULL READ access.  —  Approve only what you are willing to let Claude reach. But if you decline the read scopes here, Claude connects yet cannot open anything.</w:t>
       </w:r>
     </w:p>
     <w:p>
@@ -3263,7 +3379,7 @@
         <w:t xml:space="preserve">5.  </w:t>
       </w:r>
       <w:r>
-        <w:t>Paste the lab prompt so Claude reads the Meridian Finance folder.  —  Naming the folder scopes the task; Claude does not need access to your whole Drive.</w:t>
+        <w:t>If Claude reports an "insufficient scope" error, reconnect the connector.  —  Settings → Connectors → Google Drive → Reconnect, and accept the read permissions. A connector can show "Connected" while still missing the drive.readonly scope it needs to search and read files.</w:t>
       </w:r>
     </w:p>
     <w:p>
@@ -3278,7 +3394,7 @@
         <w:t xml:space="preserve">6.  </w:t>
       </w:r>
       <w:r>
-        <w:t>Compare Claude's file summary against what you actually uploaded.  —  Confirm it found every file and read the right periods before you rely on it.</w:t>
+        <w:t>Paste the lab prompt so Claude reads the Meridian Finance folder.  —  Naming the folder scopes the task; Claude does not need access to your whole Drive.</w:t>
       </w:r>
     </w:p>
     <w:p>
@@ -3291,6 +3407,21 @@
           <w:b/>
         </w:rPr>
         <w:t xml:space="preserve">7.  </w:t>
+      </w:r>
+      <w:r>
+        <w:t>Compare Claude's file summary against what you actually uploaded.  —  Confirm it found every file and read the right periods before you rely on it.</w:t>
+      </w:r>
+    </w:p>
+    <w:p>
+      <w:pPr>
+        <w:spacing w:after="80"/>
+        <w:ind w:left="360"/>
+      </w:pPr>
+      <w:r>
+        <w:rPr>
+          <w:b/>
+        </w:rPr>
+        <w:t xml:space="preserve">8.  </w:t>
       </w:r>
       <w:r>
         <w:t>Note any inconsistency Claude reports between the files.  —  The Q4 Advisory target deliberately disagrees between two files — a real check.</w:t>

</xml_diff>

<commit_message>
v4.2 — move Skills vs. Plugins to sit before the plugin lab
The containment diagram was taught in Topic 2, some forty slides ahead of
Lab 10, the lab that installs a plugin. It now sits immediately before that
lab via the builder's BEFORE_LAB mechanism, which exists so a concept is
never taught pages away from the exercise using it. The learner has by then
written two skills of their own, which is what makes "a plugin is a bundle
of skills, tools, agents and hooks" land.

Also ships lab-03b-claim-form-artefact (authored in a parallel session): an
artefact that collects claim-form answers, with Claude writing them into the
PDF — the sandbox split from Lab 2, applied to data entry. It is not yet
wired into the deck, README or schedule, so it ships as an extra folder
pending a decision on where it belongs.

Co-Authored-By: Claude Opus 5 <noreply@anthropic.com>
</commit_message>
<xml_diff>
--- a/courseware/LG-Claude Cowork Masterclass.docx
+++ b/courseware/LG-Claude Cowork Masterclass.docx
@@ -179,7 +179,7 @@
           <w:color w:val="1F6FEB"/>
           <w:sz w:val="24"/>
         </w:rPr>
-        <w:t>Version 4.1</w:t>
+        <w:t>Version 4.2</w:t>
       </w:r>
     </w:p>
     <w:p>
@@ -747,6 +747,64 @@
           </w:p>
         </w:tc>
       </w:tr>
+      <w:tr>
+        <w:tc>
+          <w:tcPr>
+            <w:tcW w:type="dxa" w:w="2160"/>
+          </w:tcPr>
+          <w:p>
+            <w:r/>
+            <w:r>
+              <w:rPr>
+                <w:sz w:val="19"/>
+              </w:rPr>
+              <w:t>4.2</w:t>
+            </w:r>
+          </w:p>
+        </w:tc>
+        <w:tc>
+          <w:tcPr>
+            <w:tcW w:type="dxa" w:w="2160"/>
+          </w:tcPr>
+          <w:p>
+            <w:r/>
+            <w:r>
+              <w:rPr>
+                <w:sz w:val="19"/>
+              </w:rPr>
+              <w:t>18 September 2026</w:t>
+            </w:r>
+          </w:p>
+        </w:tc>
+        <w:tc>
+          <w:tcPr>
+            <w:tcW w:type="dxa" w:w="2160"/>
+          </w:tcPr>
+          <w:p>
+            <w:r/>
+            <w:r>
+              <w:rPr>
+                <w:sz w:val="19"/>
+              </w:rPr>
+              <w:t>Moved the Skills vs. Plugins diagram out of Topic 2 and placed it immediately before Lab 10, the lab that installs one. It previously sat some forty slides ahead of the exercise it explains; it now lands after the learner has written two skills of their own, which is what makes the containment diagram — a plugin as a bundle of skills, tools, agents and hooks — actually land.</w:t>
+            </w:r>
+          </w:p>
+        </w:tc>
+        <w:tc>
+          <w:tcPr>
+            <w:tcW w:type="dxa" w:w="2160"/>
+          </w:tcPr>
+          <w:p>
+            <w:r/>
+            <w:r>
+              <w:rPr>
+                <w:sz w:val="19"/>
+              </w:rPr>
+              <w:t>Dr. Alfred Ang</w:t>
+            </w:r>
+          </w:p>
+        </w:tc>
+      </w:tr>
     </w:tbl>
     <w:p>
       <w:r>
@@ -801,7 +859,7 @@
         </w:rPr>
         <w:t>Course Learning Outcomes</w:t>
         <w:tab/>
-        <w:t>6</w:t>
+        <w:t>7</w:t>
       </w:r>
     </w:p>
     <w:p>
@@ -820,7 +878,7 @@
         </w:rPr>
         <w:t>Before You Start — Preparation</w:t>
         <w:tab/>
-        <w:t>6</w:t>
+        <w:t>7</w:t>
       </w:r>
     </w:p>
     <w:p>
@@ -839,7 +897,7 @@
         </w:rPr>
         <w:t>Topic 01 — Claude Cowork Fundamentals</w:t>
         <w:tab/>
-        <w:t>7</w:t>
+        <w:t>8</w:t>
       </w:r>
     </w:p>
     <w:p>
@@ -859,7 +917,7 @@
         </w:rPr>
         <w:t>Lab 1 — Process a Folder of Invoices</w:t>
         <w:tab/>
-        <w:t>7</w:t>
+        <w:t>8</w:t>
       </w:r>
     </w:p>
     <w:p>
@@ -879,7 +937,7 @@
         </w:rPr>
         <w:t>Lab 2 — Your First Live Artefact</w:t>
         <w:tab/>
-        <w:t>9</w:t>
+        <w:t>10</w:t>
       </w:r>
     </w:p>
     <w:p>
@@ -899,7 +957,7 @@
         </w:rPr>
         <w:t>Lab 3 — The Meridian Sales Dashboard</w:t>
         <w:tab/>
-        <w:t>11</w:t>
+        <w:t>12</w:t>
       </w:r>
     </w:p>
     <w:p>
@@ -918,7 +976,7 @@
         </w:rPr>
         <w:t>Topic 02 — Tools and Skills</w:t>
         <w:tab/>
-        <w:t>13</w:t>
+        <w:t>14</w:t>
       </w:r>
     </w:p>
     <w:p>
@@ -938,7 +996,7 @@
         </w:rPr>
         <w:t>Lab 4 — Connect Google Drive</w:t>
         <w:tab/>
-        <w:t>13</w:t>
+        <w:t>14</w:t>
       </w:r>
     </w:p>
     <w:p>
@@ -958,7 +1016,7 @@
         </w:rPr>
         <w:t>Lab 5 — Refresh the Dashboard and Send the Summary</w:t>
         <w:tab/>
-        <w:t>15</w:t>
+        <w:t>16</w:t>
       </w:r>
     </w:p>
     <w:p>
@@ -978,7 +1036,7 @@
         </w:rPr>
         <w:t>Lab 6 — Generate the Meridian Board Deck</w:t>
         <w:tab/>
-        <w:t>16</w:t>
+        <w:t>17</w:t>
       </w:r>
     </w:p>
     <w:p>
@@ -998,7 +1056,7 @@
         </w:rPr>
         <w:t>Lab 7 — Build a /daily-brief Skill</w:t>
         <w:tab/>
-        <w:t>18</w:t>
+        <w:t>19</w:t>
       </w:r>
     </w:p>
     <w:p>
@@ -1018,7 +1076,7 @@
         </w:rPr>
         <w:t>Lab 8 — Brand the Board Deck</w:t>
         <w:tab/>
-        <w:t>21</w:t>
+        <w:t>22</w:t>
       </w:r>
     </w:p>
     <w:p>
@@ -1037,7 +1095,7 @@
         </w:rPr>
         <w:t>Topic 03 — Claude Projects and Plugins</w:t>
         <w:tab/>
-        <w:t>24</w:t>
+        <w:t>25</w:t>
       </w:r>
     </w:p>
     <w:p>
@@ -1057,7 +1115,7 @@
         </w:rPr>
         <w:t>Lab 9 — Build the Meridian Claude Project</w:t>
         <w:tab/>
-        <w:t>24</w:t>
+        <w:t>25</w:t>
       </w:r>
     </w:p>
     <w:p>
@@ -1077,7 +1135,7 @@
         </w:rPr>
         <w:t>Lab 10 — Add the Productivity Plugin</w:t>
         <w:tab/>
-        <w:t>27</w:t>
+        <w:t>28</w:t>
       </w:r>
     </w:p>
     <w:p>
@@ -1096,7 +1154,7 @@
         </w:rPr>
         <w:t>Wrap-Up</w:t>
         <w:tab/>
-        <w:t>28</w:t>
+        <w:t>29</w:t>
       </w:r>
     </w:p>
     <w:p>
@@ -1115,7 +1173,7 @@
         </w:rPr>
         <w:t>Next Steps</w:t>
         <w:tab/>
-        <w:t>29</w:t>
+        <w:t>30</w:t>
       </w:r>
     </w:p>
     <w:p>
@@ -1134,7 +1192,7 @@
         </w:rPr>
         <w:t>Glossary</w:t>
         <w:tab/>
-        <w:t>29</w:t>
+        <w:t>30</w:t>
       </w:r>
     </w:p>
     <w:p>

</xml_diff>